<commit_message>
Apply proofreading corrections, update citations to Hebrew/Vancouver, regenerate shortened version, compile PDF, and add download button to website
</commit_message>
<xml_diff>
--- a/ספר_קורס_FIGG.docx
+++ b/ספר_קורס_FIGG.docx
@@ -1251,7 +1251,7 @@
           <w:rFonts w:ascii="Arial" w:hAnsi="Arial" w:cs="Arial"/>
           <w:rtl/>
         </w:rPr>
-        <w:t>פרק 1 מבוא לגנאלוגיה גנטית ו־FIGG</w:t>
+        <w:t>פרק 1: מבוא לגנאלוגיה גנטית ו־FIGG</w:t>
       </w:r>
       <w:bookmarkEnd w:id="chapter_1"/>
     </w:p>
@@ -5856,7 +5856,7 @@
           <w:rFonts w:ascii="Arial" w:hAnsi="Arial" w:cs="Arial"/>
           <w:rtl/>
         </w:rPr>
-        <w:t>בכל דור, רקומבינציה שוברת את הכרומוזומים המורשים למקטעים קצרים יותר. לכן, ככל שהקרבה רחוקה יותר, מקטעי ה־IBD שנשמרים צפויים להיות קצרים יותר ומפוזרים יותר [1], [3]. קרובי משפחה קרובים נוטים לחלוק פחות מקטעים אך ארוכים יותר, ואילו קרובים רחוקים יותר עשויים לחלוק מקטעים קצרים יותר ולעיתים כלל לא לחלוק מקטע detectable.</w:t>
+        <w:t>בכל דור, רקומבינציה שוברת את הכרומוזומים המורשים למקטעים קצרים יותר. לכן, ככל שהקרבה רחוקה יותר, מקטעי ה־IBD שנשמרים צפויים להיות קצרים יותר ומפוזרים יותר [1], [3]. קרובי משפחה קרובים נוטים לחלוק פחות מקטעים אך ארוכים יותר, ואילו קרובים רחוקים יותר עשויים לחלוק מקטעים קצרים יותר ולעיתים כלל לא לחלוק מקטע מזוהה.</w:t>
       </w:r>
     </w:p>
     <w:p>
@@ -6007,7 +6007,7 @@
           <w:rFonts w:ascii="Arial" w:hAnsi="Arial" w:cs="Arial"/>
           <w:rtl/>
         </w:rPr>
-        <w:t>מן הדרגה השלישית ואילך, ההבחנה נעשית קשה בהרבה. ככל שמספר המיוזות גדל, ההסתברות ששני קרובים גנאלוגיים אכן יחלקו DNA detectable יורדת, ואפילו כאשר הם חולקים, הפיזור באורך ובמספר המקטעים גדל [3], [6].</w:t>
+        <w:t>מן הדרגה השלישית ואילך, ההבחנה נעשית קשה בהרבה. ככל שמספר המיוזות גדל, ההסתברות ששני קרובים גנאלוגיים אכן יחלקו DNA מזוהה יורדת, ואפילו כאשר הם חולקים, הפיזור באורך ובמספר המקטעים גדל [3], [6].</w:t>
       </w:r>
     </w:p>
     <w:p>
@@ -7142,7 +7142,7 @@
           <w:rFonts w:ascii="Arial" w:hAnsi="Arial" w:cs="Arial"/>
           <w:rtl/>
         </w:rPr>
-        <w:t>להבין מדוע הסקת קרבה אינה תלויה רק באלגוריתם, אלא גם בהיסטוריה הדמוגרפית של האוכלוסייה הנבדקת [Hen12, Tho12, Con16].</w:t>
+        <w:t>להבין מדוע הסקת קרבה אינה תלויה רק באלגוריתם, אלא גם בהיסטוריה הדמוגרפית של האוכלוסייה הנבדקת [1, 2, 3].</w:t>
       </w:r>
     </w:p>
     <w:p>
@@ -7156,7 +7156,7 @@
           <w:rFonts w:ascii="Arial" w:hAnsi="Arial" w:cs="Arial"/>
           <w:rtl/>
         </w:rPr>
-        <w:t>להכיר מושגים מרכזיים כמו cryptic relatedness, endogamy, admixture, inbreeding ו־background sharing [Hen12, Bro12].</w:t>
+        <w:t>להכיר מושגים מרכזיים כמו cryptic relatedness, endogamy, admixture, inbreeding ו־background sharing [1, 4].</w:t>
       </w:r>
     </w:p>
     <w:p>
@@ -7170,7 +7170,7 @@
           <w:rFonts w:ascii="Arial" w:hAnsi="Arial" w:cs="Arial"/>
           <w:rtl/>
         </w:rPr>
-        <w:t>להבין כיצד מבנה אוכלוסייה עלול להטות אומדני קרבה כלפי מעלה או כלפי מטה [Tho12, Con16].</w:t>
+        <w:t>להבין כיצד מבנה אוכלוסייה עלול להטות אומדני קרבה כלפי מעלה או כלפי מטה [2, 3].</w:t>
       </w:r>
     </w:p>
     <w:p>
@@ -7184,7 +7184,7 @@
           <w:rFonts w:ascii="Arial" w:hAnsi="Arial" w:cs="Arial"/>
           <w:rtl/>
         </w:rPr>
-        <w:t>להבחין בין קרבה משפחתית עדכנית לבין דמיון גנטי הנובע ממוצא משותף רחב יותר [Bro12, Con16].</w:t>
+        <w:t>להבחין בין קרבה משפחתית עדכנית לבין דמיון גנטי הנובע ממוצא משותף רחב יותר [4, 3].</w:t>
       </w:r>
     </w:p>
     <w:p>
@@ -7198,7 +7198,7 @@
           <w:rFonts w:ascii="Arial" w:hAnsi="Arial" w:cs="Arial"/>
           <w:rtl/>
         </w:rPr>
-        <w:t>להבין מדוע שיטות robust למבנה אוכלוסייה חשובות במיוחד בגנאלוגיה גנטית וב־FIGG [Tho12, Con16].</w:t>
+        <w:t>להבין מדוע שיטות robust למבנה אוכלוסייה חשובות במיוחד בגנאלוגיה גנטית וב־FIGG [2, 3].</w:t>
       </w:r>
     </w:p>
     <w:p>
@@ -7226,20 +7226,20 @@
           <w:rFonts w:ascii="Arial" w:hAnsi="Arial" w:cs="Arial"/>
           <w:rtl/>
         </w:rPr>
-        <w:t>בפרק הקודם הוצגו העקרונות הבסיסיים של IBD והסקת קרבה. אולם בפועל, שני אנשים אינם נמדדים בריק. כל זוג פרטים יושב בתוך היסטוריה אוכלוסייתית מסוימת, ולפעמים ההיסטוריה הזאת משנה את משמעותו של השיתוף הגנטי לא פחות מן הקשר המשפחתי עצמו [Hen12, Con16].</w:t>
-      </w:r>
-    </w:p>
-    <w:p>
-      <w:pPr>
-        <w:bidi/>
-        <w:jc w:val="right"/>
-      </w:pPr>
-      <w:r>
-        <w:rPr>
-          <w:rFonts w:ascii="Arial" w:hAnsi="Arial" w:cs="Arial"/>
-          <w:rtl/>
-        </w:rPr>
-        <w:t>במילים אחרות, אותה כמות של DNA משותף אינה נושאת תמיד אותה משמעות. באוכלוסייה אחת היא עשויה להתאים לקרבה משפחתית ברורה, ובאחרת היא עשויה להיות חלק מרקע שיתופי רחב שנובע מאנדוגמיה, admixture, צווארי בקבוק, מייסדים משותפים או בידוד אוכלוסייתי [Hen12, Tho12].</w:t>
+        <w:t>בפרק הקודם הוצגו העקרונות הבסיסיים של IBD והסקת קרבה. אולם בפועל, שני אנשים אינם נמדדים בריק. כל זוג פרטים יושב בתוך היסטוריה אוכלוסייתית מסוימת, ולפעמים ההיסטוריה הזאת משנה את משמעותו של השיתוף הגנטי לא פחות מן הקשר המשפחתי עצמו [1, 3].</w:t>
+      </w:r>
+    </w:p>
+    <w:p>
+      <w:pPr>
+        <w:bidi/>
+        <w:jc w:val="right"/>
+      </w:pPr>
+      <w:r>
+        <w:rPr>
+          <w:rFonts w:ascii="Arial" w:hAnsi="Arial" w:cs="Arial"/>
+          <w:rtl/>
+        </w:rPr>
+        <w:t>במילים אחרות, אותה כמות של DNA משותף אינה נושאת תמיד אותה משמעות. באוכלוסייה אחת היא עשויה להתאים לקרבה משפחתית ברורה, ובאחרת היא עשויה להיות חלק מרקע שיתופי רחב שנובע מאנדוגמיה, admixture, צווארי בקבוק, מייסדים משותפים או בידוד אוכלוסייתי [1, 2].</w:t>
       </w:r>
     </w:p>
     <w:p>
@@ -7267,20 +7267,20 @@
           <w:rFonts w:ascii="Arial" w:hAnsi="Arial" w:cs="Arial"/>
           <w:rtl/>
         </w:rPr>
-        <w:t>רוב אומדני הקרבה הפשוטים מניחים, במפורש או במשתמע, שהמדגם נובע מאוכלוסייה הומוגנית למדי, שבה אללים נדגמים מתוך מאגר תדירויות משותף אחד [Tho12, Con16]. כאשר הנחה זו אינה נכונה, חלק מן הדמיון הגנטי בין שני פרטים אינו משקף קרבה משפחתית עדכנית אלא שייכות לאותו רקע אוכלוסייתי.</w:t>
-      </w:r>
-    </w:p>
-    <w:p>
-      <w:pPr>
-        <w:bidi/>
-        <w:jc w:val="right"/>
-      </w:pPr>
-      <w:r>
-        <w:rPr>
-          <w:rFonts w:ascii="Arial" w:hAnsi="Arial" w:cs="Arial"/>
-          <w:rtl/>
-        </w:rPr>
-        <w:t>לכן, אם משווים שני פרטים מאותה תת־אוכלוסייה, אפשר להפריז בקרבתם. אם משווים שני פרטים מרקעים שונים מאוד, אפשר דווקא להמעיט באומדן הקרבה שלהם או אפילו לקבל ערכים שליליים באומדנים מסוימים [Tho12, Con16].</w:t>
+        <w:t>רוב אומדני הקרבה הפשוטים מניחים, במפורש או במשתמע, שהמדגם נובע מאוכלוסייה הומוגנית למדי, שבה אללים נדגמים מתוך מאגר תדירויות משותף אחד [2, 3]. כאשר הנחה זו אינה נכונה, חלק מן הדמיון הגנטי בין שני פרטים אינו משקף קרבה משפחתית עדכנית אלא שייכות לאותו רקע אוכלוסייתי.</w:t>
+      </w:r>
+    </w:p>
+    <w:p>
+      <w:pPr>
+        <w:bidi/>
+        <w:jc w:val="right"/>
+      </w:pPr>
+      <w:r>
+        <w:rPr>
+          <w:rFonts w:ascii="Arial" w:hAnsi="Arial" w:cs="Arial"/>
+          <w:rtl/>
+        </w:rPr>
+        <w:t>לכן, אם משווים שני פרטים מאותה תת־אוכלוסייה, אפשר להפריז בקרבתם. אם משווים שני פרטים מרקעים שונים מאוד, אפשר דווקא להמעיט באומדן הקרבה שלהם או אפילו לקבל ערכים שליליים באומדנים מסוימים [2, 3].</w:t>
       </w:r>
     </w:p>
     <w:p>
@@ -7308,33 +7308,33 @@
           <w:rFonts w:ascii="Arial" w:hAnsi="Arial" w:cs="Arial"/>
           <w:rtl/>
         </w:rPr>
-        <w:t>cryptic relatedness מתאר מצב שבו שני פרטים חולקים אבות קדמונים בטווח גנאלוגי לא מאוד רחוק, אך אינם מודעים לכך, ולעיתים גם המחקר או המאגר אינם יודעים על כך [Hen12]. בגנאלוגיה גנטית זו אינה חריגה אלא תופעה שכיחה למדי.</w:t>
-      </w:r>
-    </w:p>
-    <w:p>
-      <w:pPr>
-        <w:bidi/>
-        <w:jc w:val="right"/>
-      </w:pPr>
-      <w:r>
-        <w:rPr>
-          <w:rFonts w:ascii="Arial" w:hAnsi="Arial" w:cs="Arial"/>
-          <w:rtl/>
-        </w:rPr>
-        <w:t>העבודה של Henn ועמיתיו הראתה שקרובים רחוקים נסתרים נפוצים הן באוכלוסיות קוסמופוליטיות והן באוכלוסיות מבודדות יותר, אם כי בהיקפים שונים מאוד [Hen12]. במדגמים גדולים, כמעט לכל פרט עשוי להימצא לפחות קרוב רחוק אחד בתוך המאגר, ולעיתים יותר מכך.</w:t>
-      </w:r>
-    </w:p>
-    <w:p>
-      <w:pPr>
-        <w:bidi/>
-        <w:jc w:val="right"/>
-      </w:pPr>
-      <w:r>
-        <w:rPr>
-          <w:rFonts w:ascii="Arial" w:hAnsi="Arial" w:cs="Arial"/>
-          <w:rtl/>
-        </w:rPr>
-        <w:t>המשמעות המתודולוגית היא שמאגר גנטי גדול אינו רק אוסף של יחידים. הוא רשת צפופה של קשרים חלקיים, ולעיתים נסתרים, בין אנשים. זו אחת הסיבות לכך שחיפוש גנאלוגי נעשה יעיל כל כך, אבל גם אחת הסיבות לכך שסיווג מדויק של דרגת קרבה נעשה קשה יותר ויותר בטווחים רחוקים [Hen12].</w:t>
+        <w:t>cryptic relatedness מתאר מצב שבו שני פרטים חולקים אבות קדמונים בטווח גנאלוגי לא מאוד רחוק, אך אינם מודעים לכך, ולעיתים גם המחקר או המאגר אינם יודעים על כך [1]. בגנאלוגיה גנטית זו אינה חריגה אלא תופעה שכיחה למדי.</w:t>
+      </w:r>
+    </w:p>
+    <w:p>
+      <w:pPr>
+        <w:bidi/>
+        <w:jc w:val="right"/>
+      </w:pPr>
+      <w:r>
+        <w:rPr>
+          <w:rFonts w:ascii="Arial" w:hAnsi="Arial" w:cs="Arial"/>
+          <w:rtl/>
+        </w:rPr>
+        <w:t>העבודה של Henn ועמיתיו הראתה שקרובים רחוקים נסתרים נפוצים הן באוכלוסיות קוסמופוליטיות והן באוכלוסיות מבודדות יותר, אם כי בהיקפים שונים מאוד [1]. במדגמים גדולים, כמעט לכל פרט עשוי להימצא לפחות קרוב רחוק אחד בתוך המאגר, ולעיתים יותר מכך.</w:t>
+      </w:r>
+    </w:p>
+    <w:p>
+      <w:pPr>
+        <w:bidi/>
+        <w:jc w:val="right"/>
+      </w:pPr>
+      <w:r>
+        <w:rPr>
+          <w:rFonts w:ascii="Arial" w:hAnsi="Arial" w:cs="Arial"/>
+          <w:rtl/>
+        </w:rPr>
+        <w:t>המשמעות המתודולוגית היא שמאגר גנטי גדול אינו רק אוסף של יחידים. הוא רשת צפופה של קשרים חלקיים, ולעיתים נסתרים, בין אנשים. זו אחת הסיבות לכך שחיפוש גנאלוגי נעשה יעיל כל כך, אבל גם אחת הסיבות לכך שסיווג מדויק של דרגת קרבה נעשה קשה יותר ויותר בטווחים רחוקים [1].</w:t>
       </w:r>
     </w:p>
     <w:p>
@@ -7362,33 +7362,33 @@
           <w:rFonts w:ascii="Arial" w:hAnsi="Arial" w:cs="Arial"/>
           <w:rtl/>
         </w:rPr>
-        <w:t>endogamy היא נטייה של אנשים להינשא ולהוליד ילדים בתוך קבוצה חברתית, דתית, גאוגרפית או תרבותית מצומצמת יחסית לאורך דורות רבים. במצב כזה, זוג פרטים עשוי לחלוק יותר מאב קדמון אחד, ולעיתים קווי שארות מרובים מצטברים זה על גבי זה [Hen12].</w:t>
-      </w:r>
-    </w:p>
-    <w:p>
-      <w:pPr>
-        <w:bidi/>
-        <w:jc w:val="right"/>
-      </w:pPr>
-      <w:r>
-        <w:rPr>
-          <w:rFonts w:ascii="Arial" w:hAnsi="Arial" w:cs="Arial"/>
-          <w:rtl/>
-        </w:rPr>
-        <w:t>מבחינה גנטית, התוצאה היא עלייה בשיתוף הרקעי של מקטעים, כך שגם פרטים שאינם קרובים במובן משפחתי קרוב עשויים לחלוק הרבה יותר DNA מן המצופה באוכלוסייה פנמיקטית. Henn ועמיתיו הראו שבאוכלוסיות מבודדות או אנדוגמיות רמות השיתוף הממוצעות יכולות להיות גבוהות בסדרי גודל לעומת אוכלוסיות קוסמופוליטיות [Hen12].</w:t>
-      </w:r>
-    </w:p>
-    <w:p>
-      <w:pPr>
-        <w:bidi/>
-        <w:jc w:val="right"/>
-      </w:pPr>
-      <w:r>
-        <w:rPr>
-          <w:rFonts w:ascii="Arial" w:hAnsi="Arial" w:cs="Arial"/>
-          <w:rtl/>
-        </w:rPr>
-        <w:t>דוגמה הוראתית טובה היא אוכלוסיות מייסדים כגון אשכנזים. באוכלוסיות כאלה ניתן למצוא שיעורים גבוהים בהרבה של שיתוף מקטעים ארוכים יחסית גם בין זוגות שאינם מזוהים כקרובים קרובים. לכן, באוכלוסיות אנדוגמיות, IBD לבדו אינו מספיק לעיתים כדי להבחין היטב בין קרובים מדרגות רחוקות שונות [Hen12].</w:t>
+        <w:t>endogamy היא נטייה של אנשים להינשא ולהוליד ילדים בתוך קבוצה חברתית, דתית, גאוגרפית או תרבותית מצומצמת יחסית לאורך דורות רבים. במצב כזה, זוג פרטים עשוי לחלוק יותר מאב קדמון אחד, ולעיתים קווי שארות מרובים מצטברים זה על גבי זה [1].</w:t>
+      </w:r>
+    </w:p>
+    <w:p>
+      <w:pPr>
+        <w:bidi/>
+        <w:jc w:val="right"/>
+      </w:pPr>
+      <w:r>
+        <w:rPr>
+          <w:rFonts w:ascii="Arial" w:hAnsi="Arial" w:cs="Arial"/>
+          <w:rtl/>
+        </w:rPr>
+        <w:t>מבחינה גנטית, התוצאה היא עלייה בשיתוף הרקעי של מקטעים, כך שגם פרטים שאינם קרובים במובן משפחתי קרוב עשויים לחלוק הרבה יותר DNA מן המצופה באוכלוסייה פנמיקטית. Henn ועמיתיו הראו שבאוכלוסיות מבודדות או אנדוגמיות רמות השיתוף הממוצעות יכולות להיות גבוהות בסדרי גודל לעומת אוכלוסיות קוסמופוליטיות [1].</w:t>
+      </w:r>
+    </w:p>
+    <w:p>
+      <w:pPr>
+        <w:bidi/>
+        <w:jc w:val="right"/>
+      </w:pPr>
+      <w:r>
+        <w:rPr>
+          <w:rFonts w:ascii="Arial" w:hAnsi="Arial" w:cs="Arial"/>
+          <w:rtl/>
+        </w:rPr>
+        <w:t>דוגמה הוראתית טובה היא אוכלוסיות מייסדים כגון אשכנזים. באוכלוסיות כאלה ניתן למצוא שיעורים גבוהים בהרבה של שיתוף מקטעים ארוכים יחסית גם בין זוגות שאינם מזוהים כקרובים קרובים. לכן, באוכלוסיות אנדוגמיות, IBD לבדו אינו מספיק לעיתים כדי להבחין היטב בין קרובים מדרגות רחוקות שונות [1].</w:t>
       </w:r>
     </w:p>
     <w:p>
@@ -7416,20 +7416,20 @@
           <w:rFonts w:ascii="Arial" w:hAnsi="Arial" w:cs="Arial"/>
           <w:rtl/>
         </w:rPr>
-        <w:t>background sharing הוא שיתוף גנטי שאינו נובע מקרבה משפחתית עדכנית אחת, אלא מהיסטוריה עמוקה יותר של האוכלוסייה [Bro12, Huf11]. בפועל, זהו אחד הקשיים המרכזיים בגנאלוגיה גנטית: לא כל מקטע משותף הוא עדות לקרבה גנאלוגית שימושית.</w:t>
-      </w:r>
-    </w:p>
-    <w:p>
-      <w:pPr>
-        <w:bidi/>
-        <w:jc w:val="right"/>
-      </w:pPr>
-      <w:r>
-        <w:rPr>
-          <w:rFonts w:ascii="Arial" w:hAnsi="Arial" w:cs="Arial"/>
-          <w:rtl/>
-        </w:rPr>
-        <w:t>בפרט, באוכלוסיות עם bottlenecks, founder effects או endogamy, קיים מעין “רצפת רקע” של שיתוף, כך שגם קרובים רחוקים מאוד או אפילו זוגות שאין ביניהם קשר משפחתי ידוע עשויים להיראות דומים יותר מן הצפוי [Hen12]. זהו בדיוק המקום שבו הגבול בין קרבה משפחתית עדכנית לבין היסטוריה אוכלוסייתית נעשה מטושטש.</w:t>
+        <w:t>background sharing הוא שיתוף גנטי שאינו נובע מקרבה משפחתית עדכנית אחת, אלא מהיסטוריה עמוקה יותר של האוכלוסייה [4, 5]. בפועל, זהו אחד הקשיים המרכזיים בגנאלוגיה גנטית: לא כל מקטע משותף הוא עדות לקרבה גנאלוגית שימושית.</w:t>
+      </w:r>
+    </w:p>
+    <w:p>
+      <w:pPr>
+        <w:bidi/>
+        <w:jc w:val="right"/>
+      </w:pPr>
+      <w:r>
+        <w:rPr>
+          <w:rFonts w:ascii="Arial" w:hAnsi="Arial" w:cs="Arial"/>
+          <w:rtl/>
+        </w:rPr>
+        <w:t>בפרט, באוכלוסיות עם bottlenecks, founder effects או endogamy, קיים מעין “רצפת רקע” של שיתוף, כך שגם קרובים רחוקים מאוד או אפילו זוגות שאין ביניהם קשר משפחתי ידוע עשויים להיראות דומים יותר מן הצפוי [1]. זהו בדיוק המקום שבו הגבול בין קרבה משפחתית עדכנית לבין היסטוריה אוכלוסייתית נעשה מטושטש.</w:t>
       </w:r>
     </w:p>
     <w:p>
@@ -7457,20 +7457,20 @@
           <w:rFonts w:ascii="Arial" w:hAnsi="Arial" w:cs="Arial"/>
           <w:rtl/>
         </w:rPr>
-        <w:t>admixture הוא מצב שבו אוכלוסייה או פרט נובעים משילוב של מקורות אוכלוסייתיים שונים. מבחינה ביולוגית, זהו מצב רגיל למדי באוכלוסיות אנושיות רבות. מבחינה חישובית, הוא מציב קושי מיוחד, משום שאומדני קרבה סטנדרטיים מניחים לעיתים תדירויות אללים אחידות או רקע אוכלוסייתי פשוט יותר [Tho12, Con16].</w:t>
-      </w:r>
-    </w:p>
-    <w:p>
-      <w:pPr>
-        <w:bidi/>
-        <w:jc w:val="right"/>
-      </w:pPr>
-      <w:r>
-        <w:rPr>
-          <w:rFonts w:ascii="Arial" w:hAnsi="Arial" w:cs="Arial"/>
-          <w:rtl/>
-        </w:rPr>
-        <w:t>Thornton ועמיתיו הראו שכאשר משתמשים באומדנים סטנדרטיים במדגמים admixed, הקרבה עשויה להיות מוטה באופן שיטתי [Tho12]. זוגות בעלי מוצא דומה מאוד עלולים להיראות קרובים מדי, ואילו זוגות מרקעים שונים יותר עלולים להיראות פחות קרובים מכפי שהם באמת.</w:t>
+        <w:t>admixture הוא מצב שבו אוכלוסייה או פרט נובעים משילוב של מקורות אוכלוסייתיים שונים. מבחינה ביולוגית, זהו מצב רגיל למדי באוכלוסיות אנושיות רבות. מבחינה חישובית, הוא מציב קושי מיוחד, משום שאומדני קרבה סטנדרטיים מניחים לעיתים תדירויות אללים אחידות או רקע אוכלוסייתי פשוט יותר [2, 3].</w:t>
+      </w:r>
+    </w:p>
+    <w:p>
+      <w:pPr>
+        <w:bidi/>
+        <w:jc w:val="right"/>
+      </w:pPr>
+      <w:r>
+        <w:rPr>
+          <w:rFonts w:ascii="Arial" w:hAnsi="Arial" w:cs="Arial"/>
+          <w:rtl/>
+        </w:rPr>
+        <w:t>Thornton ועמיתיו הראו שכאשר משתמשים באומדנים סטנדרטיים במדגמים admixed, הקרבה עשויה להיות מוטה באופן שיטתי [2]. זוגות בעלי מוצא דומה מאוד עלולים להיראות קרובים מדי, ואילו זוגות מרקעים שונים יותר עלולים להיראות פחות קרובים מכפי שהם באמת.</w:t>
       </w:r>
     </w:p>
     <w:p>
@@ -7498,7 +7498,7 @@
           <w:rFonts w:ascii="Arial" w:hAnsi="Arial" w:cs="Arial"/>
           <w:rtl/>
         </w:rPr>
-        <w:t>אם שני פרטים הם קרובי משפחה אמיתיים אך אחד מהם בעל רכיבי מוצא שונים מן האחר, אומדן שאינו מתקן כראוי ל־admixture עלול לדחוף את ערך הקרבה כלפי מטה. לעומת זאת, שני פרטים בלתי־קשורים בעלי תמהיל מוצא דומה מאוד עשויים להיראות קרובים יותר מכפי שהם באמת [Tho12, Con16].</w:t>
+        <w:t>אם שני פרטים הם קרובי משפחה אמיתיים אך אחד מהם בעל רכיבי מוצא שונים מן האחר, אומדן שאינו מתקן כראוי ל־admixture עלול לדחוף את ערך הקרבה כלפי מטה. לעומת זאת, שני פרטים בלתי־קשורים בעלי תמהיל מוצא דומה מאוד עשויים להיראות קרובים יותר מכפי שהם באמת [2, 3].</w:t>
       </w:r>
     </w:p>
     <w:p>
@@ -7526,20 +7526,20 @@
           <w:rFonts w:ascii="Arial" w:hAnsi="Arial" w:cs="Arial"/>
           <w:rtl/>
         </w:rPr>
-        <w:t>inbreeding מתאר מצב שבו שני ההורים של פרט חולקים בעצמם אבות קדמונים משותפים, כך שהפרט נושא יותר אזורים הומוזיגוטיים שמקורם משותף. גם תופעה זו מסבכת את הסקת הקרבה, משום שהיא משנה את ההנחות הרגילות לגבי מצבי IBD האפשריים ולגבי תדירויות האללים האפקטיביות [Con16].</w:t>
-      </w:r>
-    </w:p>
-    <w:p>
-      <w:pPr>
-        <w:bidi/>
-        <w:jc w:val="right"/>
-      </w:pPr>
-      <w:r>
-        <w:rPr>
-          <w:rFonts w:ascii="Arial" w:hAnsi="Arial" w:cs="Arial"/>
-          <w:rtl/>
-        </w:rPr>
-        <w:t>מבחינה חישובית, inbreeding עלול להטות אומדני קרבה ולפגוע בפרשנות של מדדים כמו IBD0, IBD1 ו־IBD2, בעיקר כאשר המודלים מניחים זוגות outbred [Con16].</w:t>
+        <w:t>inbreeding מתאר מצב שבו שני ההורים של פרט חולקים בעצמם אבות קדמונים משותפים, כך שהפרט נושא יותר אזורים הומוזיגוטיים שמקורם משותף. גם תופעה זו מסבכת את הסקת הקרבה, משום שהיא משנה את ההנחות הרגילות לגבי מצבי IBD האפשריים ולגבי תדירויות האללים האפקטיביות [3].</w:t>
+      </w:r>
+    </w:p>
+    <w:p>
+      <w:pPr>
+        <w:bidi/>
+        <w:jc w:val="right"/>
+      </w:pPr>
+      <w:r>
+        <w:rPr>
+          <w:rFonts w:ascii="Arial" w:hAnsi="Arial" w:cs="Arial"/>
+          <w:rtl/>
+        </w:rPr>
+        <w:t>מבחינה חישובית, inbreeding עלול להטות אומדני קרבה ולפגוע בפרשנות של מדדים כמו IBD0, IBD1 ו־IBD2, בעיקר כאשר המודלים מניחים זוגות outbred [3].</w:t>
       </w:r>
     </w:p>
     <w:p>
@@ -7567,7 +7567,7 @@
           <w:rFonts w:ascii="Arial" w:hAnsi="Arial" w:cs="Arial"/>
           <w:rtl/>
         </w:rPr>
-        <w:t>כאשר אומדן קרבה משתמש בתדירויות אללים כלליות של המדגם, הוא מניח למעשה שכל זוג פרטים מושווה לאותו רקע ייחוס. אבל במבנה אוכלוסייתי מורכב אין “רקע יחיד” כזה [Tho12].</w:t>
+        <w:t>כאשר אומדן קרבה משתמש בתדירויות אללים כלליות של המדגם, הוא מניח למעשה שכל זוג פרטים מושווה לאותו רקע ייחוס. אבל במבנה אוכלוסייתי מורכב אין “רקע יחיד” כזה [2].</w:t>
       </w:r>
     </w:p>
     <w:p>
@@ -7637,7 +7637,7 @@
           <w:rFonts w:ascii="Arial" w:hAnsi="Arial" w:cs="Arial"/>
           <w:rtl/>
         </w:rPr>
-        <w:t>העבודה של Thornton ועמיתיו הראתה היטב שבאוכלוסיות admixed אומדנים הומוגניים עלולים לבלבל בין מוצא משותף לבין קרבה משפחתית [Tho12]. Conomos ועמיתיו הרחיבו זאת והראו שגם שיטות שנחשבו robust, כגון KING-robust, עשויות להיות מוטות כאשר יש פערי מוצא גדולים בין פרטים או admixture מורכב [Con16].</w:t>
+        <w:t>העבודה של Thornton ועמיתיו הראתה היטב שבאוכלוסיות admixed אומדנים הומוגניים עלולים לבלבל בין מוצא משותף לבין קרבה משפחתית [2]. Conomos ועמיתיו הרחיבו זאת והראו שגם שיטות שנחשבו robust, כגון KING-robust, עשויות להיות מוטות כאשר יש פערי מוצא גדולים בין פרטים או admixture מורכב [3].</w:t>
       </w:r>
     </w:p>
     <w:p>
@@ -7665,20 +7665,20 @@
           <w:rFonts w:ascii="Arial" w:hAnsi="Arial" w:cs="Arial"/>
           <w:rtl/>
         </w:rPr>
-        <w:t>הפתרון העקרוני הוא לאמוד קרבה יחסית לרקע אוכלוסייתי הספציפי של כל זוג פרטים, ולא יחסית לאוכלוסייה אחידה מדומיינת אחת [Tho12, Con16].</w:t>
-      </w:r>
-    </w:p>
-    <w:p>
-      <w:pPr>
-        <w:bidi/>
-        <w:jc w:val="right"/>
-      </w:pPr>
-      <w:r>
-        <w:rPr>
-          <w:rFonts w:ascii="Arial" w:hAnsi="Arial" w:cs="Arial"/>
-          <w:rtl/>
-        </w:rPr>
-        <w:t>REAP, למשל, משתמש ברעיון של תדירויות אללים ספציפיות לפרט, הנגזרות מן הרכב המוצא שלו [Tho12]. PC-Relate פועל בכיוון דומה אך עושה זאת בדרך model-free יותר, באמצעות שימוש ב־principal components כדי להפריד בין דמיון הנובע ממבנה אוכלוסייה לבין דמיון הנובע מקרבה משפחתית עדכנית [Con16].</w:t>
+        <w:t>הפתרון העקרוני הוא לאמוד קרבה יחסית לרקע אוכלוסייתי הספציפי של כל זוג פרטים, ולא יחסית לאוכלוסייה אחידה מדומיינת אחת [2, 3].</w:t>
+      </w:r>
+    </w:p>
+    <w:p>
+      <w:pPr>
+        <w:bidi/>
+        <w:jc w:val="right"/>
+      </w:pPr>
+      <w:r>
+        <w:rPr>
+          <w:rFonts w:ascii="Arial" w:hAnsi="Arial" w:cs="Arial"/>
+          <w:rtl/>
+        </w:rPr>
+        <w:t>REAP, למשל, משתמש ברעיון של תדירויות אללים ספציפיות לפרט, הנגזרות מן הרכב המוצא שלו [2]. PC-Relate פועל בכיוון דומה אך עושה זאת בדרך model-free יותר, באמצעות שימוש ב־principal components כדי להפריד בין דמיון הנובע ממבנה אוכלוסייה לבין דמיון הנובע מקרבה משפחתית עדכנית [3].</w:t>
       </w:r>
     </w:p>
     <w:p>
@@ -7719,20 +7719,20 @@
           <w:rFonts w:ascii="Arial" w:hAnsi="Arial" w:cs="Arial"/>
           <w:rtl/>
         </w:rPr>
-        <w:t>גם שיטות מתקדמות אינן פותרות את הבעיה לחלוטין. כאשר המבנה האוכלוסייתי קיצוני, כאשר קיימת אנדוגמיה חזקה, או כאשר מספר ה־PCs אינו נבחר היטב, עדיין עלולות להישאר הטיות או עלייה בשונות האומדנים [Con16].</w:t>
-      </w:r>
-    </w:p>
-    <w:p>
-      <w:pPr>
-        <w:bidi/>
-        <w:jc w:val="right"/>
-      </w:pPr>
-      <w:r>
-        <w:rPr>
-          <w:rFonts w:ascii="Arial" w:hAnsi="Arial" w:cs="Arial"/>
-          <w:rtl/>
-        </w:rPr>
-        <w:t>בנוסף, גם כאשר האומדן הממוצע מתוקן היטב, עדיין נותרת הבעיה הביולוגית הבסיסית: קרובים רחוקים חולקים DNA באופן אקראי וחלקי מאוד. לכן גם במודל טוב, ההבחנה בין דרגות רחוקות תישאר קשה [Hen12, Con16].</w:t>
+        <w:t>גם שיטות מתקדמות אינן פותרות את הבעיה לחלוטין. כאשר המבנה האוכלוסייתי קיצוני, כאשר קיימת אנדוגמיה חזקה, או כאשר מספר ה־PCs אינו נבחר היטב, עדיין עלולות להישאר הטיות או עלייה בשונות האומדנים [3].</w:t>
+      </w:r>
+    </w:p>
+    <w:p>
+      <w:pPr>
+        <w:bidi/>
+        <w:jc w:val="right"/>
+      </w:pPr>
+      <w:r>
+        <w:rPr>
+          <w:rFonts w:ascii="Arial" w:hAnsi="Arial" w:cs="Arial"/>
+          <w:rtl/>
+        </w:rPr>
+        <w:t>בנוסף, גם כאשר האומדן הממוצע מתוקן היטב, עדיין נותרת הבעיה הביולוגית הבסיסית: קרובים רחוקים חולקים DNA באופן אקראי וחלקי מאוד. לכן גם במודל טוב, ההבחנה בין דרגות רחוקות תישאר קשה [1, 3].</w:t>
       </w:r>
     </w:p>
     <w:p>
@@ -7760,20 +7760,20 @@
           <w:rFonts w:ascii="Arial" w:hAnsi="Arial" w:cs="Arial"/>
           <w:rtl/>
         </w:rPr>
-        <w:t>בגנאלוגיה גנטית מעשית, המגבלות הללו אינן עניין תיאורטי בלבד. הן משפיעות על השאלה האם התאמה במסד נתונים היא התאמה אינפורמטיבית, על האופן שבו מפרשים מרחקי קרבה, ועל מספר הענפים המשפחתיים שיש לבדוק [Hen12, Bro12].</w:t>
-      </w:r>
-    </w:p>
-    <w:p>
-      <w:pPr>
-        <w:bidi/>
-        <w:jc w:val="right"/>
-      </w:pPr>
-      <w:r>
-        <w:rPr>
-          <w:rFonts w:ascii="Arial" w:hAnsi="Arial" w:cs="Arial"/>
-          <w:rtl/>
-        </w:rPr>
-        <w:t>באוכלוסיות אנדוגמיות, התאמות רבות עשויות להיראות “קרובות” יותר מכפי שהן שימושיות בפועל. באוכלוסיות admixed, התאמה אמיתית עלולה להיות מוערכת בחסר אם לא מתחשבים נכון במבנה המוצא [Tho12, Con16]. לכן, בפרקטיקה של FIGG, אין די בקריאת מספר ה־cM או בדרגת הקרבה המוצעת על ידי תוכנה; יש לפרש את התוצאה בתוך ההקשר האוכלוסייתי של הדגימה ושל המאגר.</w:t>
+        <w:t>בגנאלוגיה גנטית מעשית, המגבלות הללו אינן עניין תיאורטי בלבד. הן משפיעות על השאלה האם התאמה במסד נתונים היא התאמה אינפורמטיבית, על האופן שבו מפרשים מרחקי קרבה, ועל מספר הענפים המשפחתיים שיש לבדוק [1, 4].</w:t>
+      </w:r>
+    </w:p>
+    <w:p>
+      <w:pPr>
+        <w:bidi/>
+        <w:jc w:val="right"/>
+      </w:pPr>
+      <w:r>
+        <w:rPr>
+          <w:rFonts w:ascii="Arial" w:hAnsi="Arial" w:cs="Arial"/>
+          <w:rtl/>
+        </w:rPr>
+        <w:t>באוכלוסיות אנדוגמיות, התאמות רבות עשויות להיראות “קרובות” יותר מכפי שהן שימושיות בפועל. באוכלוסיות admixed, התאמה אמיתית עלולה להיות מוערכת בחסר אם לא מתחשבים נכון במבנה המוצא [2, 3]. לכן, בפרקטיקה של FIGG, אין די בקריאת מספר ה־cM או בדרגת הקרבה המוצעת על ידי תוכנה; יש לפרש את התוצאה בתוך ההקשר האוכלוסייתי של הדגימה ושל המאגר.</w:t>
       </w:r>
     </w:p>
     <w:p>
@@ -7801,20 +7801,20 @@
           <w:rFonts w:ascii="Arial" w:hAnsi="Arial" w:cs="Arial"/>
           <w:rtl/>
         </w:rPr>
-        <w:t>הסקת קרבה גנטית מושפעת עמוקות מן ההיסטוריה הדמוגרפית של האוכלוסייה. cryptic relatedness, endogamy, admixture, inbreeding ו־background sharing כולם משנים את הקשר בין שיתוף גנטי לבין קרבה משפחתית [Hen12, Tho12, Con16].</w:t>
-      </w:r>
-    </w:p>
-    <w:p>
-      <w:pPr>
-        <w:bidi/>
-        <w:jc w:val="right"/>
-      </w:pPr>
-      <w:r>
-        <w:rPr>
-          <w:rFonts w:ascii="Arial" w:hAnsi="Arial" w:cs="Arial"/>
-          <w:rtl/>
-        </w:rPr>
-        <w:t>משום כך, אומדני קרבה פשוטים עלולים להטות את התוצאה כאשר מבנה האוכלוסייה מורכב. שיטות robust כמו REAP ו־PC-Relate מנסות להפריד בין קרבה משפחתית עדכנית לבין רקע מוצא משותף, אך גם הן פועלות תחת מגבלות מעשיות וביולוגיות [Tho12, Con16].</w:t>
+        <w:t>הסקת קרבה גנטית מושפעת עמוקות מן ההיסטוריה הדמוגרפית של האוכלוסייה. cryptic relatedness, endogamy, admixture, inbreeding ו־background sharing כולם משנים את הקשר בין שיתוף גנטי לבין קרבה משפחתית [1, 2, 3].</w:t>
+      </w:r>
+    </w:p>
+    <w:p>
+      <w:pPr>
+        <w:bidi/>
+        <w:jc w:val="right"/>
+      </w:pPr>
+      <w:r>
+        <w:rPr>
+          <w:rFonts w:ascii="Arial" w:hAnsi="Arial" w:cs="Arial"/>
+          <w:rtl/>
+        </w:rPr>
+        <w:t>משום כך, אומדני קרבה פשוטים עלולים להטות את התוצאה כאשר מבנה האוכלוסייה מורכב. שיטות robust כמו REAP ו־PC-Relate מנסות להפריד בין קרבה משפחתית עדכנית לבין רקע מוצא משותף, אך גם הן פועלות תחת מגבלות מעשיות וביולוגיות [2, 3].</w:t>
       </w:r>
     </w:p>
     <w:p>
@@ -7870,7 +7870,7 @@
           <w:rFonts w:ascii="Arial" w:hAnsi="Arial" w:cs="Arial"/>
           <w:rtl/>
         </w:rPr>
-        <w:t>קרבה רחוקה שאינה ידועה למשתתפים או לחוקרים, אך ניתנת לזיהוי דרך מקטעי IBD [Hen12].</w:t>
+        <w:t>קרבה רחוקה שאינה ידועה למשתתפים או לחוקרים, אך ניתנת לזיהוי דרך מקטעי IBD [1].</w:t>
       </w:r>
     </w:p>
     <w:p>
@@ -7898,7 +7898,7 @@
           <w:rFonts w:ascii="Arial" w:hAnsi="Arial" w:cs="Arial"/>
           <w:rtl/>
         </w:rPr>
-        <w:t>רבייה בתוך קבוצה מצומצמת לאורך דורות רבים, היוצרת ריבוי אבות קדמונים משותפים והגדלת שיתוף הרקע הגנטי [Hen12].</w:t>
+        <w:t>רבייה בתוך קבוצה מצומצמת לאורך דורות רבים, היוצרת ריבוי אבות קדמונים משותפים והגדלת שיתוף הרקע הגנטי [1].</w:t>
       </w:r>
     </w:p>
     <w:p>
@@ -7926,7 +7926,7 @@
           <w:rFonts w:ascii="Arial" w:hAnsi="Arial" w:cs="Arial"/>
           <w:rtl/>
         </w:rPr>
-        <w:t>שיתוף גנטי הנובע מהיסטוריה אוכלוסייתית רחבה ולא מקרבה משפחתית עדכנית אחת [Bro12, Hen12].</w:t>
+        <w:t>שיתוף גנטי הנובע מהיסטוריה אוכלוסייתית רחבה ולא מקרבה משפחתית עדכנית אחת [4, 1].</w:t>
       </w:r>
     </w:p>
     <w:p>
@@ -7954,7 +7954,7 @@
           <w:rFonts w:ascii="Arial" w:hAnsi="Arial" w:cs="Arial"/>
           <w:rtl/>
         </w:rPr>
-        <w:t>שילוב של מקורות אוכלוסייתיים שונים בתוך פרט או אוכלוסייה, באופן שעלול להטות אומדני קרבה אם אינו מטופל נכון [Tho12, Con16].</w:t>
+        <w:t>שילוב של מקורות אוכלוסייתיים שונים בתוך פרט או אוכלוסייה, באופן שעלול להטות אומדני קרבה אם אינו מטופל נכון [2, 3].</w:t>
       </w:r>
     </w:p>
     <w:p>
@@ -7982,7 +7982,7 @@
           <w:rFonts w:ascii="Arial" w:hAnsi="Arial" w:cs="Arial"/>
           <w:rtl/>
         </w:rPr>
-        <w:t>מצב שבו להורי הפרט יש אבות קדמונים משותפים, כך שהפרט נושא יותר אזורים הומוזיגוטיים ממקור משותף [Con16].</w:t>
+        <w:t>מצב שבו להורי הפרט יש אבות קדמונים משותפים, כך שהפרט נושא יותר אזורים הומוזיגוטיים ממקור משותף [3].</w:t>
       </w:r>
     </w:p>
     <w:p>
@@ -8010,7 +8010,7 @@
           <w:rFonts w:ascii="Arial" w:hAnsi="Arial" w:cs="Arial"/>
           <w:rtl/>
         </w:rPr>
-        <w:t>גישות לאמידת קרבה המנסות להפריד בין דמיון הנובע ממבנה אוכלוסייה לבין דמיון הנובע מקרבה משפחתית עדכנית [Tho12, Con16].</w:t>
+        <w:t>גישות לאמידת קרבה המנסות להפריד בין דמיון הנובע ממבנה אוכלוסייה לבין דמיון הנובע מקרבה משפחתית עדכנית [2, 3].</w:t>
       </w:r>
     </w:p>
     <w:p>
@@ -8040,7 +8040,53 @@
           <w:rFonts w:ascii="Arial" w:hAnsi="Arial" w:cs="Arial"/>
           <w:rtl/>
         </w:rPr>
-        <w:t>[Hen12]</w:t>
+        <w:t xml:space="preserve">&lt;span class="nocase"&gt;B. Henn </w:t>
+      </w:r>
+      <w:r>
+        <w:rPr>
+          <w:rtl/>
+          <w:rFonts w:ascii="Arial" w:hAnsi="Arial" w:cs="Arial"/>
+          <w:i/>
+        </w:rPr>
+        <w:t>et al.</w:t>
+      </w:r>
+      <w:r>
+        <w:rPr>
+          <w:rFonts w:ascii="Arial" w:hAnsi="Arial" w:cs="Arial"/>
+          <w:rtl/>
+        </w:rPr>
+        <w:t xml:space="preserve">&lt;/span&gt;, “Cryptic Distant Relatives Are Common in Both Isolated and Cosmopolitan Genetic Samples,” </w:t>
+      </w:r>
+      <w:r>
+        <w:rPr>
+          <w:rtl/>
+          <w:rFonts w:ascii="Arial" w:hAnsi="Arial" w:cs="Arial"/>
+          <w:i/>
+        </w:rPr>
+        <w:t>PLoS ONE</w:t>
+      </w:r>
+      <w:r>
+        <w:rPr>
+          <w:rFonts w:ascii="Arial" w:hAnsi="Arial" w:cs="Arial"/>
+          <w:rtl/>
+        </w:rPr>
+        <w:t xml:space="preserve">, vol. 7, Apr. 2012, doi: </w:t>
+      </w:r>
+      <w:r>
+        <w:rPr>
+          <w:rtl/>
+          <w:rFonts w:ascii="Arial" w:hAnsi="Arial" w:cs="Arial"/>
+          <w:color w:val="0000FF"/>
+          <w:u w:val="single"/>
+        </w:rPr>
+        <w:t>10.1371/journal.pone.0034267</w:t>
+      </w:r>
+      <w:r>
+        <w:rPr>
+          <w:rFonts w:ascii="Arial" w:hAnsi="Arial" w:cs="Arial"/>
+          <w:rtl/>
+        </w:rPr>
+        <w:t>.</w:t>
       </w:r>
     </w:p>
     <w:p>
@@ -8068,7 +8114,38 @@
           <w:rFonts w:ascii="Arial" w:hAnsi="Arial" w:cs="Arial"/>
           <w:rtl/>
         </w:rPr>
-        <w:t>[Tho12]</w:t>
+        <w:t xml:space="preserve">T. Thornton, H. Tang, T. Hoffmann, H. Ochs-Balcom, B. Caan, and N. Risch, “Estimating kinship in admixed populations.” </w:t>
+      </w:r>
+      <w:r>
+        <w:rPr>
+          <w:rtl/>
+          <w:rFonts w:ascii="Arial" w:hAnsi="Arial" w:cs="Arial"/>
+          <w:i/>
+        </w:rPr>
+        <w:t>American journal of human genetics</w:t>
+      </w:r>
+      <w:r>
+        <w:rPr>
+          <w:rFonts w:ascii="Arial" w:hAnsi="Arial" w:cs="Arial"/>
+          <w:rtl/>
+        </w:rPr>
+        <w:t xml:space="preserve">, vol. 91 1, pp. 122–38, Jul. 2012, doi: </w:t>
+      </w:r>
+      <w:r>
+        <w:rPr>
+          <w:rtl/>
+          <w:rFonts w:ascii="Arial" w:hAnsi="Arial" w:cs="Arial"/>
+          <w:color w:val="0000FF"/>
+          <w:u w:val="single"/>
+        </w:rPr>
+        <w:t>10.1016/j.ajhg.2012.05.024</w:t>
+      </w:r>
+      <w:r>
+        <w:rPr>
+          <w:rFonts w:ascii="Arial" w:hAnsi="Arial" w:cs="Arial"/>
+          <w:rtl/>
+        </w:rPr>
+        <w:t>.</w:t>
       </w:r>
     </w:p>
     <w:p>
@@ -8096,7 +8173,38 @@
           <w:rFonts w:ascii="Arial" w:hAnsi="Arial" w:cs="Arial"/>
           <w:rtl/>
         </w:rPr>
-        <w:t>[Con16]</w:t>
+        <w:t xml:space="preserve">M. Conomos, A. Reiner, B. Weir, and T. Thornton, “Model-free Estimation of Recent Genetic Relatedness.” </w:t>
+      </w:r>
+      <w:r>
+        <w:rPr>
+          <w:rtl/>
+          <w:rFonts w:ascii="Arial" w:hAnsi="Arial" w:cs="Arial"/>
+          <w:i/>
+        </w:rPr>
+        <w:t>American journal of human genetics</w:t>
+      </w:r>
+      <w:r>
+        <w:rPr>
+          <w:rFonts w:ascii="Arial" w:hAnsi="Arial" w:cs="Arial"/>
+          <w:rtl/>
+        </w:rPr>
+        <w:t xml:space="preserve">, vol. 98 1, pp. 127–48, Jan. 2016, doi: </w:t>
+      </w:r>
+      <w:r>
+        <w:rPr>
+          <w:rtl/>
+          <w:rFonts w:ascii="Arial" w:hAnsi="Arial" w:cs="Arial"/>
+          <w:color w:val="0000FF"/>
+          <w:u w:val="single"/>
+        </w:rPr>
+        <w:t>10.1016/j.ajhg.2015.11.022</w:t>
+      </w:r>
+      <w:r>
+        <w:rPr>
+          <w:rFonts w:ascii="Arial" w:hAnsi="Arial" w:cs="Arial"/>
+          <w:rtl/>
+        </w:rPr>
+        <w:t>.</w:t>
       </w:r>
     </w:p>
     <w:p>
@@ -8124,7 +8232,38 @@
           <w:rFonts w:ascii="Arial" w:hAnsi="Arial" w:cs="Arial"/>
           <w:rtl/>
         </w:rPr>
-        <w:t>[Bro12]</w:t>
+        <w:t xml:space="preserve">S. Browning and B. Browning, “Identity by descent between distant relatives: detection and applications.” </w:t>
+      </w:r>
+      <w:r>
+        <w:rPr>
+          <w:rtl/>
+          <w:rFonts w:ascii="Arial" w:hAnsi="Arial" w:cs="Arial"/>
+          <w:i/>
+        </w:rPr>
+        <w:t>Annual review of genetics</w:t>
+      </w:r>
+      <w:r>
+        <w:rPr>
+          <w:rFonts w:ascii="Arial" w:hAnsi="Arial" w:cs="Arial"/>
+          <w:rtl/>
+        </w:rPr>
+        <w:t xml:space="preserve">, vol. 46, pp. 617–33, Nov. 2012, doi: </w:t>
+      </w:r>
+      <w:r>
+        <w:rPr>
+          <w:rtl/>
+          <w:rFonts w:ascii="Arial" w:hAnsi="Arial" w:cs="Arial"/>
+          <w:color w:val="0000FF"/>
+          <w:u w:val="single"/>
+        </w:rPr>
+        <w:t>10.1146/annurev-genet-110711-155534</w:t>
+      </w:r>
+      <w:r>
+        <w:rPr>
+          <w:rFonts w:ascii="Arial" w:hAnsi="Arial" w:cs="Arial"/>
+          <w:rtl/>
+        </w:rPr>
+        <w:t>.</w:t>
       </w:r>
     </w:p>
     <w:p>
@@ -8168,7 +8307,7 @@
           <w:color w:val="0000FF"/>
           <w:u w:val="single"/>
         </w:rPr>
-        <w:t>Hen12] &lt;span class="nocase"&gt;B. Henn *et al.*&lt;/span&gt;, “Cryptic Distant Relatives Are Common in Both Isolated and Cosmopolitan Genetic Samples,” *PLoS ONE*, vol. 7, Apr. 2012, doi: [10.1371/journal.pone.0034267</w:t>
+        <w:t>1] &lt;span class="nocase"&gt;B. Henn *et al.*&lt;/span&gt;, “Cryptic Distant Relatives Are Common in Both Isolated and Cosmopolitan Genetic Samples,” *PLoS ONE*, vol. 7, Apr. 2012, doi: [10.1371/journal.pone.0034267</w:t>
       </w:r>
       <w:r>
         <w:t>.</w:t>
@@ -8183,7 +8322,7 @@
           <w:color w:val="0000FF"/>
           <w:u w:val="single"/>
         </w:rPr>
-        <w:t>Tho12] T. Thornton, H. Tang, T. Hoffmann, H. Ochs-Balcom, B. Caan, and N. Risch, “Estimating kinship in admixed populations.” *American journal of human genetics*, vol. 91 1, pp. 122–38, Jul. 2012, doi: [10.1016/j.ajhg.2012.05.024</w:t>
+        <w:t>2] T. Thornton, H. Tang, T. Hoffmann, H. Ochs-Balcom, B. Caan, and N. Risch, “Estimating kinship in admixed populations.” *American journal of human genetics*, vol. 91 1, pp. 122–38, Jul. 2012, doi: [10.1016/j.ajhg.2012.05.024</w:t>
       </w:r>
       <w:r>
         <w:t>.</w:t>
@@ -8198,7 +8337,7 @@
           <w:color w:val="0000FF"/>
           <w:u w:val="single"/>
         </w:rPr>
-        <w:t>Con16] M. Conomos, A. Reiner, B. Weir, and T. Thornton, “Model-free Estimation of Recent Genetic Relatedness.” *American journal of human genetics*, vol. 98 1, pp. 127–48, Jan. 2016, doi: [10.1016/j.ajhg.2015.11.022</w:t>
+        <w:t>3] M. Conomos, A. Reiner, B. Weir, and T. Thornton, “Model-free Estimation of Recent Genetic Relatedness.” *American journal of human genetics*, vol. 98 1, pp. 127–48, Jan. 2016, doi: [10.1016/j.ajhg.2015.11.022</w:t>
       </w:r>
       <w:r>
         <w:t>.</w:t>
@@ -8213,7 +8352,7 @@
           <w:color w:val="0000FF"/>
           <w:u w:val="single"/>
         </w:rPr>
-        <w:t>Bro12] S. Browning and B. Browning, “Identity by descent between distant relatives: detection and applications.” *Annual review of genetics*, vol. 46, pp. 617–33, Nov. 2012, doi: [10.1146/annurev-genet-110711-155534</w:t>
+        <w:t>4] S. Browning and B. Browning, “Identity by descent between distant relatives: detection and applications.” *Annual review of genetics*, vol. 46, pp. 617–33, Nov. 2012, doi: [10.1146/annurev-genet-110711-155534</w:t>
       </w:r>
       <w:r>
         <w:t>.</w:t>
@@ -8228,7 +8367,7 @@
           <w:color w:val="0000FF"/>
           <w:u w:val="single"/>
         </w:rPr>
-        <w:t>Huf11] C. Huff *et al.*, “Maximum-likelihood estimation of recent shared ancestry (ERSA).” *Genome research*, vol. 21 5, pp. 768–74, Feb. 2011, doi: [10.1101/gr.115972.110</w:t>
+        <w:t>5] C. Huff *et al.*, “Maximum-likelihood estimation of recent shared ancestry (ERSA).” *Genome research*, vol. 21 5, pp. 768–74, Feb. 2011, doi: [10.1101/gr.115972.110</w:t>
       </w:r>
       <w:r>
         <w:t>.</w:t>
@@ -8913,7 +9052,7 @@
           <w:rFonts w:ascii="Arial" w:hAnsi="Arial" w:cs="Arial"/>
           <w:rtl/>
         </w:rPr>
-        <w:t>גם במסד גדול מאוד לא כל קרוב גנאלוגי יהיה detectable. Kli21 מדגיש שלא כל קרוב משפחה גנאלוגי חולק מספיק DNA כדי להיות מזוהה, ובייחוד בטווח של בני דודים רחוקים יש סבירות ממשית שלא יימצא כל שיתוף שימושי [1].</w:t>
+        <w:t>גם במסד גדול מאוד לא כל קרוב גנאלוגי יהיה מזוהה. קלינג [1] מדגיש שלא כל קרוב משפחה גנאלוגי חולק מספיק DNA כדי להיות מזוהה, ובייחוד בטווח של בני דודים רחוקים יש סבירות ממשית שלא יימצא כל שיתוף שימושי [1].</w:t>
       </w:r>
     </w:p>
     <w:p>
@@ -9831,7 +9970,7 @@
           <w:rFonts w:ascii="Arial" w:hAnsi="Arial" w:cs="Arial"/>
           <w:rtl/>
         </w:rPr>
-        <w:t>Conrick ועמיתיו, בסקירתם משנת 2025, הדגישו כי עבור אנשים עם ניסיון של אימוץ או out-of-home care, בדיקות כאלה עשויות לספק חיבור למורשת, זהות ובריאות, אך גם להציף grief, שאלות שייכות ואתגרים אישיים ניכרים [11]. מבחינה אקדמית, זהו יישום חשוב משום שהוא ממחיש כיצד אותה טכנולוגיה יכולה להיות בו זמנית כלי אינפורמטיבי וכלי מטלטל מבחינה זהותית.</w:t>
+        <w:t>Conrick ועמיתיו, בסקירתם משנת 2025, הדגישו כי עבור אנשים עם ניסיון של אימוץ או out-of-home care, בדיקות כאלה עשויות לספק חיבור למורשת, זהות ובריאות, אך גם להציף צער, שאלות שייכות ואתגרים אישיים ניכרים [11]. מבחינה אקדמית, זהו יישום חשוב משום שהוא ממחיש כיצד אותה טכנולוגיה יכולה להיות בו זמנית כלי אינפורמטיבי וכלי מטלטל מבחינה זהותית.</w:t>
       </w:r>
     </w:p>
     <w:p>
@@ -9872,7 +10011,7 @@
           <w:rFonts w:ascii="Arial" w:hAnsi="Arial" w:cs="Arial"/>
           <w:rtl/>
         </w:rPr>
-        <w:t>הטיעון המרכזי פשוט: גם אם התורם עצמו לא נבדק, קרוביו עשויים להיבדק, ולכן אפשר להתקדם דרכם לעבר זהותו. המשמעות היא שהסדרים חברתיים ומשפטיים שנבנו על הנחת anonymity מתערערים בפועל לנוכח כוחם של relative-finder services [5], [6].</w:t>
+        <w:t>הטיעון המרכזי פשוט: גם אם התורם עצמו לא נבדק, קרוביו עשויים להיבדק, ולכן אפשר להתקדם דרכם לעבר זהותו. המשמעות היא שהסדרים חברתיים ומשפטיים שנבנו על הנחת חסיון/אנונימיות מתערערים בפועל לנוכח כוחם של relative-finder services [5], [6].</w:t>
       </w:r>
     </w:p>
     <w:p>
@@ -9926,7 +10065,7 @@
           <w:rFonts w:ascii="Arial" w:hAnsi="Arial" w:cs="Arial"/>
           <w:rtl/>
         </w:rPr>
-        <w:t>מלבד אימוץ ו־donor conception, שירותי genetic relative-finder יוצרים מרחב רחב של גילויים בלתי־צפויים: אבהות שגויה, אחאים לא ידועים, קשרי משפחה חצי־מוסתרים, או ענפים שלא תועדו כלל. Guerrini ועמיתיה הראו שבמדגם גדול מאוד של משתמשי GRF, רוב המשתתפים למדו לפחות דבר חדש אחד על עצמם או על קרוביהם, ולעיתים מדובר היה במידע בעל השלכות משפחתיות ממשיות [2].</w:t>
+        <w:t>מלבד אימוץ ו־donor conception, שירותי genetic relative-finder יוצרים מרחב רחב של גילויים בלתי־צפויים: אבהות שגויה, אחים לא ידועים, קשרי משפחה חצי־מוסתרים, או ענפים שלא תועדו כלל. Guerrini ועמיתיה הראו שבמדגם גדול מאוד של משתמשי GRF, רוב המשתתפים למדו לפחות דבר חדש אחד על עצמם או על קרוביהם, ולעיתים מדובר היה במידע בעל השלכות משפחתיות ממשיות [2].</w:t>
       </w:r>
     </w:p>
     <w:p>
@@ -10050,7 +10189,7 @@
           <w:rFonts w:ascii="Arial" w:hAnsi="Arial" w:cs="Arial"/>
           <w:rtl/>
         </w:rPr>
-        <w:t>ההבדל בין היישומים אינו מצוי בטכנולוגיה עצמה אלא בשאלה האנושית הנשאלת. ב־ancestry מחפשים מוצא; באימוץ מחפשים משפחה ביולוגית; ב־donor conception מחפשים תורם, אחאים או צאצאים; ובשירותי GRF לעיתים כלל לא יודעים מראש מה מחפשים, אלא רק פותחים פתח לגילוי [2], [3], [4].</w:t>
+        <w:t>ההבדל בין היישומים אינו מצוי בטכנולוגיה עצמה אלא בשאלה האנושית הנשאלת. ב־ancestry מחפשים מוצא; באימוץ מחפשים משפחה ביולוגית; ב־donor conception מחפשים תורם, אחים או צאצאים; ובשירותי GRF לעיתים כלל לא יודעים מראש מה מחפשים, אלא רק פותחים פתח לגילוי [2], [3], [4].</w:t>
       </w:r>
     </w:p>
     <w:p>
@@ -10259,7 +10398,7 @@
           <w:rFonts w:ascii="Arial" w:hAnsi="Arial" w:cs="Arial"/>
           <w:rtl/>
         </w:rPr>
-        <w:t>איתור ויצירת קשר בין אנשים הקשורים זה לזה דרך תרומת גמטות, כגון donor-conceived people, תורמים, הורים ואחאים גנטיים [4].</w:t>
+        <w:t>איתור ויצירת קשר בין אנשים הקשורים זה לזה דרך תרומת גמטות, כגון donor-conceived people, תורמים, הורים ואחים גנטיים [4].</w:t>
       </w:r>
     </w:p>
     <w:p>
@@ -11113,7 +11252,7 @@
           <w:rFonts w:ascii="Arial" w:hAnsi="Arial" w:cs="Arial"/>
           <w:rtl/>
         </w:rPr>
-        <w:t>פרק 8 זיהוי נעדרים שרידים ו־DVI</w:t>
+        <w:t>פרק 8: זיהוי נעדרים שרידים ו־DVI</w:t>
       </w:r>
       <w:bookmarkEnd w:id="chapter_8"/>
     </w:p>
@@ -11199,7 +11338,7 @@
           <w:rFonts w:ascii="Arial" w:hAnsi="Arial" w:cs="Arial"/>
           <w:rtl/>
         </w:rPr>
-        <w:t>להבין מדוע SNPs וכלי forensic genomics נעשים חשובים יותר ויותר ב־DVI ובזיהוי שרידים מאתגרים [2], [4], [5].</w:t>
+        <w:t>להבין מדוע SNPs וכלי גנטיקה פורנזית נעשים חשובים יותר ויותר ב־DVI ובזיהוי שרידים מאתגרים [2], [4], [5].</w:t>
       </w:r>
     </w:p>
     <w:p>
@@ -11363,7 +11502,7 @@
           <w:rFonts w:ascii="Arial" w:hAnsi="Arial" w:cs="Arial"/>
           <w:rtl/>
         </w:rPr>
-        <w:t>Disaster victim identification הוא מקרה קצה של זיהוי נעדרים, שבו מספר רב של גופות או חלקי גופות חייבים להיות מזוהים בזמן קצר יחסית, לעיתים לאחר אש, פיצוץ, התרסקות, צונאמי או אירוע רב־נפגעים אחר [4], [6].</w:t>
+        <w:t>אסון המוני הוא מקרה קצה של זיהוי נעדרים, שבו מספר רב של גופות או חלקי גופות חייבים להיות מזוהים בזמן קצר יחסית, לעיתים לאחר אש, פיצוץ, התרסקות, צונאמי או אירוע רב־נפגעים אחר [4], [6].</w:t>
       </w:r>
     </w:p>
     <w:p>
@@ -11512,7 +11651,7 @@
           <w:rFonts w:ascii="Arial" w:hAnsi="Arial" w:cs="Arial"/>
           <w:rtl/>
         </w:rPr>
-        <w:t>אחד השינויים החשובים של השנים האחרונות הוא המעבר מראיית SNPs ככלי למחקר אוכלוסיות או לגנאלוגיה צרכנית, לראייתם ככלי operational במעבדות forensic genomics [2], [4], [5].</w:t>
+        <w:t>אחד השינויים החשובים של השנים האחרונות הוא המעבר מראיית SNPs ככלי למחקר אוכלוסיות או לגנאלוגיה צרכנית, לראייתם ככלי מבצעי במעבדות גנטיקה פורנזית [2], [4], [5].</w:t>
       </w:r>
     </w:p>
     <w:p>
@@ -11607,20 +11746,20 @@
           <w:rFonts w:ascii="Arial" w:hAnsi="Arial" w:cs="Arial"/>
           <w:rtl/>
         </w:rPr>
-        <w:t>יש קו רציף בין missing persons identification לבין FIGG, אך אין חפיפה מלאה. בזיהוי הומניטרי ומוסדי נהוג להתחיל ממאגרי קרובי משפחה ייעודיים ומ־pedigree matching ישיר יחסית [1], [3]. ב־FIGG, לעומת זאת, לעיתים מתחילים ממאגרי קרובים רחוקים שאינם נבנו למטרה זו, ומתקדמים לעבר tree building רחב יותר.</w:t>
-      </w:r>
-    </w:p>
-    <w:p>
-      <w:pPr>
-        <w:bidi/>
-        <w:jc w:val="right"/>
-      </w:pPr>
-      <w:r>
-        <w:rPr>
-          <w:rFonts w:ascii="Arial" w:hAnsi="Arial" w:cs="Arial"/>
-          <w:rtl/>
-        </w:rPr>
-        <w:t>Wat24 מתארים במפורש רצף בין short-range kinship testing, medium-range kinship testing ו־FIGG. זו נקודה פדגוגית חשובה: לא מדובר בשיטות נפרדות לחלוטין, אלא במשפחה של טכניקות הבודלות זו מזו בטווח הקרבה, בסוג הפאנל הגנטי, במטרת החיפוש, ובמידת התלות במסדי נתונים גנאלוגיים לעומת family-reference databases [2].</w:t>
+        <w:t>יש קו רציף בין זיהוי אלמונים לבין FIGG, אך אין חפיפה מלאה. בזיהוי הומניטרי ומוסדי נהוג להתחיל ממאגרי קרובי משפחה ייעודיים ומ־pedigree matching ישיר יחסית [1], [3]. ב־FIGG, לעומת זאת, לעיתים מתחילים ממאגרי קרובים רחוקים שאינם נבנו למטרה זו, ומתקדמים לעבר tree building רחב יותר.</w:t>
+      </w:r>
+    </w:p>
+    <w:p>
+      <w:pPr>
+        <w:bidi/>
+        <w:jc w:val="right"/>
+      </w:pPr>
+      <w:r>
+        <w:rPr>
+          <w:rFonts w:ascii="Arial" w:hAnsi="Arial" w:cs="Arial"/>
+          <w:rtl/>
+        </w:rPr>
+        <w:t>ווטסון [2] מתארים במפורש רצף בין short-range kinship testing, medium-range kinship testing ו־FIGG. זו נקודה פדגוגית חשובה: לא מדובר בשיטות נפרדות לחלוטין, אלא במשפחה של טכניקות הבודלות זו מזו בטווח הקרבה, בסוג הפאנל הגנטי, במטרת החיפוש, ובמידת התלות במסדי נתונים גנאלוגיים לעומת family-reference databases [2].</w:t>
       </w:r>
     </w:p>
     <w:p>
@@ -11661,7 +11800,7 @@
           <w:rFonts w:ascii="Arial" w:hAnsi="Arial" w:cs="Arial"/>
           <w:rtl/>
         </w:rPr>
-        <w:t>זו אחת הסיבות ש־DVI והזדהות נעדרים הם נושא מרכזי בקורס: הם מדגימים כיצד גנטיקה, אנתרופולוגיה, דאטה־מנג׳מנט וחקירה מוסדית נפגשים סביב שאלת זיהוי אחת.</w:t>
+        <w:t>זו אחת הסיבות ש־DVI והזדהות נעדרים הם נושא מרכזי בקורס: הם מדגימים כיצד גנטיקה, אנתרופולוגיה, ניהול מיידע וחקירה מוסדית נפגשים סביב שאלת זיהוי אחת.</w:t>
       </w:r>
     </w:p>
     <w:p>
@@ -11702,7 +11841,7 @@
           <w:rFonts w:ascii="Arial" w:hAnsi="Arial" w:cs="Arial"/>
           <w:rtl/>
         </w:rPr>
-        <w:t>STRs ממשיכים להיות חשובים, אך SNPs וכלי forensic genomics נעשים חשובים יותר במצבים של DNA מפורק, קרבה רחוקה יותר, וצורך בתפוקה גבוהה או במידע משלים כגון ancestry ו־sex inference [2], [4], [5].</w:t>
+        <w:t>STRs ממשיכים להיות חשובים, אך SNPs וכלי גנטיקה פורנזית נעשים חשובים יותר במצבים של DNA מפורק, קרבה רחוקה יותר, וצורך בתפוקה גבוהה או במידע משלים כגון ancestry ו־sex inference [2], [4], [5].</w:t>
       </w:r>
     </w:p>
     <w:p>
@@ -11786,7 +11925,7 @@
           <w:rFonts w:ascii="Arial" w:hAnsi="Arial" w:cs="Arial"/>
           <w:rtl/>
         </w:rPr>
-        <w:t>Disaster victim identification, כלומר זיהוי קורבנות באירוע רב־נפגעים, שבו יש לעיתים צורך בזיהוי מספר רב של גופות או שרידים בזמן מוגבל [6].</w:t>
+        <w:t>אסון המוני, כלומר זיהוי קורבנות באירוע רב־נפגעים, שבו יש לעיתים צורך בזיהוי מספר רב של גופות או שרידים בזמן מוגבל [6].</w:t>
       </w:r>
     </w:p>
     <w:p>
@@ -12486,7 +12625,7 @@
           <w:rFonts w:ascii="Arial" w:hAnsi="Arial" w:cs="Arial"/>
           <w:rtl/>
         </w:rPr>
-        <w:t>פרק 9 FIGG במעבדה הפורנזית</w:t>
+        <w:t>פרק 9: FIGG במעבדה הפורנזית</w:t>
       </w:r>
       <w:bookmarkEnd w:id="chapter_9"/>
     </w:p>
@@ -12682,7 +12821,7 @@
           <w:rFonts w:ascii="Arial" w:hAnsi="Arial" w:cs="Arial"/>
           <w:rtl/>
         </w:rPr>
-        <w:t>ב־FIGG המעבדה מקבלת לעיתים קרובות דגימות מאתגרות יותר מאלה של בדיקות אזרחיות: דם מיושן, תאי זרע, עצם, שן, שיער, קלטות דבק, חפצים נגועים בכמות DNA נמוכה, או שרידים אנושיים שנפגעו מסביבה, לחות, חום או זמן [2], [6], [7].</w:t>
+        <w:t>ב־FIGG המעבדה מקבלת לעיתים קרובות דגימות מאתגרות יותר מאלה של בדיקות אזרחיות: דם מיושן, תאי זרע, עצם, שן, שיער, חפצי מגע בכמות DNA נמוכה, או שרידים אנושיים שנפגעו מסביבה, לחות, חום או זמן [2], [6], [7].</w:t>
       </w:r>
     </w:p>
     <w:p>
@@ -12870,7 +13009,7 @@
           <w:rFonts w:ascii="Arial" w:hAnsi="Arial" w:cs="Arial"/>
           <w:rtl/>
         </w:rPr>
-        <w:t>Antunes ועמיתיה הציגו validation developmental רחב יותר והדגישו שפאנל זה נבנה כך ש־97.8% מן האמפליקונים יהיו קצרים מ־150 bp, מה שמגדיל את סיכויי ההצלחה בדגימות degraded. הם מסכמים שהקיט, יחד עם MiSeq FGx ו־Universal Analysis Software, מאפשרים להעביר את הרכיב הגנטי של FIGG אל תוך המעבדה הפורנזית עצמה [3].</w:t>
+        <w:t>Antunes ועמיתיה הציגו validation developmental רחב יותר והדגישו שפאנל זה נבנה כך ש־97.8% מן האמפליקונים יהיו קצרים מ־150 bp, מה שמגדיל את סיכויי ההצלחה בדגימות מפורקות. הם מסכמים שהקיט, יחד עם MiSeq FGx ו־Universal Analysis Software, מאפשרים להעביר את הרכיב הגנטי של FIGG אל תוך המעבדה הפורנזית עצמה [3].</w:t>
       </w:r>
     </w:p>
     <w:p>
@@ -12955,7 +13094,7 @@
           <w:rFonts w:ascii="Arial" w:hAnsi="Arial" w:cs="Arial"/>
           <w:rtl/>
         </w:rPr>
-        <w:t xml:space="preserve"> — DNA מקוטע favor לשיטות מבוססות ריצוף או פאנלים קצרים [2], [3]</w:t>
+        <w:t xml:space="preserve"> — DNA מקוטע עדיפות לשיטות מבוססות ריצוף או פאנלים קצרים [2], [3]</w:t>
       </w:r>
     </w:p>
     <w:p>
@@ -13146,7 +13285,7 @@
           <w:rFonts w:ascii="Arial" w:hAnsi="Arial" w:cs="Arial"/>
           <w:rtl/>
         </w:rPr>
-        <w:t>במחקרי validation בודקים עד כמה הגנוטיפים תואמים לפרופילי reference ידועים. זהו מדד חשוב במיוחד כאשר עובדים עם קלטי DNA נמוכים, דגימות degraded או workflows חדשים [5], [6].</w:t>
+        <w:t>במחקרי validation בודקים עד כמה הגנוטיפים תואמים לפרופילי reference ידועים. זהו מדד חשוב במיוחד כאשר עובדים עם קלטי DNA נמוכים, דגימות מפורקות או workflows חדשים [5], [6].</w:t>
       </w:r>
     </w:p>
     <w:p>
@@ -13174,7 +13313,7 @@
           <w:rFonts w:ascii="Arial" w:hAnsi="Arial" w:cs="Arial"/>
           <w:rtl/>
         </w:rPr>
-        <w:t>אחד הלקחים החוזרים כמעט בכל הספרות הוא שפירוק DNA הוא צוואר הבקבוק המרכזי. Vri21 מראים שהשפעתו על kinship classification קשה במיוחד, וש־compromised DNA נוטה להוביל יותר ל־false negatives מאשר ל־false positives [4]. כלומר, הסכנה העיקרית היא לפספס קרוב אמיתי, לאו דווקא לייצר קרוב מדומה.</w:t>
+        <w:t>אחד הלקחים החוזרים כמעט בכל הספרות הוא שפירוק DNA הוא צוואר הבקבוק המרכזי. דה פריס [4] מראים שהשפעתו על kinship classification קשה במיוחד, וש־compromised DNA נוטה להוביל יותר ל־false negatives מאשר ל־false positives [4]. כלומר, הסכנה העיקרית היא לפספס קרוב אמיתי, לאו דווקא לייצר קרוב מדומה.</w:t>
       </w:r>
     </w:p>
     <w:p>
@@ -13368,7 +13507,7 @@
           <w:rFonts w:ascii="Arial" w:hAnsi="Arial" w:cs="Arial"/>
           <w:rtl/>
         </w:rPr>
-        <w:t>פלטפורמת genotyping צפופה המבוססת על hybridization לשבב SNPs, יעילה מאוד ל־high-quality DNA אך רגישה יחסית לדגימות degraded [1], [4].</w:t>
+        <w:t>פלטפורמת genotyping צפופה המבוססת על hybridization לשבב SNPs, יעילה מאוד ל־high-quality DNA אך רגישה יחסית לדגימות מפורקות [1], [4].</w:t>
       </w:r>
     </w:p>
     <w:p>
@@ -13863,7 +14002,7 @@
           <w:rFonts w:ascii="Arial" w:hAnsi="Arial" w:cs="Arial"/>
           <w:rtl/>
         </w:rPr>
-        <w:t>מחקר validation פנימי על ForenSeq Kintelligence לצורכי FGG. המאמר חשוב במיוחד להבנת call rate, heterozygosity, ודגימות low-input או degraded.</w:t>
+        <w:t>מחקר validation פנימי על ForenSeq Kintelligence לצורכי FGG. המאמר חשוב במיוחד להבנת call rate, heterozygosity, ודגימות low-input או מפורקות.</w:t>
       </w:r>
     </w:p>
     <w:p>
@@ -14112,7 +14251,7 @@
           <w:rFonts w:ascii="Arial" w:hAnsi="Arial" w:cs="Arial"/>
           <w:rtl/>
         </w:rPr>
-        <w:t>פרק 10 FIGG כתהליך חקירתי</w:t>
+        <w:t>פרק 10: FIGG כתהליך חקירתי</w:t>
       </w:r>
       <w:bookmarkEnd w:id="chapter_10"/>
     </w:p>
@@ -14321,7 +14460,7 @@
           <w:rFonts w:ascii="Arial" w:hAnsi="Arial" w:cs="Arial"/>
           <w:rtl/>
         </w:rPr>
-        <w:t>Kli21 מדגיש ש־second cousin או קרוב יותר נחשב לעיתים קרובות ל־sweet spot של החקירה, משום שזהו איזון טוב בין שיתוף גנטי מספק לבין עץ משפחה שעדיין ניתן לניהול [1]. עם זאת, גם התאמות רחוקות יותר עשויות להיות שימושיות, במיוחד כאשר יש כמה מהן וכאשר אפשר לחבר ביניהן באמצעות genealogical clustering [1], [3].</w:t>
+        <w:t>קלינג [1] מדגיש ש־second cousin או קרוב יותר נחשב לעיתים קרובות ל־sweet spot של החקירה, משום שזהו איזון טוב בין שיתוף גנטי מספק לבין עץ משפחה שעדיין ניתן לניהול [1]. עם זאת, גם התאמות רחוקות יותר עשויות להיות שימושיות, במיוחד כאשר יש כמה מהן וכאשר אפשר לחבר ביניהן באמצעות genealogical clustering [1], [3].</w:t>
       </w:r>
     </w:p>
     <w:p>
@@ -15475,7 +15614,7 @@
           <w:rFonts w:ascii="Arial" w:hAnsi="Arial" w:cs="Arial"/>
           <w:rtl/>
         </w:rPr>
-        <w:t>להמחיש כיצד עקרונות FIGG נראים בפועל בתוך תיקים אמיתיים [1], [2], [3].</w:t>
+        <w:t>להמחיש כיצד FIGG נראה בתוך תיקים אמיתיים ולא רק כתרשים זרימה מופשט [1], [2], [3].</w:t>
       </w:r>
     </w:p>
     <w:p>
@@ -15489,7 +15628,7 @@
           <w:rFonts w:ascii="Arial" w:hAnsi="Arial" w:cs="Arial"/>
           <w:rtl/>
         </w:rPr>
-        <w:t>להבחין בין סוגי מקרים שונים: תיקי רצח קרים, זיהוי שרידים אנושיים, תיקים היסטוריים ומקרי unknown parentage [1], [4], [5].</w:t>
+        <w:t>להבחין בין כמה סוגי מקרים: רצח קר, זיהוי שרידים, תיק היסטורי, ותיק אזרחי של unknown parentage [1], [2], [4].</w:t>
       </w:r>
     </w:p>
     <w:p>
@@ -15503,7 +15642,7 @@
           <w:rFonts w:ascii="Arial" w:hAnsi="Arial" w:cs="Arial"/>
           <w:rtl/>
         </w:rPr>
-        <w:t>להבין היכן נמצא בפועל צוואר הבקבוק בכל מקרה: במעבדה, במסד הנתונים, באיכות הדנ״א, או בעבודת הגנאלוגיה [6], [7].</w:t>
+        <w:t>להבין שבכל מקרה צוואר הבקבוק נמצא במקום אחר: לעיתים בדנ״א, לעיתים במסד, ולעיתים דווקא בעבודת הגנאלוגיה [5], [6].</w:t>
       </w:r>
     </w:p>
     <w:p>
@@ -15517,7 +15656,76 @@
           <w:rFonts w:ascii="Arial" w:hAnsi="Arial" w:cs="Arial"/>
           <w:rtl/>
         </w:rPr>
-        <w:t>ללמוד כיצד משלבים DNA, genealogy, records, anthropology ונתוני מקרה לכדי זיהוי או lead חקירתי [3], [4].</w:t>
+        <w:t>לראות כיצד SNP data, חיפוש קרובים, בניית עצים, מסמכים היסטוריים ואימות פורנזי מתחברים לפתרון אחד [1], [3].</w:t>
+      </w:r>
+    </w:p>
+    <w:p>
+      <w:pPr>
+        <w:bidi/>
+        <w:pStyle w:val="Heading2"/>
+        <w:jc w:val="right"/>
+      </w:pPr>
+      <w:r/>
+      <w:r>
+        <w:rPr>
+          <w:rFonts w:ascii="Arial" w:hAnsi="Arial" w:cs="Arial"/>
+          <w:rtl/>
+        </w:rPr>
+        <w:t>מבוא</w:t>
+      </w:r>
+    </w:p>
+    <w:p>
+      <w:pPr>
+        <w:bidi/>
+        <w:jc w:val="right"/>
+      </w:pPr>
+      <w:r>
+        <w:rPr>
+          <w:rFonts w:ascii="Arial" w:hAnsi="Arial" w:cs="Arial"/>
+          <w:rtl/>
+        </w:rPr>
+        <w:t>תיאורי המקרה הם המקום שבו מתברר ש־FIGG איננו כלי יחיד אלא שרשרת עבודה. מן הזירה או מן השרידים צריך להפיק DNA usable, להפוך אותו לפרופיל SNP, למצוא קרובים במסד, לבנות עץ משפחה, לצמצם מועמדים, ורק אז להגיע לאימות פורנזי או היסטורי [1], [5].</w:t>
+      </w:r>
+    </w:p>
+    <w:p>
+      <w:pPr>
+        <w:bidi/>
+        <w:jc w:val="right"/>
+      </w:pPr>
+      <w:r>
+        <w:rPr>
+          <w:rFonts w:ascii="Arial" w:hAnsi="Arial" w:cs="Arial"/>
+          <w:rtl/>
+        </w:rPr>
+        <w:t>הערך הפדגוגי של המקרים אינו רק בכך שהם מסתיימים בזיהוי. הם מראים מה עיכב את התיק, מה בדיוק שבר את המבוי הסתום, ואילו סוגי ראיות נשארו הכרחיים גם אחרי שהגנאלוגיה סיפקה lead [3], [6].</w:t>
+      </w:r>
+    </w:p>
+    <w:p>
+      <w:pPr>
+        <w:bidi/>
+        <w:pStyle w:val="Heading2"/>
+        <w:jc w:val="right"/>
+      </w:pPr>
+      <w:r/>
+      <w:r>
+        <w:rPr>
+          <w:rFonts w:ascii="Arial" w:hAnsi="Arial" w:cs="Arial"/>
+          <w:rtl/>
+        </w:rPr>
+        <w:t>איך לקרוא תיאור מקרה</w:t>
+      </w:r>
+    </w:p>
+    <w:p>
+      <w:pPr>
+        <w:bidi/>
+        <w:jc w:val="right"/>
+      </w:pPr>
+      <w:r>
+        <w:rPr>
+          <w:rFonts w:ascii="Arial" w:hAnsi="Arial" w:cs="Arial"/>
+          <w:rtl/>
+        </w:rPr>
+        <w:t>בקריאה של case study כדאי לשאול חמש שאלות:</w:t>
       </w:r>
     </w:p>
     <w:p>
@@ -15531,7 +15739,76 @@
           <w:rFonts w:ascii="Arial" w:hAnsi="Arial" w:cs="Arial"/>
           <w:rtl/>
         </w:rPr>
-        <w:t>לפתח קריאה ביקורתית של תיאורי מקרה, כולל זיהוי תנאים שאפשרו הצלחה ותנאים שהגבילו אותה [6], [8].</w:t>
+        <w:t>מהו האירוע ומה הייתה נקודת הפתיחה של החוקרים</w:t>
+      </w:r>
+    </w:p>
+    <w:p>
+      <w:pPr>
+        <w:bidi/>
+        <w:pStyle w:val="ListBullet"/>
+        <w:jc w:val="right"/>
+      </w:pPr>
+      <w:r>
+        <w:rPr>
+          <w:rFonts w:ascii="Arial" w:hAnsi="Arial" w:cs="Arial"/>
+          <w:rtl/>
+        </w:rPr>
+        <w:t>איזה חומר ביולוגי עמד לרשותם</w:t>
+      </w:r>
+    </w:p>
+    <w:p>
+      <w:pPr>
+        <w:bidi/>
+        <w:pStyle w:val="ListBullet"/>
+        <w:jc w:val="right"/>
+      </w:pPr>
+      <w:r>
+        <w:rPr>
+          <w:rFonts w:ascii="Arial" w:hAnsi="Arial" w:cs="Arial"/>
+          <w:rtl/>
+        </w:rPr>
+        <w:t>מה היה החסם המרכזי לאורך שנים</w:t>
+      </w:r>
+    </w:p>
+    <w:p>
+      <w:pPr>
+        <w:bidi/>
+        <w:pStyle w:val="ListBullet"/>
+        <w:jc w:val="right"/>
+      </w:pPr>
+      <w:r>
+        <w:rPr>
+          <w:rFonts w:ascii="Arial" w:hAnsi="Arial" w:cs="Arial"/>
+          <w:rtl/>
+        </w:rPr>
+        <w:t>איזה מסלול FIGG הופעל בפועל</w:t>
+      </w:r>
+    </w:p>
+    <w:p>
+      <w:pPr>
+        <w:bidi/>
+        <w:pStyle w:val="ListBullet"/>
+        <w:jc w:val="right"/>
+      </w:pPr>
+      <w:r>
+        <w:rPr>
+          <w:rFonts w:ascii="Arial" w:hAnsi="Arial" w:cs="Arial"/>
+          <w:rtl/>
+        </w:rPr>
+        <w:t>איך נעשה האימות הסופי</w:t>
+      </w:r>
+    </w:p>
+    <w:p>
+      <w:pPr>
+        <w:bidi/>
+        <w:jc w:val="right"/>
+      </w:pPr>
+      <w:r>
+        <w:rPr>
+          <w:rFonts w:ascii="Arial" w:hAnsi="Arial" w:cs="Arial"/>
+          <w:rtl/>
+        </w:rPr>
+        <w:t>כאשר משווים מקרים לפי חמש השאלות הללו, קל יותר להבין מה באמת פתר את התיק ומה היה רק תנאי רקע [1], [5].</w:t>
       </w:r>
     </w:p>
     <w:p>
@@ -15546,33 +15823,131 @@
           <w:rFonts w:ascii="Arial" w:hAnsi="Arial" w:cs="Arial"/>
           <w:rtl/>
         </w:rPr>
-        <w:t>מבוא</w:t>
-      </w:r>
-    </w:p>
-    <w:p>
-      <w:pPr>
-        <w:bidi/>
-        <w:jc w:val="right"/>
-      </w:pPr>
-      <w:r>
-        <w:rPr>
-          <w:rFonts w:ascii="Arial" w:hAnsi="Arial" w:cs="Arial"/>
-          <w:rtl/>
-        </w:rPr>
-        <w:t>לאחר בניית היסודות המדעיים, הטכנולוגיים והחקירתיים של FIGG, תיאורי מקרה הם המקום שבו כל הרכיבים מתחברים. זהו השלב שבו אפשר לראות כיצד איכות הדנ״א, רשימת ההתאמות, בניית העץ, ההקשר ההיסטורי ופרטי המקרה משתלבים לכדי הצלחה, כישלון או פתרון חלקי [1], [6].</w:t>
-      </w:r>
-    </w:p>
-    <w:p>
-      <w:pPr>
-        <w:bidi/>
-        <w:jc w:val="right"/>
-      </w:pPr>
-      <w:r>
-        <w:rPr>
-          <w:rFonts w:ascii="Arial" w:hAnsi="Arial" w:cs="Arial"/>
-          <w:rtl/>
-        </w:rPr>
-        <w:t>מבחינה דידקטית, תיאורי מקרה אינם רק המחשה. הם גם דרך להראות לסטודנטים שהשיטה אינה פועלת כמתכון קבוע. בכל תיק משתנה האיזון בין איכות המעבדה, היקף המסד, מבנה האוכלוסייה, נגישות הרשומות, והיקף העבודה הגנאלוגית [3], [8].</w:t>
+        <w:t>מקרה 1</w:t>
+      </w:r>
+    </w:p>
+    <w:p>
+      <w:pPr>
+        <w:bidi/>
+        <w:pStyle w:val="Heading3"/>
+        <w:jc w:val="right"/>
+      </w:pPr>
+      <w:r/>
+      <w:r>
+        <w:rPr>
+          <w:rFonts w:ascii="Arial" w:hAnsi="Arial" w:cs="Arial"/>
+          <w:rtl/>
+        </w:rPr>
+        <w:t>רצח כפול בלינשפינג, שוודיה</w:t>
+      </w:r>
+    </w:p>
+    <w:p>
+      <w:pPr>
+        <w:bidi/>
+        <w:jc w:val="right"/>
+      </w:pPr>
+      <w:r>
+        <w:rPr>
+          <w:rFonts w:ascii="Arial" w:hAnsi="Arial" w:cs="Arial"/>
+          <w:rtl/>
+        </w:rPr>
+        <w:t>ב־19 באוקטובר 2004 נרצחו ברחוב פתוח בלינשפינג ילד בן שמונה ואישה בת 56 בהתקפת דקירה אקראית לכאורה [1]. התוקף נמלט והותיר בזירה סכין מסוג butterfly knife וכובע סרוג. המקרה הפך לאחת החקירות הגדולות בשוודיה: יותר מ־9,000 תשאולים ויותר מ־6,000 דגימות DNA נבדקו, אך במשך 15 שנה לא נמצא חשוד [1].</w:t>
+      </w:r>
+    </w:p>
+    <w:p>
+      <w:pPr>
+        <w:bidi/>
+        <w:jc w:val="right"/>
+      </w:pPr>
+      <w:r>
+        <w:rPr>
+          <w:rFonts w:ascii="Arial" w:hAnsi="Arial" w:cs="Arial"/>
+          <w:rtl/>
+        </w:rPr>
+        <w:t>למרות שהיה DNA של גבר לא מזוהה, החקירה נתקעה משום שלא היה התאמה במאגרי ה־STR המשטרתיים בשוודיה או במאגרים האירופיים, והמידע על מוצא צפון־אירופי רק סייע לתעדוף כללי ולא לזיהוי ישיר [1]. במילים אחרות, היה חומר ביולוגי טוב דיו כדי לדעת שיש תורם לא מזוהה, אך לא די כדי להפוך אותו לשם [1].</w:t>
+      </w:r>
+    </w:p>
+    <w:p>
+      <w:pPr>
+        <w:bidi/>
+        <w:jc w:val="right"/>
+      </w:pPr>
+      <w:r>
+        <w:rPr>
+          <w:rFonts w:ascii="Arial" w:hAnsi="Arial" w:cs="Arial"/>
+          <w:rtl/>
+        </w:rPr>
+        <w:t>כאן נכנס FIGG. בגלל כמות נמוכה ודגרדציה של הדנ״א, בוצעו כמה סבבי whole-genome sequencing, ורק בספרייה השלישית הושג כיסוי עמוק דיו כדי להפיק פרופיל usable [1]. לאחר imputation הורחב מערך הנתונים מכ־155 אלף SNPs לכ־6 מיליון SNPs, והפרופיל הועלה ל־GEDmatch ול־FamilyTreeDNA [1]. החיפושים המוקדמים החזירו רק קרובים רחוקים מאוד, אך לאחר שיפור הנתונים התקבלו התאמות של כ־60 עד 100 cM, שמהן נבנו עצי משפחה עד אבות משותפים מן המאה ה־18 [1].</w:t>
+      </w:r>
+    </w:p>
+    <w:p>
+      <w:pPr>
+        <w:bidi/>
+        <w:jc w:val="right"/>
+      </w:pPr>
+      <w:r>
+        <w:rPr>
+          <w:rFonts w:ascii="Arial" w:hAnsi="Arial" w:cs="Arial"/>
+          <w:rtl/>
+        </w:rPr>
+        <w:t>השלב המכריע לא היה עוד מעבדה אלא גנאלוגיה. לאחר בדיקות התנדבותיות של 15 קרובי משפחה אפשריים התקבלה התאמה של 347 cM, והחיפוש הצטמצם לשני אחים [1]. דגימות לחי משני האחים הושוו לדגימות הזירה באמצעות STR רגיל, אחד מהם זוהה כתורם, הודה במעשה והורשע [1].</w:t>
+      </w:r>
+    </w:p>
+    <w:p>
+      <w:pPr>
+        <w:bidi/>
+        <w:pStyle w:val="Heading3"/>
+        <w:jc w:val="right"/>
+      </w:pPr>
+      <w:r/>
+      <w:r>
+        <w:rPr>
+          <w:rFonts w:ascii="Arial" w:hAnsi="Arial" w:cs="Arial"/>
+          <w:rtl/>
+        </w:rPr>
+        <w:t>מה המקרה מלמד</w:t>
+      </w:r>
+    </w:p>
+    <w:p>
+      <w:pPr>
+        <w:bidi/>
+        <w:pStyle w:val="ListBullet"/>
+        <w:jc w:val="right"/>
+      </w:pPr>
+      <w:r>
+        <w:rPr>
+          <w:rFonts w:ascii="Arial" w:hAnsi="Arial" w:cs="Arial"/>
+          <w:rtl/>
+        </w:rPr>
+        <w:t>גם בתיק עם DNA מזירה, מסדי ה־STR הרגילים עלולים לא להספיק [1].</w:t>
+      </w:r>
+    </w:p>
+    <w:p>
+      <w:pPr>
+        <w:bidi/>
+        <w:pStyle w:val="ListBullet"/>
+        <w:jc w:val="right"/>
+      </w:pPr>
+      <w:r>
+        <w:rPr>
+          <w:rFonts w:ascii="Arial" w:hAnsi="Arial" w:cs="Arial"/>
+          <w:rtl/>
+        </w:rPr>
+        <w:t>התאמות רחוקות יחסית עשויות להספיק כאשר העץ נבנה היטב [1].</w:t>
+      </w:r>
+    </w:p>
+    <w:p>
+      <w:pPr>
+        <w:bidi/>
+        <w:pStyle w:val="ListBullet"/>
+        <w:jc w:val="right"/>
+      </w:pPr>
+      <w:r>
+        <w:rPr>
+          <w:rFonts w:ascii="Arial" w:hAnsi="Arial" w:cs="Arial"/>
+          <w:rtl/>
+        </w:rPr>
+        <w:t>ה־IGG סיפק lead, אבל ההרשעה נשענה על אימות STR ישיר [1], [5].</w:t>
       </w:r>
     </w:p>
     <w:p>
@@ -15587,20 +15962,76 @@
           <w:rFonts w:ascii="Arial" w:hAnsi="Arial" w:cs="Arial"/>
           <w:rtl/>
         </w:rPr>
-        <w:t>איך לקרוא תיאור מקרה</w:t>
-      </w:r>
-    </w:p>
-    <w:p>
-      <w:pPr>
-        <w:bidi/>
-        <w:jc w:val="right"/>
-      </w:pPr>
-      <w:r>
-        <w:rPr>
-          <w:rFonts w:ascii="Arial" w:hAnsi="Arial" w:cs="Arial"/>
-          <w:rtl/>
-        </w:rPr>
-        <w:t>בקריאת case study של FIGG יש לשאול חמש שאלות בסיסיות:</w:t>
+        <w:t>מקרה 2</w:t>
+      </w:r>
+    </w:p>
+    <w:p>
+      <w:pPr>
+        <w:bidi/>
+        <w:pStyle w:val="Heading3"/>
+        <w:jc w:val="right"/>
+      </w:pPr>
+      <w:r/>
+      <w:r>
+        <w:rPr>
+          <w:rFonts w:ascii="Arial" w:hAnsi="Arial" w:cs="Arial"/>
+          <w:rtl/>
+        </w:rPr>
+        <w:t>Ekeby man וזיהוי שרידים באמצעות WGS</w:t>
+      </w:r>
+    </w:p>
+    <w:p>
+      <w:pPr>
+        <w:bidi/>
+        <w:jc w:val="right"/>
+      </w:pPr>
+      <w:r>
+        <w:rPr>
+          <w:rFonts w:ascii="Arial" w:hAnsi="Arial" w:cs="Arial"/>
+          <w:rtl/>
+        </w:rPr>
+        <w:t>במקרה זה נקודת הפתיחה לא הייתה חשוד אלא אדם לא מזוהה שנמצא נרצח בדרום שוודיה בשנת 2003 [2]. החומר הביולוגי המרכזי היה דגימת עצם, ולכן הבעיה לא הייתה תחילה “מי האיש” אלא “האם אפשר בכלל להפיק מן העצם פרופיל SNP רחב מספיק לחיפוש גנאלוגי” [2].</w:t>
+      </w:r>
+    </w:p>
+    <w:p>
+      <w:pPr>
+        <w:bidi/>
+        <w:jc w:val="right"/>
+      </w:pPr>
+      <w:r>
+        <w:rPr>
+          <w:rFonts w:ascii="Arial" w:hAnsi="Arial" w:cs="Arial"/>
+          <w:rtl/>
+        </w:rPr>
+        <w:t>המאמר מתאר בפירוט רב יותר את המסלול המעבדתי מאשר את סיפור הרצח עצמו, ולכן ערכו הדידקטי המרכזי הוא בהמחשת המעבר משריד בעייתי לנתון גנומי usable [2]. בוצע whole-genome sequencing על DNA שמוצה מן העצם, הוכנו שלוש ספריות, ולאחר mapping, filtering והתאמה לאתרי המסד הופקו גנוטיפים עבור כ־מיליון SNPs [2].</w:t>
+      </w:r>
+    </w:p>
+    <w:p>
+      <w:pPr>
+        <w:bidi/>
+        <w:jc w:val="right"/>
+      </w:pPr>
+      <w:r>
+        <w:rPr>
+          <w:rFonts w:ascii="Arial" w:hAnsi="Arial" w:cs="Arial"/>
+          <w:rtl/>
+        </w:rPr>
+        <w:t>הפרופיל הועלה ל־GEDmatch, התקבלה רשימת קרובים אפשריים, וממנה הופק lead גנאלוגי לגבי זהות הקורבן [2]. זהו מקרה חשוב במיוחד משום שהוא מראה שזיהוי שרידים מתחיל לעיתים הרבה לפני בניית העץ: אם אי אפשר לייצר פרופיל רחב, כלל לא מגיעים לשלב הגנאלוגי [2].</w:t>
+      </w:r>
+    </w:p>
+    <w:p>
+      <w:pPr>
+        <w:bidi/>
+        <w:pStyle w:val="Heading3"/>
+        <w:jc w:val="right"/>
+      </w:pPr>
+      <w:r/>
+      <w:r>
+        <w:rPr>
+          <w:rFonts w:ascii="Arial" w:hAnsi="Arial" w:cs="Arial"/>
+          <w:rtl/>
+        </w:rPr>
+        <w:t>מה המקרה מלמד</w:t>
       </w:r>
     </w:p>
     <w:p>
@@ -15614,7 +16045,7 @@
           <w:rFonts w:ascii="Arial" w:hAnsi="Arial" w:cs="Arial"/>
           <w:rtl/>
         </w:rPr>
-        <w:t>מה היה סוג הדגימה ומה הייתה איכות ה־DNA</w:t>
+        <w:t>בזיהוי שרידים, ההצלחה תלויה פעמים רבות קודם כול באיכות ההפקה מן העצם [2].</w:t>
       </w:r>
     </w:p>
     <w:p>
@@ -15628,7 +16059,7 @@
           <w:rFonts w:ascii="Arial" w:hAnsi="Arial" w:cs="Arial"/>
           <w:rtl/>
         </w:rPr>
-        <w:t>איזה מסלול טכנולוגי נדרש כדי לייצר פרופיל SNP</w:t>
+        <w:t>WGS יכול להפוך דגימה פורנזית קשה לפרופיל המתאים למסדי genealogy [2].</w:t>
       </w:r>
     </w:p>
     <w:p>
@@ -15642,7 +16073,149 @@
           <w:rFonts w:ascii="Arial" w:hAnsi="Arial" w:cs="Arial"/>
           <w:rtl/>
         </w:rPr>
-        <w:t>אילו התאמות התקבלו במסד ובאיזו דרגת קרבה משוערת</w:t>
+        <w:t>בתיקי UHR, ה־FIGG נועד קודם כול לייצר זהות או lead לזהות, לאו דווקא לזהות תוקף [2], [7].</w:t>
+      </w:r>
+    </w:p>
+    <w:p>
+      <w:pPr>
+        <w:bidi/>
+        <w:pStyle w:val="Heading2"/>
+        <w:jc w:val="right"/>
+      </w:pPr>
+      <w:r/>
+      <w:r>
+        <w:rPr>
+          <w:rFonts w:ascii="Arial" w:hAnsi="Arial" w:cs="Arial"/>
+          <w:rtl/>
+        </w:rPr>
+        <w:t>מקרה 3</w:t>
+      </w:r>
+    </w:p>
+    <w:p>
+      <w:pPr>
+        <w:bidi/>
+        <w:pStyle w:val="Heading3"/>
+        <w:jc w:val="right"/>
+      </w:pPr>
+      <w:r/>
+      <w:r>
+        <w:rPr>
+          <w:rFonts w:ascii="Arial" w:hAnsi="Arial" w:cs="Arial"/>
+          <w:rtl/>
+        </w:rPr>
+        <w:t>שלושה תיקים קרים בנורווגיה</w:t>
+      </w:r>
+    </w:p>
+    <w:p>
+      <w:pPr>
+        <w:bidi/>
+        <w:jc w:val="right"/>
+      </w:pPr>
+      <w:r>
+        <w:rPr>
+          <w:rFonts w:ascii="Arial" w:hAnsi="Arial" w:cs="Arial"/>
+          <w:rtl/>
+        </w:rPr>
+        <w:t>המאמר הנורווגי חשוב במיוחד מפני שהוא אינו מציג רק הצלחה אחת דרמטית אלא שלושה תיקים שונים עם תוצאות שונות [6]. כך מתקבלת תמונה מציאותית יותר של FIGG: לפעמים הוא פותר, לפעמים רק מצמצם, ולפעמים נעצר מוקדם.</w:t>
+      </w:r>
+    </w:p>
+    <w:p>
+      <w:pPr>
+        <w:bidi/>
+        <w:pStyle w:val="Heading3"/>
+        <w:jc w:val="right"/>
+      </w:pPr>
+      <w:r/>
+      <w:r>
+        <w:rPr>
+          <w:rFonts w:ascii="Arial" w:hAnsi="Arial" w:cs="Arial"/>
+          <w:rtl/>
+        </w:rPr>
+        <w:t>תיק 1</w:t>
+      </w:r>
+    </w:p>
+    <w:p>
+      <w:pPr>
+        <w:bidi/>
+        <w:jc w:val="right"/>
+      </w:pPr>
+      <w:r>
+        <w:rPr>
+          <w:rFonts w:ascii="Arial" w:hAnsi="Arial" w:cs="Arial"/>
+          <w:rtl/>
+        </w:rPr>
+        <w:t>בשני מקרי אונס שבוצעו בפרק זמן קצר בידי אותו עבריין, הייתה בידי החוקרים דגימת זרע, אך החיפוש הגנאלוגי לא הבשיל לפתרון [6]. בוצעו extraction, WGS, יצירת פרופיל SNP וחיפושים ב־GEDmatch Pro וב־FamilyTreeDNA, אך התקבלו רק התאמות פריפריאליות של קרובים רחוקים מאוד [6]. המחברים מייחסים את הכישלון המעשי להטרוזיגוטיות גבוהה, אורך מקטעים קצר ותמונה גנטית מורכבת ומעורבת, ולכן כלל לא בוצעה עבודת genealogy מלאה [6].</w:t>
+      </w:r>
+    </w:p>
+    <w:p>
+      <w:pPr>
+        <w:bidi/>
+        <w:pStyle w:val="Heading3"/>
+        <w:jc w:val="right"/>
+      </w:pPr>
+      <w:r/>
+      <w:r>
+        <w:rPr>
+          <w:rFonts w:ascii="Arial" w:hAnsi="Arial" w:cs="Arial"/>
+          <w:rtl/>
+        </w:rPr>
+        <w:t>תיק 2</w:t>
+      </w:r>
+    </w:p>
+    <w:p>
+      <w:pPr>
+        <w:bidi/>
+        <w:jc w:val="right"/>
+      </w:pPr>
+      <w:r>
+        <w:rPr>
+          <w:rFonts w:ascii="Arial" w:hAnsi="Arial" w:cs="Arial"/>
+          <w:rtl/>
+        </w:rPr>
+        <w:t>בתיק אונס של צעירה במסיבת סיום תיכון עמד לרשות החוקרים כתם זרע באיכות טובה יותר [6]. כאן כבר התקבלה התאמה של 236 cM ב־GEDmatch Pro, ובשילוב עם חיזוי פנוטיפי והערכה של admixture מרכז־אירופי בכ־15% נבנה עץ משפחה סביב אב קדמון משותף [6]. מן העץ ירדו החוקרים קדימה אל הצאצאים, צמצמו מועמדים, ואימתו באמצעות STR חשוד שגר פחות מעשרה קילומטרים מזירת העבירה [6].</w:t>
+      </w:r>
+    </w:p>
+    <w:p>
+      <w:pPr>
+        <w:bidi/>
+        <w:pStyle w:val="Heading3"/>
+        <w:jc w:val="right"/>
+      </w:pPr>
+      <w:r/>
+      <w:r>
+        <w:rPr>
+          <w:rFonts w:ascii="Arial" w:hAnsi="Arial" w:cs="Arial"/>
+          <w:rtl/>
+        </w:rPr>
+        <w:t>תיק 3</w:t>
+      </w:r>
+    </w:p>
+    <w:p>
+      <w:pPr>
+        <w:bidi/>
+        <w:jc w:val="right"/>
+      </w:pPr>
+      <w:r>
+        <w:rPr>
+          <w:rFonts w:ascii="Arial" w:hAnsi="Arial" w:cs="Arial"/>
+          <w:rtl/>
+        </w:rPr>
+        <w:t>בפרשת הרצח של Knut Kristiansen באוסלו בשנת 1999, דגימת המוצא הייתה דלה עוד יותר, פריט אפיתליאלי עם ריכוז DNA נמוך [6]. למרות זאת, נמצא לבסוף hit של 87 cM מאזרח אמריקאי ממוצא נורווגי, ומכאן החלה עבודת genealogy ארוכה במיוחד [6]. החוקרים השקיעו בין 2,000 ל־3,000 שעות, כולל בדיקות התנדבותיות של קרובים מענפים שונים, עד שהגיעו למועמד שכבר נפטר [6]. פרופיל STR שמור ברישומי המשטרה הושווה לדגימת המקרה ואישר את הזיהוי [6].</w:t>
+      </w:r>
+    </w:p>
+    <w:p>
+      <w:pPr>
+        <w:bidi/>
+        <w:pStyle w:val="Heading3"/>
+        <w:jc w:val="right"/>
+      </w:pPr>
+      <w:r/>
+      <w:r>
+        <w:rPr>
+          <w:rFonts w:ascii="Arial" w:hAnsi="Arial" w:cs="Arial"/>
+          <w:rtl/>
+        </w:rPr>
+        <w:t>מה המקרים מלמדים</w:t>
       </w:r>
     </w:p>
     <w:p>
@@ -15656,7 +16229,7 @@
           <w:rFonts w:ascii="Arial" w:hAnsi="Arial" w:cs="Arial"/>
           <w:rtl/>
         </w:rPr>
-        <w:t>מה היה מהלך ה־genealogy שהוביל לצמצום מועמדים</w:t>
+        <w:t>FIGG אינו מסלול עם תפוקה אחידה; גם בתוך אותו צוות ובאותו workflow מתקבלים כישלון, הצלחה מהירה יחסית והצלחה עתירת עבודה [6].</w:t>
       </w:r>
     </w:p>
     <w:p>
@@ -15670,20 +16243,21 @@
           <w:rFonts w:ascii="Arial" w:hAnsi="Arial" w:cs="Arial"/>
           <w:rtl/>
         </w:rPr>
-        <w:t>כיצד בוצע האימות הסופי</w:t>
-      </w:r>
-    </w:p>
-    <w:p>
-      <w:pPr>
-        <w:bidi/>
-        <w:jc w:val="right"/>
-      </w:pPr>
-      <w:r>
-        <w:rPr>
-          <w:rFonts w:ascii="Arial" w:hAnsi="Arial" w:cs="Arial"/>
-          <w:rtl/>
-        </w:rPr>
-        <w:t>כאשר שואלים את חמש השאלות האלה באופן שיטתי, קל יותר להשוות בין מקרים שונים ולזהות מה בדיוק תרם לפתרון [1], [2], [6].</w:t>
+        <w:t>פנוטיפינג ו־admixture יכולים לעזור לצמצם ענפים רלוונטיים בעץ [6].</w:t>
+      </w:r>
+    </w:p>
+    <w:p>
+      <w:pPr>
+        <w:bidi/>
+        <w:pStyle w:val="ListBullet"/>
+        <w:jc w:val="right"/>
+      </w:pPr>
+      <w:r>
+        <w:rPr>
+          <w:rFonts w:ascii="Arial" w:hAnsi="Arial" w:cs="Arial"/>
+          <w:rtl/>
+        </w:rPr>
+        <w:t>לפעמים עיקר הזמן אינו מושקע בריצוף אלא באלפי שעות של genealogy ובדיקות ממוקדות [5], [6].</w:t>
       </w:r>
     </w:p>
     <w:p>
@@ -15698,7 +16272,7 @@
           <w:rFonts w:ascii="Arial" w:hAnsi="Arial" w:cs="Arial"/>
           <w:rtl/>
         </w:rPr>
-        <w:t>מקרה 1</w:t>
+        <w:t>מקרה 4</w:t>
       </w:r>
     </w:p>
     <w:p>
@@ -15713,46 +16287,59 @@
           <w:rFonts w:ascii="Arial" w:hAnsi="Arial" w:cs="Arial"/>
           <w:rtl/>
         </w:rPr>
-        <w:t>רצח כפול בלינשפינג, שוודיה</w:t>
-      </w:r>
-    </w:p>
-    <w:p>
-      <w:pPr>
-        <w:bidi/>
-        <w:jc w:val="right"/>
-      </w:pPr>
-      <w:r>
-        <w:rPr>
-          <w:rFonts w:ascii="Arial" w:hAnsi="Arial" w:cs="Arial"/>
-          <w:rtl/>
-        </w:rPr>
-        <w:t>המקרה של Linköping נחשב לאחד מתיאורי המקרה האירופיים החשובים ביותר של IGG בתיק פלילי. שני קורבנות נרצחו בשנת 2004, והעבריין הותיר DNA בזירה. במשך 15 שנה לא עלה בידי החקירה לזהות אותו, למרות אלפי חקירות ותוכנית סקר DNA רחבה מאוד [1].</w:t>
-      </w:r>
-    </w:p>
-    <w:p>
-      <w:pPr>
-        <w:bidi/>
-        <w:jc w:val="right"/>
-      </w:pPr>
-      <w:r>
-        <w:rPr>
-          <w:rFonts w:ascii="Arial" w:hAnsi="Arial" w:cs="Arial"/>
-          <w:rtl/>
-        </w:rPr>
-        <w:t>החידוש במקרה זה לא היה רק השימוש ב־IGG, אלא גם ההתמודדות עם DNA באיכות וכמות נמוכות. לפי Til21, נדרשו whole-genome sequencing, מאמצי genotype imputation ועיבוד חוזר כדי להפיק datasets usable לחיפוש גם ב־GEDmatch וגם ב־FamilyTreeDNA [1].</w:t>
-      </w:r>
-    </w:p>
-    <w:p>
-      <w:pPr>
-        <w:bidi/>
-        <w:jc w:val="right"/>
-      </w:pPr>
-      <w:r>
-        <w:rPr>
-          <w:rFonts w:ascii="Arial" w:hAnsi="Arial" w:cs="Arial"/>
-          <w:rtl/>
-        </w:rPr>
-        <w:t>מן ההתאמות שהתקבלו נבנו עצי משפחה, ובסופו של דבר צומצם החיפוש לשני אחים. אחד מהם אומת מול דגימות הזירה באמצעות STR profiling רגיל, הודה במעשים, ולבסוף הורשע [1].</w:t>
+        <w:t>זיהוי קורבן רצח בן יותר ממאה שנה</w:t>
+      </w:r>
+    </w:p>
+    <w:p>
+      <w:pPr>
+        <w:bidi/>
+        <w:jc w:val="right"/>
+      </w:pPr>
+      <w:r>
+        <w:rPr>
+          <w:rFonts w:ascii="Arial" w:hAnsi="Arial" w:cs="Arial"/>
+          <w:rtl/>
+        </w:rPr>
+        <w:t>במקרה זה הרקע הסיפורי כמעט חריג בעוצמתו. בשנת 1916 נרצחה באיידהו אגנס לאבלס בגרזן, ובעלה, שהשתמש בשם Walt Cairns, נעצר אך נמלט מן הכלא ב־18 במאי 1916 ומאז נעלם [3]. עשרות שנים לאחר מכן, בשנת 1979, נמצאה במערת לבה באיידהו גוויה ממומיפיקת חלקית ללא ראש בתוך שק יוטה [3]. בשנת 1991 נמצאו גם הגפיים, אך הגולגולת לא אותרה מעולם [3].</w:t>
+      </w:r>
+    </w:p>
+    <w:p>
+      <w:pPr>
+        <w:bidi/>
+        <w:jc w:val="right"/>
+      </w:pPr>
+      <w:r>
+        <w:rPr>
+          <w:rFonts w:ascii="Arial" w:hAnsi="Arial" w:cs="Arial"/>
+          <w:rtl/>
+        </w:rPr>
+        <w:t>הזיהוי התעכב יותר מארבעה עשורים משום שהסביבה הקרירה של המערה שימרה את הגוף היטב וגרמה להערכת זמן מוות שגויה מאוד: במקום כ־63 שנים, בתחילה סברו שמדובר בחודשים עד שנים בודדות [3]. היעדר הגולגולת והשיניים מנע זיהוי דנטלי רגיל, והקורבן מת הרבה לפני עידן מאגרי טביעות אצבע ו־DNA מודרניים [3].</w:t>
+      </w:r>
+    </w:p>
+    <w:p>
+      <w:pPr>
+        <w:bidi/>
+        <w:jc w:val="right"/>
+      </w:pPr>
+      <w:r>
+        <w:rPr>
+          <w:rFonts w:ascii="Arial" w:hAnsi="Arial" w:cs="Arial"/>
+          <w:rtl/>
+        </w:rPr>
+        <w:t>במקרה הזה האנתרופולוגיה והגנאלוגיה השלימו זו את זו. האנתרופולוגים בנו biological profile וניתחו את הדיסממברמנט והטראומה, בעוד שעבודת הגנאלוגיה על DNA מן הטיביה הובילה לעץ של יותר מ־31,000 אנשים לאחר כ־2,000 שעות מחקר [3]. העבודה הייתה קשה במיוחד בגלל endogamy, polygamy, שימוש בכמה aliases ושגיאה ברשומה היסטורית שגרמה תחילה לחוקרים לחשוב שיוסף הנרי לאבלס כבר תועד כמת [3].</w:t>
+      </w:r>
+    </w:p>
+    <w:p>
+      <w:pPr>
+        <w:bidi/>
+        <w:jc w:val="right"/>
+      </w:pPr>
+      <w:r>
+        <w:rPr>
+          <w:rFonts w:ascii="Arial" w:hAnsi="Arial" w:cs="Arial"/>
+          <w:rtl/>
+        </w:rPr>
+        <w:t>הפריצה באה כאשר חיפוש Y-DNA כיוון אל שושלת Loveless, ולאחר מכן אותר poster היסטורי שחיבר בין הכינוי Walt Cairns ובין רצח אגנס לאבלס [3]. לבסוף אותר נכד בן 87, ובדיקת הקרבה אישרה שהשרידים שייכים ליוסף הנרי לאבלס [3]. זהו מקרה שבו הזיהוי לא נשען על מסלול פורנזי אחד, אלא על חיבור בין עצמות, מסמכים, גנאלוגיה והיסטוריה [3].</w:t>
       </w:r>
     </w:p>
     <w:p>
@@ -15767,20 +16354,7 @@
           <w:rFonts w:ascii="Arial" w:hAnsi="Arial" w:cs="Arial"/>
           <w:rtl/>
         </w:rPr>
-        <w:t>הערך הדידקטי של המקרה</w:t>
-      </w:r>
-    </w:p>
-    <w:p>
-      <w:pPr>
-        <w:bidi/>
-        <w:jc w:val="right"/>
-      </w:pPr>
-      <w:r>
-        <w:rPr>
-          <w:rFonts w:ascii="Arial" w:hAnsi="Arial" w:cs="Arial"/>
-          <w:rtl/>
-        </w:rPr>
-        <w:t>זהו מקרה מצוין להמחשת כמה עקרונות יחד:</w:t>
+        <w:t>מה המקרה מלמד</w:t>
       </w:r>
     </w:p>
     <w:p>
@@ -15794,7 +16368,7 @@
           <w:rFonts w:ascii="Arial" w:hAnsi="Arial" w:cs="Arial"/>
           <w:rtl/>
         </w:rPr>
-        <w:t>דגימה פורנזית קשה אינה מונעת בהכרח FIGG, אך מחייבת מסלול מעבדתי מורכב</w:t>
+        <w:t>בתיקים היסטוריים, הבעיה אינה רק גנטית אלא גם תיעודית [3].</w:t>
       </w:r>
     </w:p>
     <w:p>
@@ -15808,7 +16382,7 @@
           <w:rFonts w:ascii="Arial" w:hAnsi="Arial" w:cs="Arial"/>
           <w:rtl/>
         </w:rPr>
-        <w:t>התאמות רחוקות יכולות להספיק כאשר genealogy איכותי מצמצם היטב את העץ</w:t>
+        <w:t>endogamy, aliases ורישומים שגויים יכולים לעכב את החקירה לא פחות מדגימה קשה [3].</w:t>
       </w:r>
     </w:p>
     <w:p>
@@ -15822,20 +16396,7 @@
           <w:rFonts w:ascii="Arial" w:hAnsi="Arial" w:cs="Arial"/>
           <w:rtl/>
         </w:rPr>
-        <w:t>האימות הסופי נותר STR פורנזי רגיל, לא ה־IGG עצמו</w:t>
-      </w:r>
-    </w:p>
-    <w:p>
-      <w:pPr>
-        <w:bidi/>
-        <w:jc w:val="right"/>
-      </w:pPr>
-      <w:r>
-        <w:rPr>
-          <w:rFonts w:ascii="Arial" w:hAnsi="Arial" w:cs="Arial"/>
-          <w:rtl/>
-        </w:rPr>
-        <w:t>זהו גם מקרה שמראה בבירור את המעבר מפרופיל SNP אל lead חקירתי, ולאחר מכן לאימות פלילי ישיר [1].</w:t>
+        <w:t>לעיתים הראיה המכרעת היא חיבור בין DNA לבין מסמך היסטורי מתאים, ולא רק hit במסד [3].</w:t>
       </w:r>
     </w:p>
     <w:p>
@@ -15850,7 +16411,7 @@
           <w:rFonts w:ascii="Arial" w:hAnsi="Arial" w:cs="Arial"/>
           <w:rtl/>
         </w:rPr>
-        <w:t>מקרה 2</w:t>
+        <w:t>מקרה 5</w:t>
       </w:r>
     </w:p>
     <w:p>
@@ -15865,33 +16426,46 @@
           <w:rFonts w:ascii="Arial" w:hAnsi="Arial" w:cs="Arial"/>
           <w:rtl/>
         </w:rPr>
-        <w:t>Ekeby man וזיהוי שרידים באמצעות WGS</w:t>
-      </w:r>
-    </w:p>
-    <w:p>
-      <w:pPr>
-        <w:bidi/>
-        <w:jc w:val="right"/>
-      </w:pPr>
-      <w:r>
-        <w:rPr>
-          <w:rFonts w:ascii="Arial" w:hAnsi="Arial" w:cs="Arial"/>
-          <w:rtl/>
-        </w:rPr>
-        <w:t>המקרה של Ekeby man הוא מקרה מפתח להבנת FIGG בזיהוי שרידים אנושיים. כאן נקודת הפתיחה הייתה דגימת עצם מאדם לא מזוהה שנמצא נרצח, והאתגר המרכזי היה מעבדתי: כיצד לייצר מנתון פורנזי פגום פרופיל גנומי רחב מספיק לחיפוש במסד גנאלוגי [2].</w:t>
-      </w:r>
-    </w:p>
-    <w:p>
-      <w:pPr>
-        <w:bidi/>
-        <w:jc w:val="right"/>
-      </w:pPr>
-      <w:r>
-        <w:rPr>
-          <w:rFonts w:ascii="Arial" w:hAnsi="Arial" w:cs="Arial"/>
-          <w:rtl/>
-        </w:rPr>
-        <w:t>Tillmar ועמיתיו ביצעו whole-genome sequencing על DNA מעצם, יצרו שלוש ספריות, ולאחר עיבוד, filtering והתאמה לאתרי המסד, הצליחו לייצר גנוטיפים של כ־מיליון SNPs [2]. הפרופיל הועלה ל־GEDmatch, התקבלה רשימת קרובים, וממנה הופק lead גנאלוגי לגבי זהות הנפטר [2].</w:t>
+        <w:t>unknown parentage מחוץ להקשר הפלילי</w:t>
+      </w:r>
+    </w:p>
+    <w:p>
+      <w:pPr>
+        <w:bidi/>
+        <w:jc w:val="right"/>
+      </w:pPr>
+      <w:r>
+        <w:rPr>
+          <w:rFonts w:ascii="Arial" w:hAnsi="Arial" w:cs="Arial"/>
+          <w:rtl/>
+        </w:rPr>
+        <w:t>המקרה האזרחי שדווח ב־[4] איננו רצח, שרידים או תיק משטרתי, אך הוא מחדד היטב את לוגיקת העבודה של genetic genealogy. נקודת הפתיחה הייתה גבר מאומץ שביקש לזהות את הוריו הביולוגיים [4]. לאחר זיהוי הוריו באמצעות מידע לא מזהה ושיטות מסורתיות של adoption search, התברר שהאב הביולוגי עצמו היה מאומץ, ולכן גם הדור שמעליו לא היה ידוע [4].</w:t>
+      </w:r>
+    </w:p>
+    <w:p>
+      <w:pPr>
+        <w:bidi/>
+        <w:jc w:val="right"/>
+      </w:pPr>
+      <w:r>
+        <w:rPr>
+          <w:rFonts w:ascii="Arial" w:hAnsi="Arial" w:cs="Arial"/>
+          <w:rtl/>
+        </w:rPr>
+        <w:t>מכאן המקרה נעשה מורכב באמת. החוקרת שילבה בדיקות DNA מסחריות עם מחקר גנאלוגי על ההתאמות כדי לזהות את ההורים הסבירים של האב הביולוגי, כלומר את הסבים הביולוגיים המשוערים של נושא החיפוש מצד האב [4]. המאמר מסתיים בזיהוי שני מועמדים סבירים כסבו וסבתו מצד האב ובהצגת אפשרויות ההמשך לנבדק [4].</w:t>
+      </w:r>
+    </w:p>
+    <w:p>
+      <w:pPr>
+        <w:bidi/>
+        <w:jc w:val="right"/>
+      </w:pPr>
+      <w:r>
+        <w:rPr>
+          <w:rFonts w:ascii="Arial" w:hAnsi="Arial" w:cs="Arial"/>
+          <w:rtl/>
+        </w:rPr>
+        <w:t>זהו מקרה קצר ופחות דרמטי מן התיקים הפורנזיים, אך דווקא משום כך הוא מועיל: הוא מראה ש־DNA matches, עצים משפחתיים, פערי תיעוד והסקה זהירה אינם ייחודיים לזירת פשע [4].</w:t>
       </w:r>
     </w:p>
     <w:p>
@@ -15906,20 +16480,7 @@
           <w:rFonts w:ascii="Arial" w:hAnsi="Arial" w:cs="Arial"/>
           <w:rtl/>
         </w:rPr>
-        <w:t>הערך הדידקטי של המקרה</w:t>
-      </w:r>
-    </w:p>
-    <w:p>
-      <w:pPr>
-        <w:bidi/>
-        <w:jc w:val="right"/>
-      </w:pPr>
-      <w:r>
-        <w:rPr>
-          <w:rFonts w:ascii="Arial" w:hAnsi="Arial" w:cs="Arial"/>
-          <w:rtl/>
-        </w:rPr>
-        <w:t>מקרה זה מדגים שהשאלה הקריטית אינה תמיד “האם יש התאמות טובות”, אלא קודם כול “האם אפשר בכלל לייצר פרופיל usable מן השרידים”. הוא טוב במיוחד להוראה משום שהוא מראה:</w:t>
+        <w:t>מה המקרה מלמד</w:t>
       </w:r>
     </w:p>
     <w:p>
@@ -15933,7 +16494,7 @@
           <w:rFonts w:ascii="Arial" w:hAnsi="Arial" w:cs="Arial"/>
           <w:rtl/>
         </w:rPr>
-        <w:t>את תפקידו של WGS בדגימות עצם מאתגרות</w:t>
+        <w:t>אותו היגיון של בניית עץ והתמודדות עם חוסרי מידע פועל גם מחוץ להקשר פלילי [4].</w:t>
       </w:r>
     </w:p>
     <w:p>
@@ -15947,7 +16508,7 @@
           <w:rFonts w:ascii="Arial" w:hAnsi="Arial" w:cs="Arial"/>
           <w:rtl/>
         </w:rPr>
-        <w:t>את החיבור בין עבודה מעבדתית לבין genealogy מסורתי</w:t>
+        <w:t>כאשר unknown parentage מופיע בשני דורות רצופים, המורכבות הגנאלוגית גדלה בחדות [4].</w:t>
       </w:r>
     </w:p>
     <w:p>
@@ -15961,7 +16522,7 @@
           <w:rFonts w:ascii="Arial" w:hAnsi="Arial" w:cs="Arial"/>
           <w:rtl/>
         </w:rPr>
-        <w:t>את ההבדל בין human remains identification לבין criminal suspect identification</w:t>
+        <w:t>לא כל תיק מסתיים בהוכחה חותכת; לעיתים התוצר הוא רשימת מועמדים סבירה ומנומקת [4].</w:t>
       </w:r>
     </w:p>
     <w:p>
@@ -15976,498 +16537,20 @@
           <w:rFonts w:ascii="Arial" w:hAnsi="Arial" w:cs="Arial"/>
           <w:rtl/>
         </w:rPr>
-        <w:t>מקרה 3</w:t>
-      </w:r>
-    </w:p>
-    <w:p>
-      <w:pPr>
-        <w:bidi/>
-        <w:pStyle w:val="Heading3"/>
-        <w:jc w:val="right"/>
-      </w:pPr>
-      <w:r/>
-      <w:r>
-        <w:rPr>
-          <w:rFonts w:ascii="Arial" w:hAnsi="Arial" w:cs="Arial"/>
-          <w:rtl/>
-        </w:rPr>
-        <w:t>תיקים קרים בנורווגיה: הצלחה חלקית כמקרה לימוד</w:t>
-      </w:r>
-    </w:p>
-    <w:p>
-      <w:pPr>
-        <w:bidi/>
-        <w:jc w:val="right"/>
-      </w:pPr>
-      <w:r>
-        <w:rPr>
-          <w:rFonts w:ascii="Arial" w:hAnsi="Arial" w:cs="Arial"/>
-          <w:rtl/>
-        </w:rPr>
-        <w:t>Aanes ועמיתיו הציגו יישום של IGG בשלושה תיקים פליליים קרים בנורווגיה. בשניים מן המקרים זוהה תורם הדנ״א, ובשלישי לא הושג זיהוי [8]. דווקא משום כך זהו case study חשוב במיוחד להוראה.</w:t>
-      </w:r>
-    </w:p>
-    <w:p>
-      <w:pPr>
-        <w:bidi/>
-        <w:jc w:val="right"/>
-      </w:pPr>
-      <w:r>
-        <w:rPr>
-          <w:rFonts w:ascii="Arial" w:hAnsi="Arial" w:cs="Arial"/>
-          <w:rtl/>
-        </w:rPr>
-        <w:t>המאמר מדגיש שכאשר משלבים IGG עם phenotypic prediction ועם נתוני מקרה נוספים, אפשר לפתור גם תיקים נורווגיים, אך גם חושף שאלות פתוחות בכל שרשרת העבודה, מן extraction ועד genealogy research [8].</w:t>
-      </w:r>
-    </w:p>
-    <w:p>
-      <w:pPr>
-        <w:bidi/>
-        <w:pStyle w:val="Heading3"/>
-        <w:jc w:val="right"/>
-      </w:pPr>
-      <w:r/>
-      <w:r>
-        <w:rPr>
-          <w:rFonts w:ascii="Arial" w:hAnsi="Arial" w:cs="Arial"/>
-          <w:rtl/>
-        </w:rPr>
-        <w:t>הערך הדידקטי של המקרה</w:t>
-      </w:r>
-    </w:p>
-    <w:p>
-      <w:pPr>
-        <w:bidi/>
-        <w:jc w:val="right"/>
-      </w:pPr>
-      <w:r>
-        <w:rPr>
-          <w:rFonts w:ascii="Arial" w:hAnsi="Arial" w:cs="Arial"/>
-          <w:rtl/>
-        </w:rPr>
-        <w:t>בניגוד למקרים שמסתיימים בפתרון חד, כאן הסטודנטים יכולים לראות:</w:t>
-      </w:r>
-    </w:p>
-    <w:p>
-      <w:pPr>
-        <w:bidi/>
-        <w:pStyle w:val="ListBullet"/>
-        <w:jc w:val="right"/>
-      </w:pPr>
-      <w:r>
-        <w:rPr>
-          <w:rFonts w:ascii="Arial" w:hAnsi="Arial" w:cs="Arial"/>
-          <w:rtl/>
-        </w:rPr>
-        <w:t>ש־IGG אינו מבטיח פתרון בכל תיק</w:t>
-      </w:r>
-    </w:p>
-    <w:p>
-      <w:pPr>
-        <w:bidi/>
-        <w:pStyle w:val="ListBullet"/>
-        <w:jc w:val="right"/>
-      </w:pPr>
-      <w:r>
-        <w:rPr>
-          <w:rFonts w:ascii="Arial" w:hAnsi="Arial" w:cs="Arial"/>
-          <w:rtl/>
-        </w:rPr>
-        <w:t>שהצלחה חלקית היא עדיין תוצאה מחקרית משמעותית</w:t>
-      </w:r>
-    </w:p>
-    <w:p>
-      <w:pPr>
-        <w:bidi/>
-        <w:pStyle w:val="ListBullet"/>
-        <w:jc w:val="right"/>
-      </w:pPr>
-      <w:r>
-        <w:rPr>
-          <w:rFonts w:ascii="Arial" w:hAnsi="Arial" w:cs="Arial"/>
-          <w:rtl/>
-        </w:rPr>
-        <w:t>שהחסמים יכולים להופיע בכל שלב, לא רק במעבדה או רק בגנאלוגיה</w:t>
-      </w:r>
-    </w:p>
-    <w:p>
-      <w:pPr>
-        <w:bidi/>
-        <w:jc w:val="right"/>
-      </w:pPr>
-      <w:r>
-        <w:rPr>
-          <w:rFonts w:ascii="Arial" w:hAnsi="Arial" w:cs="Arial"/>
-          <w:rtl/>
-        </w:rPr>
-        <w:t>זהו מקרה חשוב במיוחד לפיתוח חשיבה ביקורתית, משום שהוא שובר את הרושם ש־FIGG הוא כלי בעל הצלחה מובטחת [6], [8].</w:t>
-      </w:r>
-    </w:p>
-    <w:p>
-      <w:pPr>
-        <w:bidi/>
-        <w:pStyle w:val="Heading2"/>
-        <w:jc w:val="right"/>
-      </w:pPr>
-      <w:r/>
-      <w:r>
-        <w:rPr>
-          <w:rFonts w:ascii="Arial" w:hAnsi="Arial" w:cs="Arial"/>
-          <w:rtl/>
-        </w:rPr>
-        <w:t>מקרה 4</w:t>
-      </w:r>
-    </w:p>
-    <w:p>
-      <w:pPr>
-        <w:bidi/>
-        <w:pStyle w:val="Heading3"/>
-        <w:jc w:val="right"/>
-      </w:pPr>
-      <w:r/>
-      <w:r>
-        <w:rPr>
-          <w:rFonts w:ascii="Arial" w:hAnsi="Arial" w:cs="Arial"/>
-          <w:rtl/>
-        </w:rPr>
-        <w:t>זיהוי קורבן רצח בן יותר ממאה שנה</w:t>
-      </w:r>
-    </w:p>
-    <w:p>
-      <w:pPr>
-        <w:bidi/>
-        <w:jc w:val="right"/>
-      </w:pPr>
-      <w:r>
-        <w:rPr>
-          <w:rFonts w:ascii="Arial" w:hAnsi="Arial" w:cs="Arial"/>
-          <w:rtl/>
-        </w:rPr>
-        <w:t>המקרה שתיארו Michael ועמיתיה עוסק בזיהוי decedent בתיק רצח בן 103 שנים, שבו שרידים מקוטעים וממומיפיקציה חלקית נמצאו במערה, אך במשך עשרות שנים לא זוהו [4].</w:t>
-      </w:r>
-    </w:p>
-    <w:p>
-      <w:pPr>
-        <w:bidi/>
-        <w:jc w:val="right"/>
-      </w:pPr>
-      <w:r>
-        <w:rPr>
-          <w:rFonts w:ascii="Arial" w:hAnsi="Arial" w:cs="Arial"/>
-          <w:rtl/>
-        </w:rPr>
-        <w:t>ייחודו של המקרה הוא האופי הבין־תחומי שלו. forensic anthropology סיפקה biological profile וניתוח טראומה, אך רק השילוב עם FGG ועם historical documentation הוביל לזיהוי סופי. בנוסף, החוקרים מציינים במפורש את הקשיים: endogamy משמעותי, שימוש בכמה aliases בידי הקורבן, ואתגרי תיעוד הנובעים מן המרחק ההיסטורי [4].</w:t>
-      </w:r>
-    </w:p>
-    <w:p>
-      <w:pPr>
-        <w:bidi/>
-        <w:pStyle w:val="Heading3"/>
-        <w:jc w:val="right"/>
-      </w:pPr>
-      <w:r/>
-      <w:r>
-        <w:rPr>
-          <w:rFonts w:ascii="Arial" w:hAnsi="Arial" w:cs="Arial"/>
-          <w:rtl/>
-        </w:rPr>
-        <w:t>הערך הדידקטי של המקרה</w:t>
-      </w:r>
-    </w:p>
-    <w:p>
-      <w:pPr>
-        <w:bidi/>
-        <w:jc w:val="right"/>
-      </w:pPr>
-      <w:r>
-        <w:rPr>
-          <w:rFonts w:ascii="Arial" w:hAnsi="Arial" w:cs="Arial"/>
-          <w:rtl/>
-        </w:rPr>
-        <w:t>זהו מקרה יוצא דופן להוראה משום שהוא מדגים:</w:t>
-      </w:r>
-    </w:p>
-    <w:p>
-      <w:pPr>
-        <w:bidi/>
-        <w:pStyle w:val="ListBullet"/>
-        <w:jc w:val="right"/>
-      </w:pPr>
-      <w:r>
-        <w:rPr>
-          <w:rFonts w:ascii="Arial" w:hAnsi="Arial" w:cs="Arial"/>
-          <w:rtl/>
-        </w:rPr>
-        <w:t>ש־FIGG אינו שייך רק לתיקים מודרניים</w:t>
-      </w:r>
-    </w:p>
-    <w:p>
-      <w:pPr>
-        <w:bidi/>
-        <w:pStyle w:val="ListBullet"/>
-        <w:jc w:val="right"/>
-      </w:pPr>
-      <w:r>
-        <w:rPr>
-          <w:rFonts w:ascii="Arial" w:hAnsi="Arial" w:cs="Arial"/>
-          <w:rtl/>
-        </w:rPr>
-        <w:t>שהגנאלוגיה הפורנזית יכולה להתחבר לאנתרופולוגיה, היסטוריה ו־proof of life evidence</w:t>
-      </w:r>
-    </w:p>
-    <w:p>
-      <w:pPr>
-        <w:bidi/>
-        <w:pStyle w:val="ListBullet"/>
-        <w:jc w:val="right"/>
-      </w:pPr>
-      <w:r>
-        <w:rPr>
-          <w:rFonts w:ascii="Arial" w:hAnsi="Arial" w:cs="Arial"/>
-          <w:rtl/>
-        </w:rPr>
-        <w:t>שהבעיה אינה רק גנטית אלא גם תיעודית והיסטורית</w:t>
-      </w:r>
-    </w:p>
-    <w:p>
-      <w:pPr>
-        <w:bidi/>
-        <w:jc w:val="right"/>
-      </w:pPr>
-      <w:r>
-        <w:rPr>
-          <w:rFonts w:ascii="Arial" w:hAnsi="Arial" w:cs="Arial"/>
-          <w:rtl/>
-        </w:rPr>
-        <w:t>המקרה חשוב גם מפני שהוא מלמד כי לפעמים דווקא השילוב הבין־תחומי הוא תנאי הפתרון, ולא עוד שיפור בטכנולוגיית DNA בלבד [4].</w:t>
-      </w:r>
-    </w:p>
-    <w:p>
-      <w:pPr>
-        <w:bidi/>
-        <w:pStyle w:val="Heading2"/>
-        <w:jc w:val="right"/>
-      </w:pPr>
-      <w:r/>
-      <w:r>
-        <w:rPr>
-          <w:rFonts w:ascii="Arial" w:hAnsi="Arial" w:cs="Arial"/>
-          <w:rtl/>
-        </w:rPr>
-        <w:t>מקרה 5</w:t>
-      </w:r>
-    </w:p>
-    <w:p>
-      <w:pPr>
-        <w:bidi/>
-        <w:pStyle w:val="Heading3"/>
-        <w:jc w:val="right"/>
-      </w:pPr>
-      <w:r/>
-      <w:r>
-        <w:rPr>
-          <w:rFonts w:ascii="Arial" w:hAnsi="Arial" w:cs="Arial"/>
-          <w:rtl/>
-        </w:rPr>
-        <w:t>unknown parentage מחוץ להקשר הפלילי</w:t>
-      </w:r>
-    </w:p>
-    <w:p>
-      <w:pPr>
-        <w:bidi/>
-        <w:jc w:val="right"/>
-      </w:pPr>
-      <w:r>
-        <w:rPr>
-          <w:rFonts w:ascii="Arial" w:hAnsi="Arial" w:cs="Arial"/>
-          <w:rtl/>
-        </w:rPr>
-        <w:t>המקרה של Canada אינו תיק פורנזי קלאסי אלא case study של compound unknown parentage, ובדיוק משום כך הוא פדגוגי מאוד [5]. במקרה זה זוהו הוריו הביולוגיים של גבר מאומץ, ולאחר מכן נעשה מאמץ לזהות גם את הוריו המשוערים של האב הביולוגי, שהיה בעצמו מאומץ [5].</w:t>
-      </w:r>
-    </w:p>
-    <w:p>
-      <w:pPr>
-        <w:bidi/>
-        <w:pStyle w:val="Heading3"/>
-        <w:jc w:val="right"/>
-      </w:pPr>
-      <w:r/>
-      <w:r>
-        <w:rPr>
-          <w:rFonts w:ascii="Arial" w:hAnsi="Arial" w:cs="Arial"/>
-          <w:rtl/>
-        </w:rPr>
-        <w:t>הערך הדידקטי של המקרה</w:t>
-      </w:r>
-    </w:p>
-    <w:p>
-      <w:pPr>
-        <w:bidi/>
-        <w:jc w:val="right"/>
-      </w:pPr>
-      <w:r>
-        <w:rPr>
-          <w:rFonts w:ascii="Arial" w:hAnsi="Arial" w:cs="Arial"/>
-          <w:rtl/>
-        </w:rPr>
-        <w:t>המקרה מראה שהלוגיקה של FIGG אינה מוגבלת לתיקים פליליים או לשרידים. אותה מתודולוגיה של התאמות, בניית עצים, וחיפוש בענפים לא ידועים פועלת גם במקרים אזרחיים של unknown parentage. לכן זהו case study מועיל במיוחד לקישור בין פרק 7 על היישומים האזרחיים לבין הפרקים הפורנזיים.</w:t>
-      </w:r>
-    </w:p>
-    <w:p>
-      <w:pPr>
-        <w:bidi/>
-        <w:pStyle w:val="Heading2"/>
-        <w:jc w:val="right"/>
-      </w:pPr>
-      <w:r/>
-      <w:r>
-        <w:rPr>
-          <w:rFonts w:ascii="Arial" w:hAnsi="Arial" w:cs="Arial"/>
-          <w:rtl/>
-        </w:rPr>
-        <w:t>מקרים סינתטיים של זיהוי שרידים</w:t>
-      </w:r>
-    </w:p>
-    <w:p>
-      <w:pPr>
-        <w:bidi/>
-        <w:jc w:val="right"/>
-      </w:pPr>
-      <w:r>
-        <w:rPr>
-          <w:rFonts w:ascii="Arial" w:hAnsi="Arial" w:cs="Arial"/>
-          <w:rtl/>
-        </w:rPr>
-        <w:t>Greytak ועמיתיה הציגו ב־Gre24 סקירה של IGG עבור unidentified human remains, כולל שלושה case studies. גם בלי להיכנס לכל פרט מקרה בנפרד, המאמר חשוב כי הוא מראה שהטכניקות שפותחו עבור suspect identification התאימו את עצמן היטב גם לעולם השרידים [3].</w:t>
-      </w:r>
-    </w:p>
-    <w:p>
-      <w:pPr>
-        <w:bidi/>
-        <w:jc w:val="right"/>
-      </w:pPr>
-      <w:r>
-        <w:rPr>
-          <w:rFonts w:ascii="Arial" w:hAnsi="Arial" w:cs="Arial"/>
-          <w:rtl/>
-        </w:rPr>
-        <w:t>לפי המחברים, עד למועד כתיבתם פורסמו בפומבי 367 זיהויים של UHR בעזרת IGG [3]. התרומה הדידקטית של מאמר זה היא בכך שהוא מסיט את מרכז הכובד מן הסנסציה של תיק פלילי אחד לעבר understanding שיטתי של workflow חוזר בזיהוי שרידים: דגימה, SNP generation, database upload, genealogy, narrowing, confirmation [3].</w:t>
-      </w:r>
-    </w:p>
-    <w:p>
-      <w:pPr>
-        <w:bidi/>
-        <w:pStyle w:val="Heading2"/>
-        <w:jc w:val="right"/>
-      </w:pPr>
-      <w:r/>
-      <w:r>
-        <w:rPr>
-          <w:rFonts w:ascii="Arial" w:hAnsi="Arial" w:cs="Arial"/>
-          <w:rtl/>
-        </w:rPr>
-        <w:t>מה חוזר בכל המקרים</w:t>
-      </w:r>
-    </w:p>
-    <w:p>
-      <w:pPr>
-        <w:bidi/>
-        <w:jc w:val="right"/>
-      </w:pPr>
-      <w:r>
-        <w:rPr>
-          <w:rFonts w:ascii="Arial" w:hAnsi="Arial" w:cs="Arial"/>
-          <w:rtl/>
-        </w:rPr>
-        <w:t>למרות השוני בין התיקים, כמה דפוסים חוזרים כמעט תמיד:</w:t>
-      </w:r>
-    </w:p>
-    <w:p>
-      <w:pPr>
-        <w:bidi/>
-        <w:pStyle w:val="ListBullet"/>
-        <w:jc w:val="right"/>
-      </w:pPr>
-      <w:r>
-        <w:rPr>
-          <w:rtl/>
-          <w:rFonts w:ascii="Arial" w:hAnsi="Arial" w:cs="Arial"/>
-          <w:b/>
-        </w:rPr>
-        <w:t>המעבדה היא תנאי הכרחי אך לא מספיק</w:t>
-      </w:r>
-      <w:r>
-        <w:rPr>
-          <w:rFonts w:ascii="Arial" w:hAnsi="Arial" w:cs="Arial"/>
-          <w:rtl/>
-        </w:rPr>
-        <w:t xml:space="preserve"> — בלי פרופיל usable אין חקירה, אך גם פרופיל טוב אינו פותר תיק לבדו [1], [2]</w:t>
-      </w:r>
-    </w:p>
-    <w:p>
-      <w:pPr>
-        <w:bidi/>
-        <w:pStyle w:val="ListBullet"/>
-        <w:jc w:val="right"/>
-      </w:pPr>
-      <w:r>
-        <w:rPr>
-          <w:rtl/>
-          <w:rFonts w:ascii="Arial" w:hAnsi="Arial" w:cs="Arial"/>
-          <w:b/>
-        </w:rPr>
-        <w:t>ההתאמות הן clues ולא פתרון</w:t>
-      </w:r>
-      <w:r>
-        <w:rPr>
-          <w:rFonts w:ascii="Arial" w:hAnsi="Arial" w:cs="Arial"/>
-          <w:rtl/>
-        </w:rPr>
-        <w:t xml:space="preserve"> — רשימת התאמות פותחת את התהליך, לא מסיימת אותו [6], [9]</w:t>
-      </w:r>
-    </w:p>
-    <w:p>
-      <w:pPr>
-        <w:bidi/>
-        <w:pStyle w:val="ListBullet"/>
-        <w:jc w:val="right"/>
-      </w:pPr>
-      <w:r>
-        <w:rPr>
-          <w:rtl/>
-          <w:rFonts w:ascii="Arial" w:hAnsi="Arial" w:cs="Arial"/>
-          <w:b/>
-        </w:rPr>
-        <w:t>הגנאלוגיה היא לעיתים קרובות צוואר הבקבוק</w:t>
-      </w:r>
-      <w:r>
-        <w:rPr>
-          <w:rFonts w:ascii="Arial" w:hAnsi="Arial" w:cs="Arial"/>
-          <w:rtl/>
-        </w:rPr>
-        <w:t xml:space="preserve"> — הזמן מושקע בבניית עץ, בחיפוש מסמכים ובצמצום ענפים [6], [7]</w:t>
-      </w:r>
-    </w:p>
-    <w:p>
-      <w:pPr>
-        <w:bidi/>
-        <w:pStyle w:val="ListBullet"/>
-        <w:jc w:val="right"/>
-      </w:pPr>
-      <w:r>
-        <w:rPr>
-          <w:rtl/>
-          <w:rFonts w:ascii="Arial" w:hAnsi="Arial" w:cs="Arial"/>
-          <w:b/>
-        </w:rPr>
-        <w:t>האימות הסופי נותר חיצוני ל־IGG</w:t>
-      </w:r>
-      <w:r>
-        <w:rPr>
-          <w:rFonts w:ascii="Arial" w:hAnsi="Arial" w:cs="Arial"/>
-          <w:rtl/>
-        </w:rPr>
-        <w:t xml:space="preserve"> — זיהוי סופי דורש STR, דגימת ייחוס, או צירוף רב־תחומי של ראיות [1], [4]</w:t>
+        <w:t>ההקשר הרחב של זיהוי שרידים</w:t>
+      </w:r>
+    </w:p>
+    <w:p>
+      <w:pPr>
+        <w:bidi/>
+        <w:jc w:val="right"/>
+      </w:pPr>
+      <w:r>
+        <w:rPr>
+          <w:rFonts w:ascii="Arial" w:hAnsi="Arial" w:cs="Arial"/>
+          <w:rtl/>
+        </w:rPr>
+        <w:t>הסקירה ב־[7] מרחיבה את נקודת המבט מעבר למקרה יחיד וטוענת ש־IGG כבר סייע למאות זיהויי UHR, עם 367 זיהויים שהוכרזו בפומבי עד מועד הכתיבה [7]. התרומה העיקרית של הסקירה לפרק זה היא בהבנה שמאחורי כל סיפור בודד יש workflow חוזר: הפקת SNPs מדגימה מאתגרת, העלאה למסד, בניית עץ, צמצום זהות ואימות [7].</w:t>
       </w:r>
     </w:p>
     <w:p>
@@ -16534,7 +16617,7 @@
                 <w:rFonts w:ascii="Arial" w:hAnsi="Arial" w:cs="Arial"/>
                 <w:b/>
               </w:rPr>
-              <w:t>סוג מקרה</w:t>
+              <w:t>מה קרה</w:t>
             </w:r>
           </w:p>
         </w:tc>
@@ -16553,7 +16636,7 @@
                 <w:rFonts w:ascii="Arial" w:hAnsi="Arial" w:cs="Arial"/>
                 <w:b/>
               </w:rPr>
-              <w:t>צוואר בקבוק מרכזי</w:t>
+              <w:t>מה היה התקוע</w:t>
             </w:r>
           </w:p>
         </w:tc>
@@ -16572,7 +16655,7 @@
                 <w:rFonts w:ascii="Arial" w:hAnsi="Arial" w:cs="Arial"/>
                 <w:b/>
               </w:rPr>
-              <w:t>לקח דידקטי</w:t>
+              <w:t>איך נפרץ המבוי הסתום</w:t>
             </w:r>
           </w:p>
         </w:tc>
@@ -16610,7 +16693,7 @@
                 <w:rFonts w:ascii="Arial" w:hAnsi="Arial" w:cs="Arial"/>
                 <w:rtl/>
               </w:rPr>
-              <w:t>תיק רצח קר</w:t>
+              <w:t>רצח כפול אקראי ברחוב בלינשפינג בשנת 2004</w:t>
             </w:r>
           </w:p>
         </w:tc>
@@ -16628,7 +16711,7 @@
                 <w:rFonts w:ascii="Arial" w:hAnsi="Arial" w:cs="Arial"/>
                 <w:rtl/>
               </w:rPr>
-              <w:t>DNA דל ופגום + tree building</w:t>
+              <w:t>15 שנות חקירה, אלפי תשאולים וללא התאמת STR</w:t>
             </w:r>
           </w:p>
         </w:tc>
@@ -16646,7 +16729,7 @@
                 <w:rFonts w:ascii="Arial" w:hAnsi="Arial" w:cs="Arial"/>
                 <w:rtl/>
               </w:rPr>
-              <w:t>IGG יכול לפתור תיק פלילי גם באירופה כאשר המעבדה והגנאלוגיה פועלות יחד</w:t>
+              <w:t>WGS, imputation, התאמות של 60–100 cM, בניית עץ, בדיקות מתנדבים, ואז STR ישיר</w:t>
             </w:r>
           </w:p>
         </w:tc>
@@ -16684,7 +16767,7 @@
                 <w:rFonts w:ascii="Arial" w:hAnsi="Arial" w:cs="Arial"/>
                 <w:rtl/>
               </w:rPr>
-              <w:t>זיהוי שרידים</w:t>
+              <w:t>שרידי גבר לא מזוהה שנמצא נרצח בדרום שוודיה</w:t>
             </w:r>
           </w:p>
         </w:tc>
@@ -16702,7 +16785,7 @@
                 <w:rFonts w:ascii="Arial" w:hAnsi="Arial" w:cs="Arial"/>
                 <w:rtl/>
               </w:rPr>
-              <w:t>הפקת SNP profile usable מעצם</w:t>
+              <w:t>קושי להפיק מן העצם פרופיל SNP רחב</w:t>
             </w:r>
           </w:p>
         </w:tc>
@@ -16720,7 +16803,7 @@
                 <w:rFonts w:ascii="Arial" w:hAnsi="Arial" w:cs="Arial"/>
                 <w:rtl/>
               </w:rPr>
-              <w:t>WGS יכול להפוך שרידים קשים לנתון גנאלוגי</w:t>
+              <w:t>WGS מעצם, כ־מיליון SNPs, GEDmatch ויצירת lead לזהות</w:t>
             </w:r>
           </w:p>
         </w:tc>
@@ -16740,7 +16823,7 @@
                 <w:rFonts w:ascii="Arial" w:hAnsi="Arial" w:cs="Arial"/>
                 <w:rtl/>
               </w:rPr>
-              <w:t>[8]</w:t>
+              <w:t>[6]</w:t>
             </w:r>
           </w:p>
         </w:tc>
@@ -16758,7 +16841,7 @@
                 <w:rFonts w:ascii="Arial" w:hAnsi="Arial" w:cs="Arial"/>
                 <w:rtl/>
               </w:rPr>
-              <w:t>שלושה תיקים קרים</w:t>
+              <w:t>שלושה תיקים קרים, בהם אונס ורצח</w:t>
             </w:r>
           </w:p>
         </w:tc>
@@ -16776,7 +16859,7 @@
                 <w:rFonts w:ascii="Arial" w:hAnsi="Arial" w:cs="Arial"/>
                 <w:rtl/>
               </w:rPr>
-              <w:t>שונות בין תיקים לאורך כל ה־workflow</w:t>
+              <w:t>פעם התאמות רחוקות מדי, פעם אילנות מורכבים, פעם עבודה גנאלוגית עצומה</w:t>
             </w:r>
           </w:p>
         </w:tc>
@@ -16794,7 +16877,81 @@
                 <w:rFonts w:ascii="Arial" w:hAnsi="Arial" w:cs="Arial"/>
                 <w:rtl/>
               </w:rPr>
-              <w:t>לא כל תיק נפתר; הצלחה חלקית היא מידע חשוב</w:t>
+              <w:t>שילוב של WGS, מסדים, פנוטיפינג, בניית עצים ובדיקות ממוקדות</w:t>
+            </w:r>
+          </w:p>
+        </w:tc>
+      </w:tr>
+      <w:tr>
+        <w:tc>
+          <w:tcPr>
+            <w:tcW w:type="dxa" w:w="2160"/>
+          </w:tcPr>
+          <w:p>
+            <w:pPr>
+              <w:bidi/>
+              <w:jc w:val="right"/>
+            </w:pPr>
+            <w:r>
+              <w:rPr>
+                <w:rFonts w:ascii="Arial" w:hAnsi="Arial" w:cs="Arial"/>
+                <w:rtl/>
+              </w:rPr>
+              <w:t>[3]</w:t>
+            </w:r>
+          </w:p>
+        </w:tc>
+        <w:tc>
+          <w:tcPr>
+            <w:tcW w:type="dxa" w:w="2160"/>
+          </w:tcPr>
+          <w:p>
+            <w:pPr>
+              <w:bidi/>
+              <w:jc w:val="right"/>
+            </w:pPr>
+            <w:r>
+              <w:rPr>
+                <w:rFonts w:ascii="Arial" w:hAnsi="Arial" w:cs="Arial"/>
+                <w:rtl/>
+              </w:rPr>
+              <w:t>שרידים מבותרים במערת לבה שנקשרו לרצח משנת 1916</w:t>
+            </w:r>
+          </w:p>
+        </w:tc>
+        <w:tc>
+          <w:tcPr>
+            <w:tcW w:type="dxa" w:w="2160"/>
+          </w:tcPr>
+          <w:p>
+            <w:pPr>
+              <w:bidi/>
+              <w:jc w:val="right"/>
+            </w:pPr>
+            <w:r>
+              <w:rPr>
+                <w:rFonts w:ascii="Arial" w:hAnsi="Arial" w:cs="Arial"/>
+                <w:rtl/>
+              </w:rPr>
+              <w:t>זמן מוות שגוי, אין גולגולת, aliases, endogamy ורישומים מטעים</w:t>
+            </w:r>
+          </w:p>
+        </w:tc>
+        <w:tc>
+          <w:tcPr>
+            <w:tcW w:type="dxa" w:w="2160"/>
+          </w:tcPr>
+          <w:p>
+            <w:pPr>
+              <w:bidi/>
+              <w:jc w:val="right"/>
+            </w:pPr>
+            <w:r>
+              <w:rPr>
+                <w:rFonts w:ascii="Arial" w:hAnsi="Arial" w:cs="Arial"/>
+                <w:rtl/>
+              </w:rPr>
+              <w:t>DNA מן הטיביה, עץ ענק, Y-DNA, poster היסטורי ובדיקת קרוב משפחה</w:t>
             </w:r>
           </w:p>
         </w:tc>
@@ -16832,7 +16989,7 @@
                 <w:rFonts w:ascii="Arial" w:hAnsi="Arial" w:cs="Arial"/>
                 <w:rtl/>
               </w:rPr>
-              <w:t>תיק היסטורי</w:t>
+              <w:t>גבר מאומץ שמבקש לזהות שורשים משפחתיים כפולים</w:t>
             </w:r>
           </w:p>
         </w:tc>
@@ -16850,7 +17007,7 @@
                 <w:rFonts w:ascii="Arial" w:hAnsi="Arial" w:cs="Arial"/>
                 <w:rtl/>
               </w:rPr>
-              <w:t>endogamy, aliases, תיעוד היסטורי</w:t>
+              <w:t>unknown parentage גם אצל האב הביולוגי</w:t>
             </w:r>
           </w:p>
         </w:tc>
@@ -16868,81 +17025,7 @@
                 <w:rFonts w:ascii="Arial" w:hAnsi="Arial" w:cs="Arial"/>
                 <w:rtl/>
               </w:rPr>
-              <w:t>פתרון מגיע לעיתים רק משילוב בין תחומים</w:t>
-            </w:r>
-          </w:p>
-        </w:tc>
-      </w:tr>
-      <w:tr>
-        <w:tc>
-          <w:tcPr>
-            <w:tcW w:type="dxa" w:w="2160"/>
-          </w:tcPr>
-          <w:p>
-            <w:pPr>
-              <w:bidi/>
-              <w:jc w:val="right"/>
-            </w:pPr>
-            <w:r>
-              <w:rPr>
-                <w:rFonts w:ascii="Arial" w:hAnsi="Arial" w:cs="Arial"/>
-                <w:rtl/>
-              </w:rPr>
-              <w:t>[5]</w:t>
-            </w:r>
-          </w:p>
-        </w:tc>
-        <w:tc>
-          <w:tcPr>
-            <w:tcW w:type="dxa" w:w="2160"/>
-          </w:tcPr>
-          <w:p>
-            <w:pPr>
-              <w:bidi/>
-              <w:jc w:val="right"/>
-            </w:pPr>
-            <w:r>
-              <w:rPr>
-                <w:rFonts w:ascii="Arial" w:hAnsi="Arial" w:cs="Arial"/>
-                <w:rtl/>
-              </w:rPr>
-              <w:t>unknown parentage</w:t>
-            </w:r>
-          </w:p>
-        </w:tc>
-        <w:tc>
-          <w:tcPr>
-            <w:tcW w:type="dxa" w:w="2160"/>
-          </w:tcPr>
-          <w:p>
-            <w:pPr>
-              <w:bidi/>
-              <w:jc w:val="right"/>
-            </w:pPr>
-            <w:r>
-              <w:rPr>
-                <w:rFonts w:ascii="Arial" w:hAnsi="Arial" w:cs="Arial"/>
-                <w:rtl/>
-              </w:rPr>
-              <w:t>בניית עץ מורכב מריבוי שכבות אי־ידיעה</w:t>
-            </w:r>
-          </w:p>
-        </w:tc>
-        <w:tc>
-          <w:tcPr>
-            <w:tcW w:type="dxa" w:w="2160"/>
-          </w:tcPr>
-          <w:p>
-            <w:pPr>
-              <w:bidi/>
-              <w:jc w:val="right"/>
-            </w:pPr>
-            <w:r>
-              <w:rPr>
-                <w:rFonts w:ascii="Arial" w:hAnsi="Arial" w:cs="Arial"/>
-                <w:rtl/>
-              </w:rPr>
-              <w:t>הלוגיקה של FIGG חוצה את הגבול בין אזרחי לפורנזי</w:t>
+              <w:t>DNA מסחרי, עצים משפחתיים והסקה של זוג סבים סביר</w:t>
             </w:r>
           </w:p>
         </w:tc>
@@ -16960,6 +17043,77 @@
           <w:rFonts w:ascii="Arial" w:hAnsi="Arial" w:cs="Arial"/>
           <w:rtl/>
         </w:rPr>
+        <w:t>מה חוזר כמעט בכל המקרים</w:t>
+      </w:r>
+    </w:p>
+    <w:p>
+      <w:pPr>
+        <w:bidi/>
+        <w:pStyle w:val="ListBullet"/>
+        <w:jc w:val="right"/>
+      </w:pPr>
+      <w:r>
+        <w:rPr>
+          <w:rFonts w:ascii="Arial" w:hAnsi="Arial" w:cs="Arial"/>
+          <w:rtl/>
+        </w:rPr>
+        <w:t>הבעיה הראשונית אינה תמיד “מי החשוד” אלא לעיתים “האם אפשר בכלל לבנות פרופיל usable” [2], [7].</w:t>
+      </w:r>
+    </w:p>
+    <w:p>
+      <w:pPr>
+        <w:bidi/>
+        <w:pStyle w:val="ListBullet"/>
+        <w:jc w:val="right"/>
+      </w:pPr>
+      <w:r>
+        <w:rPr>
+          <w:rFonts w:ascii="Arial" w:hAnsi="Arial" w:cs="Arial"/>
+          <w:rtl/>
+        </w:rPr>
+        <w:t>התאמות במסד הן נקודת פתיחה בלבד; עיקר ההתקדמות מגיע מבניית עצים ומצמצום ענפים [1], [5].</w:t>
+      </w:r>
+    </w:p>
+    <w:p>
+      <w:pPr>
+        <w:bidi/>
+        <w:pStyle w:val="ListBullet"/>
+        <w:jc w:val="right"/>
+      </w:pPr>
+      <w:r>
+        <w:rPr>
+          <w:rFonts w:ascii="Arial" w:hAnsi="Arial" w:cs="Arial"/>
+          <w:rtl/>
+        </w:rPr>
+        <w:t>מסמכים חיצוניים נשארים קריטיים, בין אם אלה רשומות אזרחיות, נתוני מיקום, או poster היסטורי [3], [5].</w:t>
+      </w:r>
+    </w:p>
+    <w:p>
+      <w:pPr>
+        <w:bidi/>
+        <w:pStyle w:val="ListBullet"/>
+        <w:jc w:val="right"/>
+      </w:pPr>
+      <w:r>
+        <w:rPr>
+          <w:rFonts w:ascii="Arial" w:hAnsi="Arial" w:cs="Arial"/>
+          <w:rtl/>
+        </w:rPr>
+        <w:t>האימות הסופי נשען על ראיה נוספת: STR, דגימת ייחוס, או צירוף של DNA עם מסמכים היסטוריים [1], [3].</w:t>
+      </w:r>
+    </w:p>
+    <w:p>
+      <w:pPr>
+        <w:bidi/>
+        <w:pStyle w:val="Heading2"/>
+        <w:jc w:val="right"/>
+      </w:pPr>
+      <w:r/>
+      <w:r>
+        <w:rPr>
+          <w:rFonts w:ascii="Arial" w:hAnsi="Arial" w:cs="Arial"/>
+          <w:rtl/>
+        </w:rPr>
         <w:t>סיכום</w:t>
       </w:r>
     </w:p>
@@ -16973,741 +17127,141 @@
           <w:rFonts w:ascii="Arial" w:hAnsi="Arial" w:cs="Arial"/>
           <w:rtl/>
         </w:rPr>
-        <w:t>תיאורי המקרה של FIGG מראים שהשיטה אינה טכנולוגיה אחת אלא workflow משולב, שבו איכות הדגימה, סוג הפלטפורמה, הרכב המסד, היכולת לבנות עצי משפחה, ונגישות הרשומות קובעים יחד את תוצאת התיק [1], [2], [3].</w:t>
-      </w:r>
-    </w:p>
-    <w:p>
-      <w:pPr>
-        <w:bidi/>
-        <w:jc w:val="right"/>
-      </w:pPr>
-      <w:r>
-        <w:rPr>
-          <w:rFonts w:ascii="Arial" w:hAnsi="Arial" w:cs="Arial"/>
-          <w:rtl/>
-        </w:rPr>
-        <w:t>תיקים פליליים קרים, זיהוי שרידים, מקרים היסטוריים וunknown parentage נבדלים זה מזה במטרתם, אך חולקים דפוס פעולה דומה: SNP profile, database matches, genealogy, narrowing, confirmation. הערך הפדגוגי של תיאורי המקרה הוא בכך שהם הופכים את הידע התיאורטי מן הפרקים הקודמים לשרשרת עבודה ממשית, עם הצלחות, מגבלות ואי־ודאות [4], [6], [8].</w:t>
-      </w:r>
-    </w:p>
-    <w:p>
-      <w:pPr>
-        <w:bidi/>
+        <w:t>תיאורי המקרה מראים ש־FIGG עובד היטב דווקא כאשר מפסיקים לחשוב עליו כעל בדיקה אחת ומתחילים לראות בו מלאכת חיבור. בכל פעם נדרש צירוף אחר של מעבדה, מסד, genealogy ורשומות [5], [6].</w:t>
+      </w:r>
+    </w:p>
+    <w:p>
+      <w:pPr>
+        <w:bidi/>
+        <w:jc w:val="right"/>
+      </w:pPr>
+      <w:r>
+        <w:rPr>
+          <w:rFonts w:ascii="Arial" w:hAnsi="Arial" w:cs="Arial"/>
+          <w:rtl/>
+        </w:rPr>
+        <w:t>רצח לינשפינג מדגים כיצד התאמות רחוקות הופכות לחשוד קונקרטי [1]. Ekeby man מדגים שהמעבדה עצמה יכולה להיות צוואר הבקבוק המרכזי [2]. שלושת המקרים הנורווגיים מראים שהצלחה חלקית וכישלון הם חלק רגיל מן התמונה [6]. המקרה של לאבלס מראה עד כמה FIGG יכול להיות גם היסטורי ואנתרופולוגי [3]. והמקרה של unknown parentage מבהיר שהלוגיקה הגנאלוגית רחבה יותר מן השימוש הפלילי הצר [4].</w:t>
+      </w:r>
+    </w:p>
+    <w:p>
+      <w:pPr>
+        <w:bidi/>
+        <w:jc w:val="right"/>
+      </w:pPr>
+      <w:r>
+        <w:t>__________________________________________________</w:t>
+      </w:r>
+    </w:p>
+    <w:p>
+      <w:pPr>
         <w:pStyle w:val="Heading2"/>
-        <w:jc w:val="right"/>
+        <w:jc w:val="left"/>
       </w:pPr>
       <w:r/>
       <w:r>
-        <w:rPr>
-          <w:rFonts w:ascii="Arial" w:hAnsi="Arial" w:cs="Arial"/>
-          <w:rtl/>
-        </w:rPr>
-        <w:t>תיבת מושגים</w:t>
-      </w:r>
-    </w:p>
-    <w:p>
-      <w:pPr>
-        <w:bidi/>
-        <w:pStyle w:val="Heading3"/>
-        <w:jc w:val="right"/>
-      </w:pPr>
-      <w:r/>
-      <w:r>
-        <w:rPr>
-          <w:rFonts w:ascii="Arial" w:hAnsi="Arial" w:cs="Arial"/>
-          <w:rtl/>
-        </w:rPr>
-        <w:t>Case study</w:t>
-      </w:r>
-    </w:p>
-    <w:p>
-      <w:pPr>
-        <w:bidi/>
-        <w:jc w:val="right"/>
-      </w:pPr>
-      <w:r>
-        <w:rPr>
-          <w:rFonts w:ascii="Arial" w:hAnsi="Arial" w:cs="Arial"/>
-          <w:rtl/>
-        </w:rPr>
-        <w:t>תיאור מפורט של תיק אמיתי, המשמש לניתוח workflow, נקודות הצלחה, כשלים ומגבלות של השיטה.</w:t>
-      </w:r>
-    </w:p>
-    <w:p>
-      <w:pPr>
-        <w:bidi/>
-        <w:pStyle w:val="Heading3"/>
-        <w:jc w:val="right"/>
-      </w:pPr>
-      <w:r/>
-      <w:r>
-        <w:rPr>
-          <w:rFonts w:ascii="Arial" w:hAnsi="Arial" w:cs="Arial"/>
-          <w:rtl/>
-        </w:rPr>
-        <w:t>UHR</w:t>
-      </w:r>
-    </w:p>
-    <w:p>
-      <w:pPr>
-        <w:bidi/>
-        <w:jc w:val="right"/>
-      </w:pPr>
-      <w:r>
-        <w:rPr>
-          <w:rFonts w:ascii="Arial" w:hAnsi="Arial" w:cs="Arial"/>
-          <w:rtl/>
-        </w:rPr>
-        <w:t>Unidentified human remains, כלומר שרידים אנושיים שטרם זוהו [3].</w:t>
-      </w:r>
-    </w:p>
-    <w:p>
-      <w:pPr>
-        <w:bidi/>
-        <w:pStyle w:val="Heading3"/>
-        <w:jc w:val="right"/>
-      </w:pPr>
-      <w:r/>
-      <w:r>
-        <w:rPr>
-          <w:rFonts w:ascii="Arial" w:hAnsi="Arial" w:cs="Arial"/>
-          <w:rtl/>
-        </w:rPr>
-        <w:t>Proof of life evidence</w:t>
-      </w:r>
-    </w:p>
-    <w:p>
-      <w:pPr>
-        <w:bidi/>
-        <w:jc w:val="right"/>
-      </w:pPr>
-      <w:r>
-        <w:rPr>
-          <w:rFonts w:ascii="Arial" w:hAnsi="Arial" w:cs="Arial"/>
-          <w:rtl/>
-        </w:rPr>
-        <w:t>ראיות תיעודיות או היסטוריות המסייעות לקשור זהות מסוימת לאדם שחי בעבר, כחלק מן התהליך הגנאלוגי־היסטורי [4].</w:t>
-      </w:r>
-    </w:p>
-    <w:p>
-      <w:pPr>
-        <w:bidi/>
-        <w:pStyle w:val="Heading3"/>
-        <w:jc w:val="right"/>
-      </w:pPr>
-      <w:r/>
-      <w:r>
-        <w:rPr>
-          <w:rFonts w:ascii="Arial" w:hAnsi="Arial" w:cs="Arial"/>
-          <w:rtl/>
-        </w:rPr>
-        <w:t>Conclusive lead</w:t>
-      </w:r>
-    </w:p>
-    <w:p>
-      <w:pPr>
-        <w:bidi/>
-        <w:jc w:val="right"/>
-      </w:pPr>
-      <w:r>
-        <w:rPr>
-          <w:rFonts w:ascii="Arial" w:hAnsi="Arial" w:cs="Arial"/>
-          <w:rtl/>
-        </w:rPr>
-        <w:t>lead חקירתי ממוקד מאוד, שלעיתים מצמצם את החיפוש למועמד אחד או למספר קטן מאוד של מועמדים [1].</w:t>
-      </w:r>
-    </w:p>
-    <w:p>
-      <w:pPr>
-        <w:bidi/>
-        <w:pStyle w:val="Heading2"/>
-        <w:jc w:val="right"/>
-      </w:pPr>
-      <w:r/>
-      <w:r>
-        <w:rPr>
-          <w:rFonts w:ascii="Arial" w:hAnsi="Arial" w:cs="Arial"/>
-          <w:rtl/>
-        </w:rPr>
-        <w:t>קריאה להעמקה</w:t>
-      </w:r>
-    </w:p>
-    <w:p>
-      <w:pPr>
-        <w:bidi/>
-        <w:pStyle w:val="Heading3"/>
-        <w:jc w:val="right"/>
-      </w:pPr>
-      <w:r/>
-      <w:r>
-        <w:rPr>
-          <w:rFonts w:ascii="Arial" w:hAnsi="Arial" w:cs="Arial"/>
-          <w:rtl/>
-        </w:rPr>
-        <w:t xml:space="preserve">A. Tillmar, S. Fagerholm, J. Staaf, P. Sjölund, and R. Ansell, “Getting the conclusive lead with investigative genetic genealogy - A successful case study of a 16 year old double murder in Sweden.” </w:t>
-      </w:r>
-      <w:r>
-        <w:rPr>
-          <w:rtl/>
-          <w:rFonts w:ascii="Arial" w:hAnsi="Arial" w:cs="Arial"/>
-          <w:i/>
-        </w:rPr>
-        <w:t>Forensic science international. Genetics</w:t>
-      </w:r>
-      <w:r>
-        <w:rPr>
-          <w:rFonts w:ascii="Arial" w:hAnsi="Arial" w:cs="Arial"/>
-          <w:rtl/>
-        </w:rPr>
-        <w:t xml:space="preserve">, vol. 53, pp. 102525, May 2021, doi: </w:t>
-      </w:r>
-      <w:r>
-        <w:rPr>
-          <w:rtl/>
-          <w:rFonts w:ascii="Arial" w:hAnsi="Arial" w:cs="Arial"/>
+        <w:t>References</w:t>
+      </w:r>
+    </w:p>
+    <w:p>
+      <w:pPr>
+        <w:jc w:val="left"/>
+      </w:pPr>
+      <w:r>
+        <w:rPr>
           <w:color w:val="0000FF"/>
           <w:u w:val="single"/>
         </w:rPr>
-        <w:t>10.1016/j.fsigen.2021.102525</w:t>
-      </w:r>
-      <w:r>
-        <w:rPr>
-          <w:rFonts w:ascii="Arial" w:hAnsi="Arial" w:cs="Arial"/>
-          <w:rtl/>
-        </w:rPr>
+        <w:t>1] A. Tillmar, S. Fagerholm, J. Staaf, P. Sjölund, and R. Ansell, “Getting the conclusive lead with investigative genetic genealogy - A successful case study of a 16 year old double murder in Sweden.” *Forensic science international. Genetics*, vol. 53, pp. 102525, May 2021, doi: [10.1016/j.fsigen.2021.102525</w:t>
+      </w:r>
+      <w:r>
         <w:t>.</w:t>
       </w:r>
     </w:p>
     <w:p>
       <w:pPr>
-        <w:bidi/>
-        <w:jc w:val="right"/>
-      </w:pPr>
-      <w:r>
-        <w:rPr>
-          <w:rFonts w:ascii="Arial" w:hAnsi="Arial" w:cs="Arial"/>
-          <w:rtl/>
-        </w:rPr>
-        <w:t>אחד מתיאורי המקרה המרכזיים של IGG בתיק פלילי. המאמר מתאים במיוחד להעמקה בפתרון תיק רצח קר, בהתמודדות עם DNA מאתגר, ובהעברה מן genealogy אל אימות STR.</w:t>
-      </w:r>
-    </w:p>
-    <w:p>
-      <w:pPr>
-        <w:bidi/>
-        <w:pStyle w:val="Heading3"/>
-        <w:jc w:val="right"/>
-      </w:pPr>
-      <w:r/>
-      <w:r>
-        <w:rPr>
-          <w:rFonts w:ascii="Arial" w:hAnsi="Arial" w:cs="Arial"/>
-          <w:rtl/>
-        </w:rPr>
-        <w:t xml:space="preserve">A. Tillmar, P. Sjölund, B. Lundqvist, T. Klippmark, C. Älgenäs, and H. Gréen, “Whole-genome sequencing of human remains to enable genealogy DNA database searches - A case report.” </w:t>
-      </w:r>
-      <w:r>
-        <w:rPr>
-          <w:rtl/>
-          <w:rFonts w:ascii="Arial" w:hAnsi="Arial" w:cs="Arial"/>
-          <w:i/>
-        </w:rPr>
-        <w:t>Forensic science international. Genetics</w:t>
-      </w:r>
-      <w:r>
-        <w:rPr>
-          <w:rFonts w:ascii="Arial" w:hAnsi="Arial" w:cs="Arial"/>
-          <w:rtl/>
-        </w:rPr>
-        <w:t xml:space="preserve">, vol. 46, pp. 102233, Jan. 2020, doi: </w:t>
-      </w:r>
-      <w:r>
-        <w:rPr>
-          <w:rtl/>
-          <w:rFonts w:ascii="Arial" w:hAnsi="Arial" w:cs="Arial"/>
+        <w:jc w:val="left"/>
+      </w:pPr>
+      <w:r>
+        <w:rPr>
           <w:color w:val="0000FF"/>
           <w:u w:val="single"/>
         </w:rPr>
-        <w:t>10.1016/j.fsigen.2020.102233</w:t>
-      </w:r>
-      <w:r>
-        <w:rPr>
-          <w:rFonts w:ascii="Arial" w:hAnsi="Arial" w:cs="Arial"/>
-          <w:rtl/>
-        </w:rPr>
+        <w:t>2] A. Tillmar, P. Sjölund, B. Lundqvist, T. Klippmark, C. Älgenäs, and H. Gréen, “Whole-genome sequencing of human remains to enable genealogy DNA database searches - A case report.” *Forensic science international. Genetics*, vol. 46, pp. 102233, Jan. 2020, doi: [10.1016/j.fsigen.2020.102233</w:t>
+      </w:r>
+      <w:r>
         <w:t>.</w:t>
       </w:r>
     </w:p>
     <w:p>
       <w:pPr>
-        <w:bidi/>
-        <w:jc w:val="right"/>
-      </w:pPr>
-      <w:r>
-        <w:rPr>
-          <w:rFonts w:ascii="Arial" w:hAnsi="Arial" w:cs="Arial"/>
-          <w:rtl/>
-        </w:rPr>
-        <w:t>מקרה מפתח להבנת זיהוי שרידים באמצעות WGS ו־GEDmatch. זהו מקור חשוב במיוחד להעמקה בצד המעבדתי של case-based FIGG.</w:t>
-      </w:r>
-    </w:p>
-    <w:p>
-      <w:pPr>
-        <w:bidi/>
-        <w:pStyle w:val="Heading3"/>
-        <w:jc w:val="right"/>
-      </w:pPr>
-      <w:r/>
-      <w:r>
-        <w:rPr>
-          <w:rFonts w:ascii="Arial" w:hAnsi="Arial" w:cs="Arial"/>
-          <w:rtl/>
-        </w:rPr>
-        <w:t xml:space="preserve">H. Aanes </w:t>
-      </w:r>
-      <w:r>
-        <w:rPr>
-          <w:rtl/>
-          <w:rFonts w:ascii="Arial" w:hAnsi="Arial" w:cs="Arial"/>
-          <w:i/>
-        </w:rPr>
-        <w:t>et al.</w:t>
-      </w:r>
-      <w:r>
-        <w:rPr>
-          <w:rFonts w:ascii="Arial" w:hAnsi="Arial" w:cs="Arial"/>
-          <w:rtl/>
-        </w:rPr>
-        <w:t xml:space="preserve">, “Heating up three cold cases in Norway using investigative genetic genealogy.” </w:t>
-      </w:r>
-      <w:r>
-        <w:rPr>
-          <w:rtl/>
-          <w:rFonts w:ascii="Arial" w:hAnsi="Arial" w:cs="Arial"/>
-          <w:i/>
-        </w:rPr>
-        <w:t>Forensic science international. Genetics</w:t>
-      </w:r>
-      <w:r>
-        <w:rPr>
-          <w:rFonts w:ascii="Arial" w:hAnsi="Arial" w:cs="Arial"/>
-          <w:rtl/>
-        </w:rPr>
-        <w:t xml:space="preserve">, vol. 76, pp. 103217, Dec. 2024, doi: </w:t>
-      </w:r>
-      <w:r>
-        <w:rPr>
-          <w:rtl/>
-          <w:rFonts w:ascii="Arial" w:hAnsi="Arial" w:cs="Arial"/>
+        <w:jc w:val="left"/>
+      </w:pPr>
+      <w:r>
+        <w:rPr>
           <w:color w:val="0000FF"/>
           <w:u w:val="single"/>
         </w:rPr>
-        <w:t>10.1016/j.fsigen.2024.103217</w:t>
-      </w:r>
-      <w:r>
-        <w:rPr>
-          <w:rFonts w:ascii="Arial" w:hAnsi="Arial" w:cs="Arial"/>
-          <w:rtl/>
-        </w:rPr>
+        <w:t>3] A. R. Michael, S. Blatt, M. I. Isa, A. Redgrave, and D. Ubelaker, “Identification of a decedent in a 103-year-old homicide case using forensic anthropology and genetic genealogy,” *Forensic Sciences Research*, vol. 7, pp. 412–426, Mar. 2022, doi: [10.1080/20961790.2022.2034717</w:t>
+      </w:r>
+      <w:r>
         <w:t>.</w:t>
       </w:r>
     </w:p>
     <w:p>
       <w:pPr>
-        <w:bidi/>
-        <w:jc w:val="right"/>
-      </w:pPr>
-      <w:r>
-        <w:rPr>
-          <w:rFonts w:ascii="Arial" w:hAnsi="Arial" w:cs="Arial"/>
-          <w:rtl/>
-        </w:rPr>
-        <w:t>מאמר חשוב משום שהוא מציג שלושה תיקים ולא רק הצלחה אחת, כולל מקרה שלא נפתר. מתאים במיוחד להעמקה בהשוואה בין outcomes שונים של אותו workflow.</w:t>
-      </w:r>
-    </w:p>
-    <w:p>
-      <w:pPr>
-        <w:bidi/>
-        <w:pStyle w:val="Heading3"/>
-        <w:jc w:val="right"/>
-      </w:pPr>
-      <w:r/>
-      <w:r>
-        <w:rPr>
-          <w:rFonts w:ascii="Arial" w:hAnsi="Arial" w:cs="Arial"/>
-          <w:rtl/>
-        </w:rPr>
-        <w:t xml:space="preserve">A. R. Michael, S. Blatt, M. I. Isa, A. Redgrave, and D. Ubelaker, “Identification of a decedent in a 103-year-old homicide case using forensic anthropology and genetic genealogy,” </w:t>
-      </w:r>
-      <w:r>
-        <w:rPr>
-          <w:rtl/>
-          <w:rFonts w:ascii="Arial" w:hAnsi="Arial" w:cs="Arial"/>
-          <w:i/>
-        </w:rPr>
-        <w:t>Forensic Sciences Research</w:t>
-      </w:r>
-      <w:r>
-        <w:rPr>
-          <w:rFonts w:ascii="Arial" w:hAnsi="Arial" w:cs="Arial"/>
-          <w:rtl/>
-        </w:rPr>
-        <w:t xml:space="preserve">, vol. 7, pp. 412–426, Mar. 2022, doi: </w:t>
-      </w:r>
-      <w:r>
-        <w:rPr>
-          <w:rtl/>
-          <w:rFonts w:ascii="Arial" w:hAnsi="Arial" w:cs="Arial"/>
+        <w:jc w:val="left"/>
+      </w:pPr>
+      <w:r>
+        <w:rPr>
           <w:color w:val="0000FF"/>
           <w:u w:val="single"/>
         </w:rPr>
-        <w:t>10.1080/20961790.2022.2034717</w:t>
-      </w:r>
-      <w:r>
-        <w:rPr>
-          <w:rFonts w:ascii="Arial" w:hAnsi="Arial" w:cs="Arial"/>
-          <w:rtl/>
-        </w:rPr>
+        <w:t>4] R. Canada, “Solving a Compound Unknown Parentage Using Genetic Genealogy: A Case Study,” *Forensic Genomics*, vol. 2, pp. 21–24, Mar. 2022, doi: [10.1089/forensic.2022.0002</w:t>
+      </w:r>
+      <w:r>
         <w:t>.</w:t>
       </w:r>
     </w:p>
     <w:p>
       <w:pPr>
-        <w:bidi/>
-        <w:jc w:val="right"/>
-      </w:pPr>
-      <w:r>
-        <w:rPr>
-          <w:rFonts w:ascii="Arial" w:hAnsi="Arial" w:cs="Arial"/>
-          <w:rtl/>
-        </w:rPr>
-        <w:t>מקרה בין־תחומי יוצא דופן של זיהוי בתיק רצח בן יותר ממאה שנה. מתאים להעמקה בחיבור בין forensic anthropology, genealogy ותיעוד היסטורי.</w:t>
-      </w:r>
-    </w:p>
-    <w:p>
-      <w:pPr>
-        <w:bidi/>
-        <w:pStyle w:val="Heading3"/>
-        <w:jc w:val="right"/>
-      </w:pPr>
-      <w:r/>
-      <w:r>
-        <w:rPr>
-          <w:rFonts w:ascii="Arial" w:hAnsi="Arial" w:cs="Arial"/>
-          <w:rtl/>
-        </w:rPr>
-        <w:t xml:space="preserve">E. Greytak, S. Wyatt, J. Cady, C. Moore, and S. Armentrout, “Investigative genetic genealogy for human remains identification,” </w:t>
-      </w:r>
-      <w:r>
-        <w:rPr>
-          <w:rtl/>
-          <w:rFonts w:ascii="Arial" w:hAnsi="Arial" w:cs="Arial"/>
-          <w:i/>
-        </w:rPr>
-        <w:t>Journal of Forensic Sciences</w:t>
-      </w:r>
-      <w:r>
-        <w:rPr>
-          <w:rFonts w:ascii="Arial" w:hAnsi="Arial" w:cs="Arial"/>
-          <w:rtl/>
-        </w:rPr>
-        <w:t xml:space="preserve">, vol. 69, pp. 1531–1545, Feb. 2024, doi: </w:t>
-      </w:r>
-      <w:r>
-        <w:rPr>
-          <w:rtl/>
-          <w:rFonts w:ascii="Arial" w:hAnsi="Arial" w:cs="Arial"/>
+        <w:jc w:val="left"/>
+      </w:pPr>
+      <w:r>
+        <w:rPr>
           <w:color w:val="0000FF"/>
           <w:u w:val="single"/>
         </w:rPr>
-        <w:t>10.1111/1556-4029.15469</w:t>
-      </w:r>
-      <w:r>
-        <w:rPr>
-          <w:rFonts w:ascii="Arial" w:hAnsi="Arial" w:cs="Arial"/>
-          <w:rtl/>
-        </w:rPr>
+        <w:t>5] E. Greytak, C. Moore, and S. Armentrout, “Genetic genealogy for cold case and active investigations.” *Forensic science international*, vol. 299, pp. 103–113, Jun. 2019, doi: [10.1016/J.FORSCIINT.2019.03.039</w:t>
+      </w:r>
+      <w:r>
         <w:t>.</w:t>
       </w:r>
     </w:p>
     <w:p>
       <w:pPr>
-        <w:bidi/>
-        <w:jc w:val="right"/>
-      </w:pPr>
-      <w:r>
-        <w:rPr>
-          <w:rFonts w:ascii="Arial" w:hAnsi="Arial" w:cs="Arial"/>
-          <w:rtl/>
-        </w:rPr>
-        <w:t>סקירה עדכנית על IGG בזיהוי שרידים, הכוללת גם case studies. מתאימה במיוחד להעמקה בדפוסים החוזרים של workflow בזיהוי UHR.</w:t>
-      </w:r>
-    </w:p>
-    <w:p>
-      <w:pPr>
-        <w:bidi/>
-        <w:pStyle w:val="Heading3"/>
-        <w:jc w:val="right"/>
-      </w:pPr>
-      <w:r/>
-      <w:r>
-        <w:rPr>
-          <w:rFonts w:ascii="Arial" w:hAnsi="Arial" w:cs="Arial"/>
-          <w:rtl/>
-        </w:rPr>
-        <w:t xml:space="preserve">E. Greytak, C. Moore, and S. Armentrout, “Genetic genealogy for cold case and active investigations.” </w:t>
-      </w:r>
-      <w:r>
-        <w:rPr>
-          <w:rtl/>
-          <w:rFonts w:ascii="Arial" w:hAnsi="Arial" w:cs="Arial"/>
-          <w:i/>
-        </w:rPr>
-        <w:t>Forensic science international</w:t>
-      </w:r>
-      <w:r>
-        <w:rPr>
-          <w:rFonts w:ascii="Arial" w:hAnsi="Arial" w:cs="Arial"/>
-          <w:rtl/>
-        </w:rPr>
-        <w:t xml:space="preserve">, vol. 299, pp. 103–113, Jun. 2019, doi: </w:t>
-      </w:r>
-      <w:r>
-        <w:rPr>
-          <w:rtl/>
-          <w:rFonts w:ascii="Arial" w:hAnsi="Arial" w:cs="Arial"/>
+        <w:jc w:val="left"/>
+      </w:pPr>
+      <w:r>
+        <w:rPr>
           <w:color w:val="0000FF"/>
           <w:u w:val="single"/>
         </w:rPr>
-        <w:t>10.1016/J.FORSCIINT.2019.03.039</w:t>
-      </w:r>
-      <w:r>
-        <w:rPr>
-          <w:rFonts w:ascii="Arial" w:hAnsi="Arial" w:cs="Arial"/>
-          <w:rtl/>
-        </w:rPr>
+        <w:t>6] H. Aanes *et al.*, “Heating up three cold cases in Norway using investigative genetic genealogy.” *Forensic science international. Genetics*, vol. 76, pp. 103217, Dec. 2024, doi: [10.1016/j.fsigen.2024.103217</w:t>
+      </w:r>
+      <w:r>
         <w:t>.</w:t>
       </w:r>
     </w:p>
     <w:p>
       <w:pPr>
-        <w:bidi/>
-        <w:jc w:val="right"/>
-      </w:pPr>
-      <w:r>
-        <w:rPr>
-          <w:rFonts w:ascii="Arial" w:hAnsi="Arial" w:cs="Arial"/>
-          <w:rtl/>
-        </w:rPr>
-        <w:t>מאמר יסוד חשוב להבנת מגוון המקרים שבהם IGG יכול או אינו יכול להצליח. מתאים במיוחד לקריאה ביקורתית של מגבלות השיטה מעבר למקרי ההצלחה הבולטים.</w:t>
-      </w:r>
-    </w:p>
-    <w:p>
-      <w:pPr>
-        <w:bidi/>
-        <w:pStyle w:val="Heading3"/>
-        <w:jc w:val="right"/>
-      </w:pPr>
-      <w:r/>
-      <w:r>
-        <w:rPr>
-          <w:rFonts w:ascii="Arial" w:hAnsi="Arial" w:cs="Arial"/>
-          <w:rtl/>
-        </w:rPr>
-        <w:t xml:space="preserve">R. Canada, “Solving a Compound Unknown Parentage Using Genetic Genealogy: A Case Study,” </w:t>
-      </w:r>
-      <w:r>
-        <w:rPr>
-          <w:rtl/>
-          <w:rFonts w:ascii="Arial" w:hAnsi="Arial" w:cs="Arial"/>
-          <w:i/>
-        </w:rPr>
-        <w:t>Forensic Genomics</w:t>
-      </w:r>
-      <w:r>
-        <w:rPr>
-          <w:rFonts w:ascii="Arial" w:hAnsi="Arial" w:cs="Arial"/>
-          <w:rtl/>
-        </w:rPr>
-        <w:t xml:space="preserve">, vol. 2, pp. 21–24, Mar. 2022, doi: </w:t>
-      </w:r>
-      <w:r>
-        <w:rPr>
-          <w:rtl/>
-          <w:rFonts w:ascii="Arial" w:hAnsi="Arial" w:cs="Arial"/>
+        <w:jc w:val="left"/>
+      </w:pPr>
+      <w:r>
+        <w:rPr>
           <w:color w:val="0000FF"/>
           <w:u w:val="single"/>
         </w:rPr>
-        <w:t>10.1089/forensic.2022.0002</w:t>
-      </w:r>
-      <w:r>
-        <w:rPr>
-          <w:rFonts w:ascii="Arial" w:hAnsi="Arial" w:cs="Arial"/>
-          <w:rtl/>
-        </w:rPr>
-        <w:t>.</w:t>
-      </w:r>
-    </w:p>
-    <w:p>
-      <w:pPr>
-        <w:bidi/>
-        <w:jc w:val="right"/>
-      </w:pPr>
-      <w:r>
-        <w:rPr>
-          <w:rFonts w:ascii="Arial" w:hAnsi="Arial" w:cs="Arial"/>
-          <w:rtl/>
-        </w:rPr>
-        <w:t>מקרה קצר אך שימושי מאוד להמחשת הלוגיקה של genetic genealogy מחוץ לזירה הפלילית, ובפרט כאשר יש unknown parentage רב־שכבתי.</w:t>
-      </w:r>
-    </w:p>
-    <w:p>
-      <w:pPr>
-        <w:bidi/>
-        <w:jc w:val="right"/>
-      </w:pPr>
-      <w:r>
-        <w:t>__________________________________________________</w:t>
-      </w:r>
-    </w:p>
-    <w:p>
-      <w:pPr>
-        <w:pStyle w:val="Heading2"/>
-        <w:jc w:val="left"/>
-      </w:pPr>
-      <w:r/>
-      <w:r>
-        <w:t>References</w:t>
-      </w:r>
-    </w:p>
-    <w:p>
-      <w:pPr>
-        <w:jc w:val="left"/>
-      </w:pPr>
-      <w:r>
-        <w:rPr>
-          <w:color w:val="0000FF"/>
-          <w:u w:val="single"/>
-        </w:rPr>
-        <w:t>1] A. Tillmar, S. Fagerholm, J. Staaf, P. Sjölund, and R. Ansell, “Getting the conclusive lead with investigative genetic genealogy - A successful case study of a 16 year old double murder in Sweden.” *Forensic science international. Genetics*, vol. 53, pp. 102525, May 2021, doi: [10.1016/j.fsigen.2021.102525</w:t>
-      </w:r>
-      <w:r>
-        <w:t>.</w:t>
-      </w:r>
-    </w:p>
-    <w:p>
-      <w:pPr>
-        <w:jc w:val="left"/>
-      </w:pPr>
-      <w:r>
-        <w:rPr>
-          <w:color w:val="0000FF"/>
-          <w:u w:val="single"/>
-        </w:rPr>
-        <w:t>2] A. Tillmar, P. Sjölund, B. Lundqvist, T. Klippmark, C. Älgenäs, and H. Gréen, “Whole-genome sequencing of human remains to enable genealogy DNA database searches - A case report.” *Forensic science international. Genetics*, vol. 46, pp. 102233, Jan. 2020, doi: [10.1016/j.fsigen.2020.102233</w:t>
-      </w:r>
-      <w:r>
-        <w:t>.</w:t>
-      </w:r>
-    </w:p>
-    <w:p>
-      <w:pPr>
-        <w:jc w:val="left"/>
-      </w:pPr>
-      <w:r>
-        <w:rPr>
-          <w:color w:val="0000FF"/>
-          <w:u w:val="single"/>
-        </w:rPr>
-        <w:t>3] E. Greytak, S. Wyatt, J. Cady, C. Moore, and S. Armentrout, “Investigative genetic genealogy for human remains identification,” *Journal of Forensic Sciences*, vol. 69, pp. 1531–1545, Feb. 2024, doi: [10.1111/1556-4029.15469</w:t>
-      </w:r>
-      <w:r>
-        <w:t>.</w:t>
-      </w:r>
-    </w:p>
-    <w:p>
-      <w:pPr>
-        <w:jc w:val="left"/>
-      </w:pPr>
-      <w:r>
-        <w:rPr>
-          <w:color w:val="0000FF"/>
-          <w:u w:val="single"/>
-        </w:rPr>
-        <w:t>4] A. R. Michael, S. Blatt, M. I. Isa, A. Redgrave, and D. Ubelaker, “Identification of a decedent in a 103-year-old homicide case using forensic anthropology and genetic genealogy,” *Forensic Sciences Research*, vol. 7, pp. 412–426, Mar. 2022, doi: [10.1080/20961790.2022.2034717</w:t>
-      </w:r>
-      <w:r>
-        <w:t>.</w:t>
-      </w:r>
-    </w:p>
-    <w:p>
-      <w:pPr>
-        <w:jc w:val="left"/>
-      </w:pPr>
-      <w:r>
-        <w:rPr>
-          <w:color w:val="0000FF"/>
-          <w:u w:val="single"/>
-        </w:rPr>
-        <w:t>5] R. Canada, “Solving a Compound Unknown Parentage Using Genetic Genealogy: A Case Study,” *Forensic Genomics*, vol. 2, pp. 21–24, Mar. 2022, doi: [10.1089/forensic.2022.0002</w:t>
-      </w:r>
-      <w:r>
-        <w:t>.</w:t>
-      </w:r>
-    </w:p>
-    <w:p>
-      <w:pPr>
-        <w:jc w:val="left"/>
-      </w:pPr>
-      <w:r>
-        <w:rPr>
-          <w:color w:val="0000FF"/>
-          <w:u w:val="single"/>
-        </w:rPr>
-        <w:t>6] E. Greytak, C. Moore, and S. Armentrout, “Genetic genealogy for cold case and active investigations.” *Forensic science international*, vol. 299, pp. 103–113, Jun. 2019, doi: [10.1016/J.FORSCIINT.2019.03.039</w:t>
-      </w:r>
-      <w:r>
-        <w:t>.</w:t>
-      </w:r>
-    </w:p>
-    <w:p>
-      <w:pPr>
-        <w:jc w:val="left"/>
-      </w:pPr>
-      <w:r>
-        <w:rPr>
-          <w:color w:val="0000FF"/>
-          <w:u w:val="single"/>
-        </w:rPr>
-        <w:t>7] M. S. Ertürk, C. Fitzpatrick, M. Press, and L. Wein, “Analysis of the genealogy process in forensic genetic genealogy,” *Journal of Forensic Sciences*, vol. 67, pp. 2218–2229, Sep. 2022, doi: [10.1111/1556-4029.15127</w:t>
-      </w:r>
-      <w:r>
-        <w:t>.</w:t>
-      </w:r>
-    </w:p>
-    <w:p>
-      <w:pPr>
-        <w:jc w:val="left"/>
-      </w:pPr>
-      <w:r>
-        <w:rPr>
-          <w:color w:val="0000FF"/>
-          <w:u w:val="single"/>
-        </w:rPr>
-        <w:t>8] H. Aanes *et al.*, “Heating up three cold cases in Norway using investigative genetic genealogy.” *Forensic science international. Genetics*, vol. 76, pp. 103217, Dec. 2024, doi: [10.1016/j.fsigen.2024.103217</w:t>
-      </w:r>
-      <w:r>
-        <w:t>.</w:t>
-      </w:r>
-    </w:p>
-    <w:p>
-      <w:pPr>
-        <w:jc w:val="left"/>
-      </w:pPr>
-      <w:r>
-        <w:rPr>
-          <w:color w:val="0000FF"/>
-          <w:u w:val="single"/>
-        </w:rPr>
-        <w:t>9] D. Kennett, “Using genetic genealogy databases in missing persons cases and to develop suspect leads in violent crimes.” *Forensic science international*, vol. 301, pp. 107–117, Aug. 2019, doi: [10.1016/j.forsciint.2019.05.016</w:t>
+        <w:t>7] E. Greytak, S. Wyatt, J. Cady, C. Moore, and S. Armentrout, “Investigative genetic genealogy for human remains identification,” *Journal of Forensic Sciences*, vol. 69, pp. 1531–1545, Feb. 2024, doi: [10.1111/1556-4029.15469</w:t>
       </w:r>
       <w:r>
         <w:t>.</w:t>
@@ -17731,7 +17285,7 @@
           <w:rFonts w:ascii="Arial" w:hAnsi="Arial" w:cs="Arial"/>
           <w:rtl/>
         </w:rPr>
-        <w:t>פרק 12 היבטים משפטיים ואתיים של FIGG</w:t>
+        <w:t>פרק 12 : היבטים משפטיים ואתיים של FIGG</w:t>
       </w:r>
       <w:bookmarkEnd w:id="chapter_12"/>
     </w:p>
@@ -19990,7 +19544,7 @@
           <w:rFonts w:ascii="Arial" w:hAnsi="Arial" w:cs="Arial"/>
           <w:rtl/>
         </w:rPr>
-        <w:t>פרק 13 FIGG במשטרות בעולם</w:t>
+        <w:t>פרק 13 : FIGG במשטרות בעולם</w:t>
       </w:r>
       <w:bookmarkEnd w:id="chapter_13"/>
     </w:p>
@@ -20257,7 +19811,7 @@
           <w:rFonts w:ascii="Arial" w:hAnsi="Arial" w:cs="Arial"/>
           <w:rtl/>
         </w:rPr>
-        <w:t>ארצות הברית היא זירת ההתפתחות הראשונה והמשפיעה ביותר של FIGG. לפי Gre19, עד תחילת 2019 כבר פורסמו עשרות זיהויים או leads בתיקי cold case וחקירות פעילות, בעיקר בתיקי רצח ואונס חמורים [3]. גם Kli21 מתאר את ארצות הברית כזירה שבה השיטה קיבלה תנופה מהירה והפכה לחלק משמעותי מן השיח הפורנזי [1].</w:t>
+        <w:t>ארצות הברית היא זירת ההתפתחות הראשונה והמשפיעה ביותר של FIGG. לפי גרייטק [3], עד תחילת 2019 כבר פורסמו עשרות זיהויים או leads בתיקי cold case וחקירות פעילות, בעיקר בתיקי רצח ואונס חמורים [3]. גם קלינג [1] מתאר את ארצות הברית כזירה שבה השיטה קיבלה תנופה מהירה והפכה לחלק משמעותי מן השיח הפורנזי [1].</w:t>
       </w:r>
     </w:p>
     <w:p>
@@ -20397,7 +19951,7 @@
           <w:rFonts w:ascii="Arial" w:hAnsi="Arial" w:cs="Arial"/>
           <w:rtl/>
         </w:rPr>
-        <w:t>היתרון המרכזי של המודל האמריקאי היה קדימות היסטורית וגודל מאגרי ההתאמה, במיוחד עבור נבדקים ממוצא אירופי. Gre19 מדווח כי ההסתברות לקבל התאמות usable הייתה גבוהה הרבה יותר עבור אוכלוסיות כאלה, משום שהן היו מיוצגות יותר במאגרי genealogy [3].</w:t>
+        <w:t>היתרון המרכזי של המודל האמריקאי היה קדימות היסטורית וגודל מאגרי ההתאמה, במיוחד עבור נבדקים ממוצא אירופי. גרייטק [3] מדווח כי ההסתברות לקבל התאמות usable הייתה גבוהה הרבה יותר עבור אוכלוסיות כאלה, משום שהן היו מיוצגות יותר במאגרי genealogy [3].</w:t>
       </w:r>
     </w:p>
     <w:p>
@@ -20522,7 +20076,7 @@
           <w:rFonts w:ascii="Arial" w:hAnsi="Arial" w:cs="Arial"/>
           <w:rtl/>
         </w:rPr>
-        <w:t>Til21 מראה שהשימוש ב־IGG בשוודיה לא הוצג כמהלך טכני בלבד, אלא כפיילוט מוסדי שלם. עוד ב־2018 נפתח בירור משפטי בתוך Swedish Police Authority וב־National Forensic Centre, נערכה בחינה של privacy impact, נעשתה היוועצות עם המועצה האתית, ונקבעו criteria למקרים שייכללו [4].</w:t>
+        <w:t>טילמר [4] מראה שהשימוש ב־IGG בשוודיה לא הוצג כמהלך טכני בלבד, אלא כפיילוט מוסדי שלם. עוד ב־2018 נפתח בירור משפטי בתוך Swedish Police Authority וב־National Forensic Centre, נערכה בחינה של privacy impact, נעשתה היוועצות עם המועצה האתית, ונקבעו criteria למקרים שייכללו [4].</w:t>
       </w:r>
     </w:p>
     <w:p>
@@ -20619,7 +20173,7 @@
           <w:rFonts w:ascii="Arial" w:hAnsi="Arial" w:cs="Arial"/>
           <w:rtl/>
         </w:rPr>
-        <w:t>. Til21 מדגיש שהעברת הנתונים לארצות הברית, הצורך במחיקה, ושאלת ההכרחיות היו חלק מן המסגרת כבר בשלב הראשוני [4].</w:t>
+        <w:t>. טילמר [4] מדגיש שהעברת הנתונים לארצות הברית, הצורך במחיקה, ושאלת ההכרחיות היו חלק מן המסגרת כבר בשלב הראשוני [4].</w:t>
       </w:r>
     </w:p>
     <w:p>
@@ -20647,7 +20201,7 @@
           <w:rFonts w:ascii="Arial" w:hAnsi="Arial" w:cs="Arial"/>
           <w:rtl/>
         </w:rPr>
-        <w:t>Ans25 מתאר את השלב הבא בהתפתחות השוודית. לאחר ההצלחה הראשונית ב־2019, המשך השימוש בשיטה עוכב בשנת 2021 בעקבות החלטת רשות הפרטיות השוודית, בין היתר בשל היעדר עיגון חקיקתי מספק ושאלות הנוגעות להעברת מידע רגיש למדינה שלישית [6].</w:t>
+        <w:t>אנסל [6] מתאר את השלב הבא בהתפתחות השוודית. לאחר ההצלחה הראשונית ב־2019, המשך השימוש בשיטה עוכב בשנת 2021 בעקבות החלטת רשות הפרטיות השוודית, בין היתר בשל היעדר עיגון חקיקתי מספק ושאלות הנוגעות להעברת מידע רגיש למדינה שלישית [6].</w:t>
       </w:r>
     </w:p>
     <w:p>
@@ -20716,7 +20270,7 @@
           <w:rFonts w:ascii="Arial" w:hAnsi="Arial" w:cs="Arial"/>
           <w:rtl/>
         </w:rPr>
-        <w:t>נורווגיה מציגה מודל אחר: לא שימוש רחב מוקדם כמו בארצות הברית, ולא מסלול חקיקה מובחן כמו בשוודיה, אלא פיילוט רב־תחומי ומבוסס פרויקט. Aan24 מתאר יישום של FIGG בשלושה תיקים קרים בנורווגיה, עם שני זיהויים מוצלחים ומקרה אחד שלא נפתר [7].</w:t>
+        <w:t>נורווגיה מציגה מודל אחר: לא שימוש רחב מוקדם כמו בארצות הברית, ולא מסלול חקיקה מובחן כמו בשוודיה, אלא פיילוט רב־תחומי ומבוסס פרויקט. אאנס [7] מתאר יישום של FIGG בשלושה תיקים קרים בנורווגיה, עם שני זיהויים מוצלחים ומקרה אחד שלא נפתר [7].</w:t>
       </w:r>
     </w:p>
     <w:p>
@@ -20800,7 +20354,7 @@
           <w:rFonts w:ascii="Arial" w:hAnsi="Arial" w:cs="Arial"/>
           <w:rtl/>
         </w:rPr>
-        <w:t>Aan24 מתאר workflow משולב של WGS, העלאה ל־GEDmatch Pro ול־FTDNA, חיזוי phenotype ו־biogeographical ancestry, ולאחר מכן genealogy קלאסי של ascending ו־descending עד לאימות STR [7].</w:t>
+        <w:t>אאנס [7] מתאר workflow משולב של WGS, העלאה ל־GEDmatch Pro ול־FTDNA, חיזוי phenotype ו־biogeographical ancestry, ולאחר מכן genealogy קלאסי של ascending ו־descending עד לאימות STR [7].</w:t>
       </w:r>
     </w:p>
     <w:p>
@@ -20869,7 +20423,7 @@
           <w:rFonts w:ascii="Arial" w:hAnsi="Arial" w:cs="Arial"/>
           <w:rtl/>
         </w:rPr>
-        <w:t>עם זאת, Aan24 מדגיש גם את המחיר המבצעי. אחד המקרים נפתר תוך 10–15 שעות עבודה לאחר קבלת התאמה חזקה, אך מקרה אחר דרש 2,000–3,000 שעות מצטברות לאורך כשנה [7]. זהו שיעור חשוב: אימוץ משטרתי של FIGG דורש לא רק permission משפטי, אלא גם הקצאת כוח אדם וזמן חקירה ממשיים.</w:t>
+        <w:t>עם זאת, אאנס [7] מדגיש גם את המחיר המבצעי. אחד המקרים נפתר תוך 10–15 שעות עבודה לאחר קבלת התאמה חזקה, אך מקרה אחר דרש 2,000–3,000 שעות מצטברות לאורך כשנה [7]. זהו שיעור חשוב: אימוץ משטרתי של FIGG דורש לא רק permission משפטי, אלא גם הקצאת כוח אדם וזמן חקירה ממשיים.</w:t>
       </w:r>
     </w:p>
     <w:p>
@@ -20897,33 +20451,33 @@
           <w:rFonts w:ascii="Arial" w:hAnsi="Arial" w:cs="Arial"/>
           <w:rtl/>
         </w:rPr>
-        <w:t>הספרות מצביעה על כך שהשימוש ב־FIGG מתפשט בהדרגה גם מעבר לשלושת המקרים הבולטים הללו, אך עדיין אינו יוצר תמונה עולמית מלאה. Kli21 מזכיר הערכות היתכנות בבריטניה ועבודות על operationalizing FGG באוסטרליה, אך לא תיאור של שגרה משטרתית מבוססת באותה מידה כמו בארצות הברית [1].</w:t>
-      </w:r>
-    </w:p>
-    <w:p>
-      <w:pPr>
-        <w:bidi/>
-        <w:jc w:val="right"/>
-      </w:pPr>
-      <w:r>
-        <w:rPr>
-          <w:rFonts w:ascii="Arial" w:hAnsi="Arial" w:cs="Arial"/>
-          <w:rtl/>
-        </w:rPr>
-        <w:t>Sam26 מתאר שבעה מקרים מנותחים מארצות הברית, ספרד, שוודיה ואסטוניה, ומציג את FIGG ככלי שכבר חצה את גבולות צפון אמריקה, אך עדיין תלוי מאוד במסגרת החוק המקומית, בנגישות למאגרים ובקבלה חברתית [8].</w:t>
-      </w:r>
-    </w:p>
-    <w:p>
-      <w:pPr>
-        <w:bidi/>
-        <w:jc w:val="right"/>
-      </w:pPr>
-      <w:r>
-        <w:rPr>
-          <w:rFonts w:ascii="Arial" w:hAnsi="Arial" w:cs="Arial"/>
-          <w:rtl/>
-        </w:rPr>
-        <w:t>גם Mey25, אף שאינו עוסק ישירות ביישום FIGG, חשוב כעדות למוכנות מערכתית. המחקר מראה שבדנמרק מזוהים בכל שנה בערך 850 פרופילים חד־תורמיים מתיקי אלימות שלא הובילו להתאמה במאגר הלאומי, ואשר עשויים להיות מועמדים ל־forensic DNA intelligence, כולל FIGG [10]. מכאן עולה שמדינות נוספות עשויות לעבור בעתיד ממדידת צורך תפעולי לאימוץ מעשי.</w:t>
+        <w:t>הספרות מצביעה על כך שהשימוש ב־FIGG מתפשט בהדרגה גם מעבר לשלושת המקרים הבולטים הללו, אך עדיין אינו יוצר תמונה עולמית מלאה. קלינג [1] מזכיר הערכות היתכנות בבריטניה ועבודות על operationalizing FGG באוסטרליה, אך לא תיאור של שגרה משטרתית מבוססת באותה מידה כמו בארצות הברית [1].</w:t>
+      </w:r>
+    </w:p>
+    <w:p>
+      <w:pPr>
+        <w:bidi/>
+        <w:jc w:val="right"/>
+      </w:pPr>
+      <w:r>
+        <w:rPr>
+          <w:rFonts w:ascii="Arial" w:hAnsi="Arial" w:cs="Arial"/>
+          <w:rtl/>
+        </w:rPr>
+        <w:t>סמינו-גומז [8] מתאר שבעה מקרים מנותחים מארצות הברית, ספרד, שוודיה ואסטוניה, ומציג את FIGG ככלי שכבר חצה את גבולות צפון אמריקה, אך עדיין תלוי מאוד במסגרת החוק המקומית, בנגישות למאגרים ובקבלה חברתית [8].</w:t>
+      </w:r>
+    </w:p>
+    <w:p>
+      <w:pPr>
+        <w:bidi/>
+        <w:jc w:val="right"/>
+      </w:pPr>
+      <w:r>
+        <w:rPr>
+          <w:rFonts w:ascii="Arial" w:hAnsi="Arial" w:cs="Arial"/>
+          <w:rtl/>
+        </w:rPr>
+        <w:t>גם מאייר [10], אף שאינו עוסק ישירות ביישום FIGG, חשוב כעדות למוכנות מערכתית. המחקר מראה שבדנמרק מזוהים בכל שנה בערך 850 פרופילים חד־תורמיים מתיקי אלימות שלא הובילו להתאמה במאגר הלאומי, ואשר עשויים להיות מועמדים ל־forensic DNA intelligence, כולל FIGG [10]. מכאן עולה שמדינות נוספות עשויות לעבור בעתיד ממדידת צורך תפעולי לאימוץ מעשי.</w:t>
       </w:r>
     </w:p>
     <w:p>
@@ -22555,7 +22109,7 @@
           <w:rFonts w:ascii="Arial" w:hAnsi="Arial" w:cs="Arial"/>
           <w:rtl/>
         </w:rPr>
-        <w:t>פרק 14 תקנים בקרה ואבטחת איכות ב FIGG</w:t>
+        <w:t>פרק 14 : תקנים בקרה ואבטחת איכות ב FIGG</w:t>
       </w:r>
       <w:bookmarkEnd w:id="chapter_14"/>
     </w:p>
@@ -23306,7 +22860,7 @@
           <w:rFonts w:ascii="Arial" w:hAnsi="Arial" w:cs="Arial"/>
           <w:rtl/>
         </w:rPr>
-        <w:t>בדיוק מסיבה זו מחקרי validation על Global Screening Array ועל ForenSeq Kintelligence חשובים מאוד ל־FIGG. Rus22 הראה שאפשר להפעיל את GSA גם במעבדה פורנזית, אך תוך תשומת לב קפדנית לספי קלט, call rates ואיכות הדגימה [8]. Pec22 ו־Ant24 הראו כי Kintelligence, יחד עם MiSeq FGx ו־Universal Analysis Software, יכול להשתלב היטב במעבדות פורנזיות לצורכי FGG, בתנאי שנשמרים מדדי QC מוגדרים ונבדקת התאמה לדגימות low-input ו־degraded [6], [7].</w:t>
+        <w:t>בדיוק מסיבה זו מחקרי validation על Global Screening Array ועל ForenSeq Kintelligence חשובים מאוד ל־FIGG. ראסל [8] הראה שאפשר להפעיל את GSA גם במעבדה פורנזית, אך תוך תשומת לב קפדנית לספי קלט, call rates ואיכות הדגימה [8]. פק [6] ו־אנטונס [7] הראו כי Kintelligence, יחד עם MiSeq FGx ו־Universal Analysis Software, יכול להשתלב היטב במעבדות פורנזיות לצורכי FGG, בתנאי שנשמרים מדדי QC מוגדרים ונבדקת התאמה לדגימות low-input ו־מפורקות [6], [7].</w:t>
       </w:r>
     </w:p>
     <w:p>
@@ -23700,7 +23254,7 @@
           <w:rFonts w:ascii="Arial" w:hAnsi="Arial" w:cs="Arial"/>
           <w:rtl/>
         </w:rPr>
-        <w:t>Kli21 מוסיף כי גם מדדים כמו allelic balance, Q-score ויחס forward/reverse חשובים במיוחד כאשר מנסים להעריך אם פרופיל MPS מתאים להסקת קרבה [1].</w:t>
+        <w:t>קלינג [1] מוסיף כי גם מדדים כמו allelic balance, Q-score ויחס forward/reverse חשובים במיוחד כאשר מנסים להעריך אם פרופיל MPS מתאים להסקת קרבה [1].</w:t>
       </w:r>
     </w:p>
     <w:p>
@@ -23728,33 +23282,33 @@
           <w:rFonts w:ascii="Arial" w:hAnsi="Arial" w:cs="Arial"/>
           <w:rtl/>
         </w:rPr>
-        <w:t>אחד הלקחים החוזרים ביותר בספרות הוא שאיכות דגימה היא צוואר הבקבוק הראשי. Microarray עשוי להצליח היטב בדגימות טובות יחסית, אך הוא רגיש יותר ל־compromised DNA [1], [9]. דגימות degraded במיוחד, low template או skeletal remains דוחפות לעיתים קרובות לכיוון WGS או targeted capture/panel workflows [1], [3], [11].</w:t>
-      </w:r>
-    </w:p>
-    <w:p>
-      <w:pPr>
-        <w:bidi/>
-        <w:jc w:val="right"/>
-      </w:pPr>
-      <w:r>
-        <w:rPr>
-          <w:rFonts w:ascii="Arial" w:hAnsi="Arial" w:cs="Arial"/>
-          <w:rtl/>
-        </w:rPr>
-        <w:t>Vri21 הראה ש־compromised DNA פוגע קשות ביכולת לסווג קרבה ב־IGG, ושככל שהאיכות והכמות יורדות, הצלחת ה־kinship classification מתמוטטת במהירות [9]. לכן אבטחת איכות ב־FIGG מתחילה למעשה עוד לפני הפקת הפרופיל: בהחלטה אם הדגימה בכלל מתאימה למסלול הנבחר.</w:t>
-      </w:r>
-    </w:p>
-    <w:p>
-      <w:pPr>
-        <w:bidi/>
-        <w:jc w:val="right"/>
-      </w:pPr>
-      <w:r>
-        <w:rPr>
-          <w:rFonts w:ascii="Arial" w:hAnsi="Arial" w:cs="Arial"/>
-          <w:rtl/>
-        </w:rPr>
-        <w:t>Mat25 מסכם היטב את ההיגיון התפעולי הזה ומציע hybrid workflow: CE-STRs למקרים שגרתיים, NGS לדגימות קשות ולתיקים מורכבים, ו־SNP microarrays או workflows מקבילים עבור long-range kinship ו־FIGG [3]. זוהי גישה חשובה, משום שהיא מחליפה את השאלה “איזו טכנולוגיה טובה יותר” בשאלה “איזו טכנולוגיה מבוקרת ומתאימה יותר לכל סוג מקרה”.</w:t>
+        <w:t>אחד הלקחים החוזרים ביותר בספרות הוא שאיכות דגימה היא צוואר הבקבוק הראשי. Microarray עשוי להצליח היטב בדגימות טובות יחסית, אך הוא רגיש יותר ל־compromised DNA [1], [9]. דגימות מפורקות במיוחד, low template או skeletal remains דוחפות לעיתים קרובות לכיוון WGS או targeted capture/panel workflows [1], [3], [11].</w:t>
+      </w:r>
+    </w:p>
+    <w:p>
+      <w:pPr>
+        <w:bidi/>
+        <w:jc w:val="right"/>
+      </w:pPr>
+      <w:r>
+        <w:rPr>
+          <w:rFonts w:ascii="Arial" w:hAnsi="Arial" w:cs="Arial"/>
+          <w:rtl/>
+        </w:rPr>
+        <w:t>דה פריס [9] הראה ש־compromised DNA פוגע קשות ביכולת לסווג קרבה ב־IGG, ושככל שהאיכות והכמות יורדות, הצלחת ה־kinship classification מתמוטטת במהירות [9]. לכן אבטחת איכות ב־FIGG מתחילה למעשה עוד לפני הפקת הפרופיל: בהחלטה אם הדגימה בכלל מתאימה למסלול הנבחר.</w:t>
+      </w:r>
+    </w:p>
+    <w:p>
+      <w:pPr>
+        <w:bidi/>
+        <w:jc w:val="right"/>
+      </w:pPr>
+      <w:r>
+        <w:rPr>
+          <w:rFonts w:ascii="Arial" w:hAnsi="Arial" w:cs="Arial"/>
+          <w:rtl/>
+        </w:rPr>
+        <w:t>מטוטה [3] מסכם היטב את ההיגיון התפעולי הזה ומציע hybrid workflow: CE-STRs למקרים שגרתיים, NGS לדגימות קשות ולתיקים מורכבים, ו־SNP microarrays או workflows מקבילים עבור long-range kinship ו־FIGG [3]. זוהי גישה חשובה, משום שהיא מחליפה את השאלה “איזו טכנולוגיה טובה יותר” בשאלה “איזו טכנולוגיה מבוקרת ומתאימה יותר לכל סוג מקרה”.</w:t>
       </w:r>
     </w:p>
     <w:p>
@@ -23782,7 +23336,7 @@
           <w:rFonts w:ascii="Arial" w:hAnsi="Arial" w:cs="Arial"/>
           <w:rtl/>
         </w:rPr>
-        <w:t>ב־FIGG לא די בכך שהפרופיל מדויק מבחינה אנליטית. הוא צריך גם להתאים לדרישות החיפוש במסד. Kli21 מזכיר ש־GEDmatch אינו מקבל בדרך כלל פרופילים עם פחות מ־50,000 SNPs, וש־matching algorithms רגישים לטעויות קריאה ולחוסר צפיפות [1].</w:t>
+        <w:t>ב־FIGG לא די בכך שהפרופיל מדויק מבחינה אנליטית. הוא צריך גם להתאים לדרישות החיפוש במסד. קלינג [1] מזכיר ש־GEDmatch אינו מקבל בדרך כלל פרופילים עם פחות מ־50,000 SNPs, וש־matching algorithms רגישים לטעויות קריאה ולחוסר צפיפות [1].</w:t>
       </w:r>
     </w:p>
     <w:p>
@@ -23892,7 +23446,7 @@
           <w:rFonts w:ascii="Arial" w:hAnsi="Arial" w:cs="Arial"/>
           <w:rtl/>
         </w:rPr>
-        <w:t>But22 ו־Mat25 מדגישים כי הכנסת טכנולוגיות חדשות לעבודה שגרתית דורשת יותר מאשר מכשור תקין. היא דורשת SOPs ברורים, תיעוד החלטות, process maps, ושילוב בתוך מסגרת של תקינה רחבה יותר [2], [3].</w:t>
+        <w:t>But22 ו־מטוטה [3] מדגישים כי הכנסת טכנולוגיות חדשות לעבודה שגרתית דורשת יותר מאשר מכשור תקין. היא דורשת SOPs ברורים, תיעוד החלטות, process maps, ושילוב בתוך מסגרת של תקינה רחבה יותר [2], [3].</w:t>
       </w:r>
     </w:p>
     <w:p>
@@ -24044,7 +23598,7 @@
           <w:rFonts w:ascii="Arial" w:hAnsi="Arial" w:cs="Arial"/>
           <w:rtl/>
         </w:rPr>
-        <w:t>אחד החסמים הפחות גלויים לעין אך החשובים ביותר הוא הביואינפורמטיקה. Mat25 מדגיש כי מעבר ל־NGS ול־microarrays יוצר עומס חדש של ניתוח נתונים, storage, software validation ותלות בכוח אדם מיומן [3].</w:t>
+        <w:t>אחד החסמים הפחות גלויים לעין אך החשובים ביותר הוא הביואינפורמטיקה. מטוטה [3] מדגיש כי מעבר ל־NGS ול־microarrays יוצר עומס חדש של ניתוח נתונים, storage, software validation ותלות בכוח אדם מיומן [3].</w:t>
       </w:r>
     </w:p>
     <w:p>
@@ -24114,7 +23668,7 @@
           <w:rFonts w:ascii="Arial" w:hAnsi="Arial" w:cs="Arial"/>
           <w:rtl/>
         </w:rPr>
-        <w:t>But22 מוסיף שגם human factors חייבים להיות חלק מן־QA המודרני. שגיאות אינן נובעות רק ממכשירים אלא גם מעומס קוגניטיבי, מפרשנות יתר ומאופן עיצוב התהליך [2]. ב־FIGG הדבר חשוב במיוחד משום שהשרשרת כוללת הרבה נקודות שבהן judgment אנושי משחק תפקיד.</w:t>
+        <w:t>But22 מוסיף שגם human factors חייבים להיות חלק מן־QA המודרני. שגיאות אינן נובעות רק ממכשירים אלא גם מעומס קוגניטיבי, מפרשנות יתר ומאופן עיצוב התהליך [2]. ב־FIGG הדבר חשוב במיוחד משום שהשרשרת כוללת הרבה נקודות שבהן שיפוט אנושי משחק תפקיד.</w:t>
       </w:r>
     </w:p>
     <w:p>
@@ -24142,7 +23696,7 @@
           <w:rFonts w:ascii="Arial" w:hAnsi="Arial" w:cs="Arial"/>
           <w:rtl/>
         </w:rPr>
-        <w:t>אבטחת איכות ב־FIGG אינה שלמה בלי כלל יסוד: genealogy אינו הוכחה סופית. Gre19 מדגיש כי גם כאשר הכיוון הגנאלוגי נראה משכנע, יש לאמת אותו באמצעות direct STR comparison בין דגימת החשוד לבין הפרופיל הפורנזי [4]. Kli21 מזכיר כי עיקרון זה מעוגן גם בהנחיות מדיניות שונות כמעין “CODIS first and last” [1].</w:t>
+        <w:t>אבטחת איכות ב־FIGG אינה שלמה בלי כלל יסוד: genealogy אינו הוכחה סופית. גרייטק [4] מדגיש כי גם כאשר הכיוון הגנאלוגי נראה משכנע, יש לאמת אותו באמצעות direct STR comparison בין דגימת החשוד לבין הפרופיל הפורנזי [4]. קלינג [1] מזכיר כי עיקרון זה מעוגן גם בהנחיות מדיניות שונות כמעין “CODIS first and last” [1].</w:t>
       </w:r>
     </w:p>
     <w:p>
@@ -24181,7 +23735,7 @@
           <w:rFonts w:ascii="Arial" w:hAnsi="Arial" w:cs="Arial"/>
           <w:rtl/>
         </w:rPr>
-        <w:t>בהקשר זה Til21b מציע תרומה מעניינת. FORCE panel פותח כדי לגשר בין lead גנאלוגי לבין שלב confirmation במקרים שבהם STRs לבדם אינם מספקים, למשל בשרידים degraded או בהסקת קרבה מרוחקת יותר. יתרונו הוא בכך שהוא מספק פאנל SNP ייעודי, בעל concordance גבוהה מאוד, שאינו כולל סמנים רפואיים רגישים ושיכול לחזק שלב אימות מבוקר [11].</w:t>
+        <w:t>בהקשר זה Til21b מציע תרומה מעניינת. FORCE panel פותח כדי לגשר בין lead גנאלוגי לבין שלב confirmation במקרים שבהם STRs לבדם אינם מספקים, למשל בשרידים מפורקות או בהסקת קרבה מרוחקת יותר. יתרונו הוא בכך שהוא מספק פאנל SNP ייעודי, בעל concordance גבוהה מאוד, שאינו כולל סמנים רפואיים רגישים ושיכול לחזק שלב אימות מבוקר [11].</w:t>
       </w:r>
     </w:p>
     <w:p>
@@ -24209,20 +23763,20 @@
           <w:rFonts w:ascii="Arial" w:hAnsi="Arial" w:cs="Arial"/>
           <w:rtl/>
         </w:rPr>
-        <w:t>במעבר מ־innovation ל־routine practice, שאלת התקינה המוסדית נעשית מרכזית. Mat25 מצביע על ISO/IEC 17025 ועל קודים לאומיים כבסיס להסמכת מעבדות שמטמיעות NGS ו־SNP workflows [3]. But22 מציג את העדכונים של FBI QAS ואת עבודת OSAC ו־ASB כעדות לכך שגם סביבת התקנים הרחבה יותר נעה לכיוון תהליכים מפורטים יותר של validation, interpretation, training ו־quality management [2].</w:t>
-      </w:r>
-    </w:p>
-    <w:p>
-      <w:pPr>
-        <w:bidi/>
-        <w:jc w:val="right"/>
-      </w:pPr>
-      <w:r>
-        <w:rPr>
-          <w:rFonts w:ascii="Arial" w:hAnsi="Arial" w:cs="Arial"/>
-          <w:rtl/>
-        </w:rPr>
-        <w:t>עם זאת, הספרות גם מבהירה שהתחום עדיין בתנועה. Mat25 מציין שב־2024 פורסמו הנחיות SWGDAM לפרשנות SNPs, אך הן עדיין אינן מכסות במלואן microarrays ו־FIGG [3]. כלומר, קיימת כבר מסגרת איכות מתפתחת, אך לא קנון סגור ואחיד לכל מרכיבי FIGG.</w:t>
+        <w:t>במעבר מ־innovation ל־routine practice, שאלת התקינה המוסדית נעשית מרכזית. מטוטה [3] מצביע על ISO/IEC 17025 ועל קודים לאומיים כבסיס להסמכת מעבדות שמטמיעות NGS ו־SNP workflows [3]. But22 מציג את העדכונים של FBI QAS ואת עבודת OSAC ו־ASB כעדות לכך שגם סביבת התקנים הרחבה יותר נעה לכיוון תהליכים מפורטים יותר של validation, interpretation, training ו־quality management [2].</w:t>
+      </w:r>
+    </w:p>
+    <w:p>
+      <w:pPr>
+        <w:bidi/>
+        <w:jc w:val="right"/>
+      </w:pPr>
+      <w:r>
+        <w:rPr>
+          <w:rFonts w:ascii="Arial" w:hAnsi="Arial" w:cs="Arial"/>
+          <w:rtl/>
+        </w:rPr>
+        <w:t>עם זאת, הספרות גם מבהירה שהתחום עדיין בתנועה. מטוטה [3] מציין שב־2024 פורסמו הנחיות SWGDAM לפרשנות SNPs, אך הן עדיין אינן מכסות במלואן microarrays ו־FIGG [3]. כלומר, קיימת כבר מסגרת איכות מתפתחת, אך לא קנון סגור ואחיד לכל מרכיבי FIGG.</w:t>
       </w:r>
     </w:p>
     <w:p>
@@ -25238,7 +24792,7 @@
           <w:rFonts w:ascii="Arial" w:hAnsi="Arial" w:cs="Arial"/>
           <w:rtl/>
         </w:rPr>
-        <w:t>מחקר validation פנימי חשוב על Kintelligence, עם דגש על call rate, heterozygosity ועבודה עם דגימות low-input ו־degraded.</w:t>
+        <w:t>מחקר validation פנימי חשוב על Kintelligence, עם דגש על call rate, heterozygosity ועבודה עם דגימות low-input ו־מפורקות.</w:t>
       </w:r>
     </w:p>
     <w:p>
@@ -25709,7 +25263,7 @@
           <w:rFonts w:ascii="Arial" w:hAnsi="Arial" w:cs="Arial"/>
           <w:rtl/>
         </w:rPr>
-        <w:t>פרק 15 מגבלות כשלים ומבט מסכם</w:t>
+        <w:t>פרק 15 : מגבלות כשלים ומבט מסכם</w:t>
       </w:r>
       <w:bookmarkEnd w:id="chapter_15"/>
     </w:p>
@@ -25781,7 +25335,7 @@
           <w:rFonts w:ascii="Arial" w:hAnsi="Arial" w:cs="Arial"/>
           <w:rtl/>
         </w:rPr>
-        <w:t>להכיר את גבולות השיטה במצבים של דגימות מעורבות, DNA degraded, אוכלוסיות מורכבות וקרבה רחוקה מאוד [1], [8].</w:t>
+        <w:t>להכיר את גבולות השיטה במצבים של דגימות מעורבות, DNA מפורקות, אוכלוסיות מורכבות וקרבה רחוקה מאוד [1], [8].</w:t>
       </w:r>
     </w:p>
     <w:p>
@@ -25864,7 +25418,7 @@
           <w:rFonts w:ascii="Arial" w:hAnsi="Arial" w:cs="Arial"/>
           <w:rtl/>
         </w:rPr>
-        <w:t>צוואר הבקבוק הראשון של FIGG הוא לעיתים פשוט איכות הדנ״א. דגימות degraded, low-template או contaminated עלולות שלא להניב כלל פרופיל usable, או להניב פרופיל חלקי ומטעה [3], [9].</w:t>
+        <w:t>צוואר הבקבוק הראשון של FIGG הוא לעיתים פשוט איכות הדנ״א. דגימות מפורקות, low-template או contaminated עלולות שלא להניב כלל פרופיל usable, או להניב פרופיל חלקי ומטעה [3], [9].</w:t>
       </w:r>
     </w:p>
     <w:p>
@@ -25972,7 +25526,7 @@
           <w:rFonts w:ascii="Arial" w:hAnsi="Arial" w:cs="Arial"/>
           <w:rtl/>
         </w:rPr>
-        <w:t>Yag22 ו־Yag23 מצביעים על כשל מעניין ומטריד במיוחד: בדגימות degraded שנבדקו על microarray, ירידה בעוצמת הסיגנל על השבב, בשילוב אלגוריתם normalization רגיל, גרמה לכך שרעש ייקרא כאילו הוא SNP heterozygous אמיתי [5].</w:t>
+        <w:t>יאגאסאקי [4] ו־יאגאסאקי [5] מצביעים על כשל מעניין ומטריד במיוחד: בדגימות מפורקות שנבדקו על microarray, ירידה בעוצמת הסיגנל על השבב, בשילוב אלגוריתם normalization רגיל, גרמה לכך שרעש ייקרא כאילו הוא SNP heterozygous אמיתי [5].</w:t>
       </w:r>
     </w:p>
     <w:p>
@@ -26067,7 +25621,7 @@
           <w:rFonts w:ascii="Arial" w:hAnsi="Arial" w:cs="Arial"/>
           <w:rtl/>
         </w:rPr>
-        <w:t>גם כאשר הפרופיל איכותי, FIGG אינו פועל באותה רמת אמינות בכל דרגות הקרבה. כבר בפרקי IBD ו־relatedness inference ראינו שהמעבר מקרבה קרובה לקרבה רחוקה מגדיל את השונות, את החפיפה בין קטגוריות, ואת הסיכוי שלא יהיה שיתוף detectable כלל [12], [13].</w:t>
+        <w:t>גם כאשר הפרופיל איכותי, FIGG אינו פועל באותה רמת אמינות בכל דרגות הקרבה. כבר בפרקי IBD ו־relatedness inference ראינו שהמעבר מקרבה קרובה לקרבה רחוקה מגדיל את השונות, את החפיפה בין קטגוריות, ואת הסיכוי שלא יהיה שיתוף מזוהה כלל [12], [13].</w:t>
       </w:r>
     </w:p>
     <w:p>
@@ -26149,7 +25703,7 @@
           <w:rFonts w:ascii="Arial" w:hAnsi="Arial" w:cs="Arial"/>
           <w:rtl/>
         </w:rPr>
-        <w:t>Gre19 מדגישים שה־database query results הם רק clues, ושבמקרים רבים הזיהוי נעצר לא בגלל כשל גנטי אלא בגלל genealogy בלתי־מספיק [2].</w:t>
+        <w:t>גרייטק [2] מדגישים שה־database query results הם רק clues, ושבמקרים רבים הזיהוי נעצר לא בגלל כשל גנטי אלא בגלל genealogy בלתי־מספיק [2].</w:t>
       </w:r>
     </w:p>
     <w:p>
@@ -26535,7 +26089,7 @@
           <w:rFonts w:ascii="Arial" w:hAnsi="Arial" w:cs="Arial"/>
           <w:rtl/>
         </w:rPr>
-        <w:t>שיפור עבודה עם דגימות degraded מאוד</w:t>
+        <w:t>שיפור עבודה עם דגימות מפורקות מאוד</w:t>
       </w:r>
     </w:p>
     <w:p>
@@ -27263,7 +26817,7 @@
           <w:rFonts w:ascii="Arial" w:hAnsi="Arial" w:cs="Arial"/>
           <w:rtl/>
         </w:rPr>
-        <w:t>מאמר המשך חשוב המראה כיצד normalization קלאסי ב־microarray עלול לגרום לקריאת רעש כגנוטיפ אמיתי ב־degraded DNA. מתאים להעמקה בשאלה כיצד אלגוריתם העיבוד עצמו יוצר מגבלות חדשות.</w:t>
+        <w:t>מאמר המשך חשוב המראה כיצד normalization קלאסי ב־microarray עלול לגרום לקריאת רעש כגנוטיפ אמיתי ב־מפורקות DNA. מתאים להעמקה בשאלה כיצד אלגוריתם העיבוד עצמו יוצר מגבלות חדשות.</w:t>
       </w:r>
     </w:p>
     <w:p>

</xml_diff>